<commit_message>
Added new Donate actions to turn Coins into Honor
with Court and Undermarket versions
</commit_message>
<xml_diff>
--- a/Rulebook.docx
+++ b/Rulebook.docx
@@ -58,15 +58,7 @@
     </w:p>
     <w:p>
       <w:r>
-        <w:t xml:space="preserve">“The Empire is vast, but its sands shift with every whisper, every coin, every blade drawn in the dark. You, noble </w:t>
-      </w:r>
-      <w:proofErr w:type="gramStart"/>
-      <w:r>
-        <w:t>satrap</w:t>
-      </w:r>
-      <w:proofErr w:type="gramEnd"/>
-      <w:r>
-        <w:t>, must guide your province through war, politics, and treachery. Earn Honor in the eyes of the King, and your name shall be etched into the annals of Persia. Fail… and the Greeks will write your epitaph.”</w:t>
+        <w:t>“The Empire is vast, but its sands shift with every whisper, every coin, every blade drawn in the dark. You, noble satrap, must guide your province through war, politics, and treachery. Earn Honor in the eyes of the King, and your name shall be etched into the annals of Persia. Fail… and the Greeks will write your epitaph.”</w:t>
       </w:r>
     </w:p>
     <w:p>
@@ -93,15 +85,7 @@
     </w:p>
     <w:p>
       <w:r>
-        <w:t xml:space="preserve">You are a satrap, a provincial governor entrusted with the prosperity, security, and loyalty of your corner of the Persian Empire. Your province contributes troops, wealth, and political influence </w:t>
-      </w:r>
-      <w:proofErr w:type="gramStart"/>
-      <w:r>
-        <w:t>to</w:t>
-      </w:r>
-      <w:proofErr w:type="gramEnd"/>
-      <w:r>
-        <w:t xml:space="preserve"> the imperial court. You will command Leaders, enact Laws, deploy armies, and—when necessary—engage in subtle acts of espionage and sabotage.</w:t>
+        <w:t>You are a satrap, a provincial governor entrusted with the prosperity, security, and loyalty of your corner of the Persian Empire. Your province contributes troops, wealth, and political influence to the imperial court. You will command Leaders, enact Laws, deploy armies, and—when necessary—engage in subtle acts of espionage and sabotage.</w:t>
       </w:r>
     </w:p>
     <w:p>
@@ -120,15 +104,7 @@
     </w:p>
     <w:p>
       <w:r>
-        <w:t xml:space="preserve">The Empire will stand or fall together, but only one </w:t>
-      </w:r>
-      <w:proofErr w:type="gramStart"/>
-      <w:r>
-        <w:t>satrap</w:t>
-      </w:r>
-      <w:proofErr w:type="gramEnd"/>
-      <w:r>
-        <w:t xml:space="preserve"> will be remembered as the Empire’s greatest servant.</w:t>
+        <w:t>The Empire will stand or fall together, but only one satrap will be remembered as the Empire’s greatest servant.</w:t>
       </w:r>
     </w:p>
     <w:p>
@@ -337,15 +313,7 @@
         <w:t>A Player Shield</w:t>
       </w:r>
       <w:r>
-        <w:t xml:space="preserve"> — To </w:t>
-      </w:r>
-      <w:proofErr w:type="gramStart"/>
-      <w:r>
-        <w:t>hide</w:t>
-      </w:r>
-      <w:proofErr w:type="gramEnd"/>
-      <w:r>
-        <w:t xml:space="preserve"> Coins, Commodities, and Spies</w:t>
+        <w:t xml:space="preserve"> — To hide Coins, Commodities, and Spies</w:t>
       </w:r>
     </w:p>
     <w:p>
@@ -578,15 +546,7 @@
         </w:numPr>
       </w:pPr>
       <w:r>
-        <w:t xml:space="preserve">Deploying </w:t>
-      </w:r>
-      <w:proofErr w:type="gramStart"/>
-      <w:r>
-        <w:t>the most</w:t>
-      </w:r>
-      <w:proofErr w:type="gramEnd"/>
-      <w:r>
-        <w:t xml:space="preserve"> Troops</w:t>
+        <w:t>Deploying the most Troops</w:t>
       </w:r>
     </w:p>
     <w:p>
@@ -654,23 +614,7 @@
           <w:b/>
           <w:bCs/>
         </w:rPr>
-        <w:t xml:space="preserve">the </w:t>
-      </w:r>
-      <w:proofErr w:type="gramStart"/>
-      <w:r>
-        <w:rPr>
-          <w:b/>
-          <w:bCs/>
-        </w:rPr>
-        <w:t>satrap</w:t>
-      </w:r>
-      <w:proofErr w:type="gramEnd"/>
-      <w:r>
-        <w:rPr>
-          <w:b/>
-          <w:bCs/>
-        </w:rPr>
-        <w:t xml:space="preserve"> with the most Honor becomes the Empire’s Most Loyal Servant.</w:t>
+        <w:t>the satrap with the most Honor becomes the Empire’s Most Loyal Servant.</w:t>
       </w:r>
     </w:p>
     <w:p>
@@ -716,13 +660,8 @@
       </w:r>
     </w:p>
     <w:p>
-      <w:proofErr w:type="gramStart"/>
-      <w:r>
-        <w:t>Satraps</w:t>
-      </w:r>
-      <w:proofErr w:type="gramEnd"/>
-      <w:r>
-        <w:t xml:space="preserve"> take turns placing Leaders and performing actions.</w:t>
+      <w:r>
+        <w:t>Satraps take turns placing Leaders and performing actions.</w:t>
       </w:r>
     </w:p>
     <w:p>
@@ -757,15 +696,7 @@
         <w:t>King’s Favor</w:t>
       </w:r>
       <w:r>
-        <w:t xml:space="preserve"> goes </w:t>
-      </w:r>
-      <w:proofErr w:type="gramStart"/>
-      <w:r>
-        <w:t>first</w:t>
-      </w:r>
-      <w:proofErr w:type="gramEnd"/>
-      <w:r>
-        <w:t xml:space="preserve"> each round.</w:t>
+        <w:t xml:space="preserve"> goes first each round.</w:t>
       </w:r>
     </w:p>
     <w:p>
@@ -1017,15 +948,7 @@
     </w:p>
     <w:p>
       <w:r>
-        <w:t xml:space="preserve">There are three categories of </w:t>
-      </w:r>
-      <w:proofErr w:type="gramStart"/>
-      <w:r>
-        <w:t>actions</w:t>
-      </w:r>
-      <w:proofErr w:type="gramEnd"/>
-      <w:r>
-        <w:t>.</w:t>
+        <w:t>There are three categories of actions.</w:t>
       </w:r>
     </w:p>
     <w:p>
@@ -1134,7 +1057,6 @@
           <w:numId w:val="7"/>
         </w:numPr>
       </w:pPr>
-      <w:proofErr w:type="gramStart"/>
       <w:r>
         <w:rPr>
           <w:b/>
@@ -1143,11 +1065,7 @@
         <w:t>Upgrade</w:t>
       </w:r>
       <w:r>
-        <w:t xml:space="preserve"> —</w:t>
-      </w:r>
-      <w:proofErr w:type="gramEnd"/>
-      <w:r>
-        <w:t xml:space="preserve"> Improve existing Investments.</w:t>
+        <w:t xml:space="preserve"> — Improve existing Investments.</w:t>
       </w:r>
     </w:p>
     <w:p>
@@ -1165,15 +1083,7 @@
         <w:t>Promote</w:t>
       </w:r>
       <w:r>
-        <w:t xml:space="preserve"> — Increase </w:t>
-      </w:r>
-      <w:proofErr w:type="gramStart"/>
-      <w:r>
-        <w:t>a Leader’s</w:t>
-      </w:r>
-      <w:proofErr w:type="gramEnd"/>
-      <w:r>
-        <w:t xml:space="preserve"> Level.</w:t>
+        <w:t xml:space="preserve"> — Increase a Leader’s Level.</w:t>
       </w:r>
     </w:p>
     <w:p>
@@ -1313,15 +1223,7 @@
     </w:p>
     <w:p>
       <w:r>
-        <w:t xml:space="preserve">These represent direct influence </w:t>
-      </w:r>
-      <w:proofErr w:type="gramStart"/>
-      <w:r>
-        <w:t>at</w:t>
-      </w:r>
-      <w:proofErr w:type="gramEnd"/>
-      <w:r>
-        <w:t xml:space="preserve"> the imperial court. Each Court space is exclusive.</w:t>
+        <w:t>These represent direct influence at the imperial court. Each Court space is exclusive.</w:t>
       </w:r>
     </w:p>
     <w:p>
@@ -1395,6 +1297,30 @@
       </w:r>
       <w:r>
         <w:t xml:space="preserve"> — Gain the King’s Favor and Coins.</w:t>
+      </w:r>
+    </w:p>
+    <w:p>
+      <w:pPr>
+        <w:numPr>
+          <w:ilvl w:val="0"/>
+          <w:numId w:val="8"/>
+        </w:numPr>
+      </w:pPr>
+      <w:r>
+        <w:rPr>
+          <w:b/>
+          <w:bCs/>
+        </w:rPr>
+        <w:t>Donate</w:t>
+      </w:r>
+      <w:r>
+        <w:t xml:space="preserve"> — Pay up to your Leader’s Level in Coins to the Royal Bank and immediately gain Honor equal to half the Coins paid (rounded</w:t>
+      </w:r>
+      <w:r>
+        <w:t xml:space="preserve"> up</w:t>
+      </w:r>
+      <w:r>
+        <w:t>).</w:t>
       </w:r>
     </w:p>
     <w:p>
@@ -1454,6 +1380,33 @@
           <w:b/>
           <w:bCs/>
         </w:rPr>
+        <w:t>Donate</w:t>
+      </w:r>
+      <w:r>
+        <w:t xml:space="preserve"> — Pay up to your Leader’s Level in Coins to the Royal Bank and immediately gain Honor equal to half the Coins paid (rounded</w:t>
+      </w:r>
+      <w:r>
+        <w:t xml:space="preserve"> up</w:t>
+      </w:r>
+      <w:r>
+        <w:t>).</w:t>
+      </w:r>
+      <w:r>
+        <w:t xml:space="preserve"> Immediately demote the Leader used.</w:t>
+      </w:r>
+    </w:p>
+    <w:p>
+      <w:pPr>
+        <w:numPr>
+          <w:ilvl w:val="0"/>
+          <w:numId w:val="9"/>
+        </w:numPr>
+      </w:pPr>
+      <w:r>
+        <w:rPr>
+          <w:b/>
+          <w:bCs/>
+        </w:rPr>
         <w:t>Buy / Sell / Monetize</w:t>
       </w:r>
       <w:r>
@@ -1593,26 +1546,14 @@
         </w:numPr>
       </w:pPr>
       <w:r>
-        <w:t xml:space="preserve">The top card is </w:t>
-      </w:r>
-      <w:proofErr w:type="gramStart"/>
-      <w:r>
-        <w:t xml:space="preserve">the </w:t>
-      </w:r>
-      <w:r>
-        <w:rPr>
-          <w:b/>
-          <w:bCs/>
-        </w:rPr>
-        <w:t>Deliberated</w:t>
-      </w:r>
-      <w:proofErr w:type="gramEnd"/>
-      <w:r>
-        <w:rPr>
-          <w:b/>
-          <w:bCs/>
-        </w:rPr>
-        <w:t xml:space="preserve"> Law</w:t>
+        <w:t xml:space="preserve">The top card is the </w:t>
+      </w:r>
+      <w:r>
+        <w:rPr>
+          <w:b/>
+          <w:bCs/>
+        </w:rPr>
+        <w:t>Deliberated Law</w:t>
       </w:r>
       <w:r>
         <w:t>.</w:t>
@@ -1699,6 +1640,7 @@
         </w:numPr>
       </w:pPr>
       <w:r>
+        <w:lastRenderedPageBreak/>
         <w:t xml:space="preserve">Sanctions </w:t>
       </w:r>
       <w:r>
@@ -1751,7 +1693,6 @@
         </w:numPr>
       </w:pPr>
       <w:r>
-        <w:lastRenderedPageBreak/>
         <w:t>Each sponsor collects Coins from players violating their Laws.</w:t>
       </w:r>
     </w:p>
@@ -1984,6 +1925,7 @@
         </w:numPr>
       </w:pPr>
       <w:r>
+        <w:lastRenderedPageBreak/>
         <w:t>Place the marked Scheme into your pouch.</w:t>
       </w:r>
     </w:p>
@@ -2020,7 +1962,6 @@
     </w:p>
     <w:p>
       <w:r>
-        <w:lastRenderedPageBreak/>
         <w:t>During the Imperial Reports Phase:</w:t>
       </w:r>
     </w:p>
@@ -2043,15 +1984,7 @@
         </w:numPr>
       </w:pPr>
       <w:r>
-        <w:t xml:space="preserve">Pouches are opened </w:t>
-      </w:r>
-      <w:proofErr w:type="gramStart"/>
-      <w:r>
-        <w:t>one</w:t>
-      </w:r>
-      <w:proofErr w:type="gramEnd"/>
-      <w:r>
-        <w:t xml:space="preserve"> at a time.</w:t>
+        <w:t>Pouches are opened one at a time.</w:t>
       </w:r>
     </w:p>
     <w:p>
@@ -2281,6 +2214,7 @@
         </w:numPr>
       </w:pPr>
       <w:r>
+        <w:lastRenderedPageBreak/>
         <w:t xml:space="preserve">Each player who deployed Troops gains </w:t>
       </w:r>
       <w:r>
@@ -2339,7 +2273,6 @@
         </w:numPr>
       </w:pPr>
       <w:r>
-        <w:lastRenderedPageBreak/>
         <w:t>All Persian Troops are removed.</w:t>
       </w:r>
     </w:p>
@@ -2404,15 +2337,7 @@
         </w:numPr>
       </w:pPr>
       <w:r>
-        <w:t xml:space="preserve">If not, they roll a die and downgrade an </w:t>
-      </w:r>
-      <w:proofErr w:type="gramStart"/>
-      <w:r>
-        <w:t>Investment</w:t>
-      </w:r>
-      <w:proofErr w:type="gramEnd"/>
-      <w:r>
-        <w:t xml:space="preserve"> at that level.</w:t>
+        <w:t>If not, they roll a die and downgrade an Investment at that level.</w:t>
       </w:r>
     </w:p>
     <w:p>
@@ -2423,15 +2348,7 @@
         </w:numPr>
       </w:pPr>
       <w:r>
-        <w:t xml:space="preserve">If none exists, </w:t>
-      </w:r>
-      <w:proofErr w:type="gramStart"/>
-      <w:r>
-        <w:t>downgrade</w:t>
-      </w:r>
-      <w:proofErr w:type="gramEnd"/>
-      <w:r>
-        <w:t xml:space="preserve"> the next highest.</w:t>
+        <w:t>If none exists, downgrade the next highest.</w:t>
       </w:r>
     </w:p>
     <w:p>
@@ -2579,6 +2496,7 @@
         </w:numPr>
       </w:pPr>
       <w:r>
+        <w:lastRenderedPageBreak/>
         <w:t xml:space="preserve">Both players must exchange </w:t>
       </w:r>
       <w:r>
@@ -2653,7 +2571,6 @@
           <w:b/>
           <w:bCs/>
         </w:rPr>
-        <w:lastRenderedPageBreak/>
         <w:t>12. Imperial Reports Phase</w:t>
       </w:r>
     </w:p>
@@ -2669,31 +2586,7 @@
           <w:b/>
           <w:bCs/>
         </w:rPr>
-        <w:t xml:space="preserve">When the sun sets upon the empire, the Great King’s scribes gather the day’s accounts from every province. These Imperial Reports determine which </w:t>
-      </w:r>
-      <w:proofErr w:type="gramStart"/>
-      <w:r>
-        <w:rPr>
-          <w:b/>
-          <w:bCs/>
-        </w:rPr>
-        <w:t>satraps</w:t>
-      </w:r>
-      <w:proofErr w:type="gramEnd"/>
-      <w:r>
-        <w:rPr>
-          <w:b/>
-          <w:bCs/>
-        </w:rPr>
-        <w:t xml:space="preserve"> upheld the King’s order, which faltered, and how the empire must prepare for the next day’s maneuvers. Resolve the following matters in the exact order presented, for the empire tolerates no disorder in </w:t>
-      </w:r>
-      <w:proofErr w:type="gramStart"/>
-      <w:r>
-        <w:rPr>
-          <w:b/>
-          <w:bCs/>
-        </w:rPr>
-        <w:t>its record</w:t>
+        <w:t>When the sun sets upon the empire, the Great King’s scribes gather the day’s accounts from every province. These Imperial Reports determine which satraps upheld the King’s order, which faltered, and how the empire must prepare for the next day’s maneuvers. Resolve the following matters in the exact order presented, for the empire tolerates no disorder in its record</w:t>
       </w:r>
       <w:r>
         <w:rPr>
@@ -2701,15 +2594,7 @@
           <w:bCs/>
         </w:rPr>
         <w:noBreakHyphen/>
-        <w:t>keeping</w:t>
-      </w:r>
-      <w:proofErr w:type="gramEnd"/>
-      <w:r>
-        <w:rPr>
-          <w:b/>
-          <w:bCs/>
-        </w:rPr>
-        <w:t>.</w:t>
+        <w:t>keeping.</w:t>
       </w:r>
     </w:p>
     <w:p>
@@ -2848,23 +2733,7 @@
           <w:b/>
           <w:bCs/>
         </w:rPr>
-        <w:t xml:space="preserve">If any </w:t>
-      </w:r>
-      <w:proofErr w:type="gramStart"/>
-      <w:r>
-        <w:rPr>
-          <w:b/>
-          <w:bCs/>
-        </w:rPr>
-        <w:t>satrap</w:t>
-      </w:r>
-      <w:proofErr w:type="gramEnd"/>
-      <w:r>
-        <w:rPr>
-          <w:b/>
-          <w:bCs/>
-        </w:rPr>
-        <w:t xml:space="preserve"> committed troops to the frontier, the empire now learns the outcome of their valor.</w:t>
+        <w:t>If any satrap committed troops to the frontier, the empire now learns the outcome of their valor.</w:t>
       </w:r>
     </w:p>
     <w:p>
@@ -2936,6 +2805,7 @@
           <w:b/>
           <w:bCs/>
         </w:rPr>
+        <w:lastRenderedPageBreak/>
         <w:t>Should the Greek reserves be emptied by these events, the scribes will note that the war has reached its end.</w:t>
       </w:r>
     </w:p>
@@ -2985,24 +2855,7 @@
           <w:b/>
           <w:bCs/>
         </w:rPr>
-        <w:lastRenderedPageBreak/>
-        <w:t xml:space="preserve">Each </w:t>
-      </w:r>
-      <w:proofErr w:type="gramStart"/>
-      <w:r>
-        <w:rPr>
-          <w:b/>
-          <w:bCs/>
-        </w:rPr>
-        <w:t>satrap</w:t>
-      </w:r>
-      <w:proofErr w:type="gramEnd"/>
-      <w:r>
-        <w:rPr>
-          <w:b/>
-          <w:bCs/>
-        </w:rPr>
-        <w:t xml:space="preserve"> retrieves all Leaders from the board, restoring them to their provincial retinues.</w:t>
+        <w:t>Each satrap retrieves all Leaders from the board, restoring them to their provincial retinues.</w:t>
       </w:r>
     </w:p>
     <w:p>
@@ -3174,23 +3027,7 @@
           <w:b/>
           <w:bCs/>
         </w:rPr>
-        <w:t xml:space="preserve">The current Deliberated Law is ratified, unless it </w:t>
-      </w:r>
-      <w:proofErr w:type="gramStart"/>
-      <w:r>
-        <w:rPr>
-          <w:b/>
-          <w:bCs/>
-        </w:rPr>
-        <w:t>was</w:t>
-      </w:r>
-      <w:proofErr w:type="gramEnd"/>
-      <w:r>
-        <w:rPr>
-          <w:b/>
-          <w:bCs/>
-        </w:rPr>
-        <w:t xml:space="preserve"> postponed earlier in the round.</w:t>
+        <w:t>The current Deliberated Law is ratified, unless it was postponed earlier in the round.</w:t>
       </w:r>
     </w:p>
     <w:p>
@@ -3209,39 +3046,7 @@
           <w:b/>
           <w:bCs/>
         </w:rPr>
-        <w:t xml:space="preserve">If the Law alters an existing decree, the change is applied </w:t>
-      </w:r>
-      <w:proofErr w:type="gramStart"/>
-      <w:r>
-        <w:rPr>
-          <w:b/>
-          <w:bCs/>
-        </w:rPr>
-        <w:t>immediately</w:t>
-      </w:r>
-      <w:proofErr w:type="gramEnd"/>
-      <w:r>
-        <w:rPr>
-          <w:b/>
-          <w:bCs/>
-        </w:rPr>
-        <w:t xml:space="preserve"> and sponsorship passes to the </w:t>
-      </w:r>
-      <w:proofErr w:type="gramStart"/>
-      <w:r>
-        <w:rPr>
-          <w:b/>
-          <w:bCs/>
-        </w:rPr>
-        <w:t>satrap</w:t>
-      </w:r>
-      <w:proofErr w:type="gramEnd"/>
-      <w:r>
-        <w:rPr>
-          <w:b/>
-          <w:bCs/>
-        </w:rPr>
-        <w:t xml:space="preserve"> who advanced the modification.</w:t>
+        <w:t>If the Law alters an existing decree, the change is applied immediately and sponsorship passes to the satrap who advanced the modification.</w:t>
       </w:r>
     </w:p>
     <w:p>
@@ -3279,23 +3084,7 @@
           <w:b/>
           <w:bCs/>
         </w:rPr>
-        <w:t xml:space="preserve">If the queue stands empty, a new Law is drawn from the </w:t>
-      </w:r>
-      <w:proofErr w:type="gramStart"/>
-      <w:r>
-        <w:rPr>
-          <w:b/>
-          <w:bCs/>
-        </w:rPr>
-        <w:t>deck</w:t>
-      </w:r>
-      <w:proofErr w:type="gramEnd"/>
-      <w:r>
-        <w:rPr>
-          <w:b/>
-          <w:bCs/>
-        </w:rPr>
-        <w:t xml:space="preserve"> and its Threshold is set by the will of fate.</w:t>
+        <w:t>If the queue stands empty, a new Law is drawn from the deck and its Threshold is set by the will of fate.</w:t>
       </w:r>
     </w:p>
     <w:p>
@@ -3327,6 +3116,7 @@
           <w:b/>
           <w:bCs/>
         </w:rPr>
+        <w:lastRenderedPageBreak/>
         <w:t>12.6 Check for Game End</w:t>
       </w:r>
     </w:p>
@@ -3376,7 +3166,6 @@
           <w:b/>
           <w:bCs/>
         </w:rPr>
-        <w:lastRenderedPageBreak/>
         <w:t>12.7 Imperial Economic Adjustments</w:t>
       </w:r>
     </w:p>
@@ -3411,23 +3200,7 @@
           <w:b/>
           <w:bCs/>
         </w:rPr>
-        <w:t xml:space="preserve">The Royal Bank receives 1 Coin per </w:t>
-      </w:r>
-      <w:proofErr w:type="gramStart"/>
-      <w:r>
-        <w:rPr>
-          <w:b/>
-          <w:bCs/>
-        </w:rPr>
-        <w:t>satrap</w:t>
-      </w:r>
-      <w:proofErr w:type="gramEnd"/>
-      <w:r>
-        <w:rPr>
-          <w:b/>
-          <w:bCs/>
-        </w:rPr>
-        <w:t>, representing the King’s distant holdings and the steady flow of imperial tribute.</w:t>
+        <w:t>The Royal Bank receives 1 Coin per satrap, representing the King’s distant holdings and the steady flow of imperial tribute.</w:t>
       </w:r>
     </w:p>
     <w:p>
@@ -3514,23 +3287,7 @@
           <w:b/>
           <w:bCs/>
         </w:rPr>
-        <w:t xml:space="preserve">That </w:t>
-      </w:r>
-      <w:proofErr w:type="gramStart"/>
-      <w:r>
-        <w:rPr>
-          <w:b/>
-          <w:bCs/>
-        </w:rPr>
-        <w:t>satrap</w:t>
-      </w:r>
-      <w:proofErr w:type="gramEnd"/>
-      <w:r>
-        <w:rPr>
-          <w:b/>
-          <w:bCs/>
-        </w:rPr>
-        <w:t xml:space="preserve"> receives the King’s Favor, symbol of royal trust and arbiter of all ties.</w:t>
+        <w:t>That satrap receives the King’s Favor, symbol of royal trust and arbiter of all ties.</w:t>
       </w:r>
     </w:p>
     <w:p>
@@ -3617,23 +3374,7 @@
           <w:b/>
           <w:bCs/>
         </w:rPr>
-        <w:t xml:space="preserve">The </w:t>
-      </w:r>
-      <w:proofErr w:type="gramStart"/>
-      <w:r>
-        <w:rPr>
-          <w:b/>
-          <w:bCs/>
-        </w:rPr>
-        <w:t>satrap</w:t>
-      </w:r>
-      <w:proofErr w:type="gramEnd"/>
-      <w:r>
-        <w:rPr>
-          <w:b/>
-          <w:bCs/>
-        </w:rPr>
-        <w:t xml:space="preserve"> holding the King’s Favor begins the next round, as is proper for one in the King’s good graces.</w:t>
+        <w:t>The satrap holding the King’s Favor begins the next round, as is proper for one in the King’s good graces.</w:t>
       </w:r>
     </w:p>
     <w:p>
@@ -3665,6 +3406,7 @@
     </w:p>
     <w:p>
       <w:r>
+        <w:lastRenderedPageBreak/>
         <w:t>Players score:</w:t>
       </w:r>
     </w:p>
@@ -3709,7 +3451,6 @@
         </w:numPr>
       </w:pPr>
       <w:r>
-        <w:lastRenderedPageBreak/>
         <w:t>Honor from active sponsored Laws</w:t>
       </w:r>
     </w:p>
@@ -3858,15 +3599,7 @@
         </w:numPr>
       </w:pPr>
       <w:r>
-        <w:t xml:space="preserve">Schemes are resolved in </w:t>
-      </w:r>
-      <w:proofErr w:type="gramStart"/>
-      <w:r>
-        <w:t>the order</w:t>
-      </w:r>
-      <w:proofErr w:type="gramEnd"/>
-      <w:r>
-        <w:t xml:space="preserve"> drawn from mixed pouches.</w:t>
+        <w:t>Schemes are resolved in the order drawn from mixed pouches.</w:t>
       </w:r>
     </w:p>
     <w:p>
@@ -3877,15 +3610,7 @@
         </w:numPr>
       </w:pPr>
       <w:r>
-        <w:t xml:space="preserve">Destroying Investments: the target </w:t>
-      </w:r>
-      <w:proofErr w:type="gramStart"/>
-      <w:r>
-        <w:t>chooses</w:t>
-      </w:r>
-      <w:proofErr w:type="gramEnd"/>
-      <w:r>
-        <w:t xml:space="preserve"> among tied levels.</w:t>
+        <w:t>Destroying Investments: the target chooses among tied levels.</w:t>
       </w:r>
     </w:p>
     <w:p>
@@ -3970,15 +3695,8 @@
         </w:numPr>
       </w:pPr>
       <w:r>
-        <w:t xml:space="preserve">Upgrades may increase an </w:t>
-      </w:r>
-      <w:proofErr w:type="gramStart"/>
-      <w:r>
-        <w:t>Investment</w:t>
-      </w:r>
-      <w:proofErr w:type="gramEnd"/>
-      <w:r>
-        <w:t xml:space="preserve"> by up to the Leader’s Level.</w:t>
+        <w:lastRenderedPageBreak/>
+        <w:t>Upgrades may increase an Investment by up to the Leader’s Level.</w:t>
       </w:r>
     </w:p>
     <w:p>
@@ -4026,7 +3744,6 @@
         </w:numPr>
       </w:pPr>
       <w:r>
-        <w:lastRenderedPageBreak/>
         <w:t>Commissioning always rounds up when halving.</w:t>
       </w:r>
     </w:p>
@@ -10968,6 +10685,7 @@
   <w:style w:type="character" w:default="1" w:styleId="DefaultParagraphFont">
     <w:name w:val="Default Paragraph Font"/>
     <w:uiPriority w:val="1"/>
+    <w:semiHidden/>
     <w:unhideWhenUsed/>
   </w:style>
   <w:style w:type="table" w:default="1" w:styleId="TableNormal">
@@ -11281,6 +10999,16 @@
       <w:spacing w:val="5"/>
     </w:rPr>
   </w:style>
+  <w:style w:type="paragraph" w:styleId="Revision">
+    <w:name w:val="Revision"/>
+    <w:hidden/>
+    <w:uiPriority w:val="99"/>
+    <w:semiHidden/>
+    <w:rsid w:val="0037521D"/>
+    <w:pPr>
+      <w:spacing w:after="0" w:line="240" w:lineRule="auto"/>
+    </w:pPr>
+  </w:style>
 </w:styles>
 </file>
 
@@ -11577,4 +11305,16 @@
     </a:ext>
   </a:extLst>
 </a:theme>
+</file>
+
+<file path=customXml/item1.xml><?xml version="1.0" encoding="utf-8"?>
+<b:Sources xmlns:b="http://schemas.openxmlformats.org/officeDocument/2006/bibliography" xmlns="http://schemas.openxmlformats.org/officeDocument/2006/bibliography" SelectedStyle="\APASixthEditionOfficeOnline.xsl" StyleName="APA" Version="6"/>
+</file>
+
+<file path=customXml/itemProps1.xml><?xml version="1.0" encoding="utf-8"?>
+<ds:datastoreItem xmlns:ds="http://schemas.openxmlformats.org/officeDocument/2006/customXml" ds:itemID="{D10C5361-D331-4771-91EE-0ED8C8EB18D4}">
+  <ds:schemaRefs>
+    <ds:schemaRef ds:uri="http://schemas.openxmlformats.org/officeDocument/2006/bibliography"/>
+  </ds:schemaRefs>
+</ds:datastoreItem>
 </file>
</xml_diff>

<commit_message>
Renamed Player Shield to Player Screen
</commit_message>
<xml_diff>
--- a/Rulebook.docx
+++ b/Rulebook.docx
@@ -294,7 +294,13 @@
         <w:rPr>
           <w:rStyle w:val="SubtleReference"/>
         </w:rPr>
-        <w:t>Player Shield</w:t>
+        <w:t>Player S</w:t>
+      </w:r>
+      <w:r>
+        <w:rPr>
+          <w:rStyle w:val="SubtleReference"/>
+        </w:rPr>
+        <w:t>creen</w:t>
       </w:r>
       <w:r>
         <w:t xml:space="preserve"> – Hides Private items held by players</w:t>
@@ -366,23 +372,6 @@
       </w:r>
       <w:r>
         <w:t>Military units used to fight Greeks and protect players</w:t>
-      </w:r>
-    </w:p>
-    <w:p>
-      <w:pPr>
-        <w:numPr>
-          <w:ilvl w:val="0"/>
-          <w:numId w:val="15"/>
-        </w:numPr>
-      </w:pPr>
-      <w:r>
-        <w:rPr>
-          <w:rStyle w:val="SubtleReference"/>
-        </w:rPr>
-        <w:t>Player Shield</w:t>
-      </w:r>
-      <w:r>
-        <w:t xml:space="preserve"> – Hides Private items held by players</w:t>
       </w:r>
     </w:p>
     <w:p>
@@ -575,7 +564,13 @@
         <w:pStyle w:val="Quote"/>
       </w:pPr>
       <w:r>
-        <w:t>Persian Fact: Persian nobles often kept their true wealth hidden. Coins behind the shield are historically accurate.</w:t>
+        <w:t xml:space="preserve">Persian Fact: Persian nobles often kept their true wealth hidden. Coins behind the </w:t>
+      </w:r>
+      <w:r>
+        <w:t>screen</w:t>
+      </w:r>
+      <w:r>
+        <w:t xml:space="preserve"> are historically accurate.</w:t>
       </w:r>
     </w:p>
     <w:p>
@@ -675,21 +670,21 @@
         <w:rPr>
           <w:rStyle w:val="SubtleReference"/>
         </w:rPr>
+        <w:t>Honor Track</w:t>
+      </w:r>
+      <w:r>
+        <w:t xml:space="preserve"> – Records the accumulated Honor of each player during the game</w:t>
+      </w:r>
+    </w:p>
+    <w:p>
+      <w:pPr>
+        <w:pStyle w:val="ListParagraph"/>
+      </w:pPr>
+      <w:r>
+        <w:rPr>
+          <w:rStyle w:val="SubtleReference"/>
+        </w:rPr>
         <w:lastRenderedPageBreak/>
-        <w:t>Honor Track</w:t>
-      </w:r>
-      <w:r>
-        <w:t xml:space="preserve"> – Records the accumulated Honor of each player during the game</w:t>
-      </w:r>
-    </w:p>
-    <w:p>
-      <w:pPr>
-        <w:pStyle w:val="ListParagraph"/>
-      </w:pPr>
-      <w:r>
-        <w:rPr>
-          <w:rStyle w:val="SubtleReference"/>
-        </w:rPr>
         <w:t>Court</w:t>
       </w:r>
       <w:r>
@@ -1335,7 +1330,13 @@
         <w:pStyle w:val="ListParagraph"/>
       </w:pPr>
       <w:r>
-        <w:t>Each Player plays 1 Investment from their hand to the table in front of their shield.</w:t>
+        <w:t xml:space="preserve">Each Player plays 1 Investment from their hand to the table in front of their </w:t>
+      </w:r>
+      <w:r>
+        <w:t>screen</w:t>
+      </w:r>
+      <w:r>
+        <w:t>.</w:t>
       </w:r>
     </w:p>
     <w:p>
@@ -1384,7 +1385,13 @@
         <w:pStyle w:val="ListParagraph"/>
       </w:pPr>
       <w:r>
-        <w:t>Each Player places 4 Leaders in front of their shield and distributes 8 levels between their four Leaders. The sum of the Leader levels must be 8.</w:t>
+        <w:t xml:space="preserve">Each Player places 4 Leaders in front of their </w:t>
+      </w:r>
+      <w:r>
+        <w:t>screen</w:t>
+      </w:r>
+      <w:r>
+        <w:t xml:space="preserve"> and distributes 8 levels between their four Leaders. The sum of the Leader levels must be 8.</w:t>
       </w:r>
     </w:p>
     <w:p>
@@ -1863,7 +1870,13 @@
         <w:t>Inactive Leaders</w:t>
       </w:r>
       <w:r>
-        <w:t xml:space="preserve"> (behind your shield) </w:t>
+        <w:t xml:space="preserve"> (behind your </w:t>
+      </w:r>
+      <w:r>
+        <w:t>screen</w:t>
+      </w:r>
+      <w:r>
+        <w:t xml:space="preserve">) </w:t>
       </w:r>
       <w:r>
         <w:t xml:space="preserve">are not used until </w:t>

</xml_diff>

<commit_message>
Filled out formatted Setup of Rulebook
</commit_message>
<xml_diff>
--- a/Rulebook.docx
+++ b/Rulebook.docx
@@ -803,13 +803,503 @@
     </w:p>
     <w:p>
       <w:pPr>
+        <w:pStyle w:val="ListParagraph"/>
+        <w:numPr>
+          <w:ilvl w:val="0"/>
+          <w:numId w:val="59"/>
+        </w:numPr>
+      </w:pPr>
+      <w:r>
+        <w:t>Shuffle all decks</w:t>
+      </w:r>
+      <w:r>
+        <w:t>.</w:t>
+      </w:r>
+    </w:p>
+    <w:p>
+      <w:pPr>
+        <w:pStyle w:val="ListParagraph"/>
+        <w:numPr>
+          <w:ilvl w:val="0"/>
+          <w:numId w:val="59"/>
+        </w:numPr>
+      </w:pPr>
+      <w:r>
+        <w:t>Add 12 Greek Troops per player to the Greek Reserves</w:t>
+      </w:r>
+      <w:r>
+        <w:t>.</w:t>
+      </w:r>
+    </w:p>
+    <w:p>
+      <w:pPr>
+        <w:pStyle w:val="ListParagraph"/>
+        <w:numPr>
+          <w:ilvl w:val="0"/>
+          <w:numId w:val="59"/>
+        </w:numPr>
+      </w:pPr>
+      <w:r>
+        <w:t>Add 1 Coin per player to the Royal Bank</w:t>
+      </w:r>
+      <w:r>
+        <w:t>.</w:t>
+      </w:r>
+    </w:p>
+    <w:p>
+      <w:pPr>
+        <w:pStyle w:val="ListParagraph"/>
+        <w:numPr>
+          <w:ilvl w:val="0"/>
+          <w:numId w:val="59"/>
+        </w:numPr>
+      </w:pPr>
+      <w:r>
+        <w:t>Roll the Market Rate Die</w:t>
+      </w:r>
+      <w:r>
+        <w:t>.</w:t>
+      </w:r>
+    </w:p>
+    <w:p>
+      <w:pPr>
+        <w:pStyle w:val="ListParagraph"/>
+        <w:numPr>
+          <w:ilvl w:val="0"/>
+          <w:numId w:val="59"/>
+        </w:numPr>
+      </w:pPr>
+      <w:r>
+        <w:t>Draft Investments</w:t>
+      </w:r>
+      <w:r>
+        <w:t>.</w:t>
+      </w:r>
+    </w:p>
+    <w:p>
+      <w:pPr>
+        <w:pStyle w:val="ListParagraph"/>
+        <w:numPr>
+          <w:ilvl w:val="1"/>
+          <w:numId w:val="59"/>
+        </w:numPr>
+      </w:pPr>
+      <w:r>
+        <w:t xml:space="preserve">Deal 5 Investments </w:t>
+      </w:r>
+      <w:proofErr w:type="gramStart"/>
+      <w:r>
+        <w:t>to</w:t>
+      </w:r>
+      <w:proofErr w:type="gramEnd"/>
+      <w:r>
+        <w:t xml:space="preserve"> each Player</w:t>
+      </w:r>
+      <w:r>
+        <w:t>.</w:t>
+      </w:r>
+    </w:p>
+    <w:p>
+      <w:pPr>
+        <w:pStyle w:val="ListParagraph"/>
+        <w:numPr>
+          <w:ilvl w:val="1"/>
+          <w:numId w:val="59"/>
+        </w:numPr>
+      </w:pPr>
+      <w:r>
+        <w:t>Each Player plays 1 Investment from their hand to the table in front of their screen.</w:t>
+      </w:r>
+    </w:p>
+    <w:p>
+      <w:pPr>
+        <w:pStyle w:val="ListParagraph"/>
+        <w:numPr>
+          <w:ilvl w:val="1"/>
+          <w:numId w:val="59"/>
+        </w:numPr>
+      </w:pPr>
+      <w:r>
+        <w:t>Each Player passes the rest of their hand to the player on their left.</w:t>
+      </w:r>
+    </w:p>
+    <w:p>
+      <w:pPr>
+        <w:pStyle w:val="ListParagraph"/>
+        <w:numPr>
+          <w:ilvl w:val="1"/>
+          <w:numId w:val="59"/>
+        </w:numPr>
+      </w:pPr>
+      <w:r>
+        <w:t>Repeat Steps 2 and 3 until all Players have exactly 4 Investments. Discard any remaining Investments.</w:t>
+      </w:r>
+    </w:p>
+    <w:p>
+      <w:pPr>
+        <w:pStyle w:val="ListParagraph"/>
+        <w:numPr>
+          <w:ilvl w:val="1"/>
+          <w:numId w:val="59"/>
+        </w:numPr>
+      </w:pPr>
+      <w:r>
+        <w:t>Each Player takes one die per Investment and distributes 8 levels between their four Investments. The sum of the Investment levels must be 8.</w:t>
+      </w:r>
+    </w:p>
+    <w:p>
+      <w:pPr>
+        <w:pStyle w:val="ListParagraph"/>
+        <w:numPr>
+          <w:ilvl w:val="1"/>
+          <w:numId w:val="59"/>
+        </w:numPr>
+      </w:pPr>
+      <w:r>
+        <w:t>Take care to keep each Investment no higher than its level cap.</w:t>
+      </w:r>
+    </w:p>
+    <w:p>
+      <w:pPr>
+        <w:pStyle w:val="ListParagraph"/>
+        <w:numPr>
+          <w:ilvl w:val="0"/>
+          <w:numId w:val="59"/>
+        </w:numPr>
+      </w:pPr>
+      <w:r>
+        <w:t>Assign Leader Levels</w:t>
+      </w:r>
+      <w:r>
+        <w:t>.</w:t>
+      </w:r>
+    </w:p>
+    <w:p>
+      <w:pPr>
+        <w:pStyle w:val="ListParagraph"/>
+        <w:numPr>
+          <w:ilvl w:val="1"/>
+          <w:numId w:val="59"/>
+        </w:numPr>
+      </w:pPr>
+      <w:r>
+        <w:t>Each Player places 4 Leaders in front of their screen and distributes 8 levels between their four Leaders. The sum of the Leader levels must be 8.</w:t>
+      </w:r>
+    </w:p>
+    <w:p>
+      <w:pPr>
+        <w:pStyle w:val="ListParagraph"/>
+        <w:numPr>
+          <w:ilvl w:val="1"/>
+          <w:numId w:val="59"/>
+        </w:numPr>
+      </w:pPr>
+      <w:r>
+        <w:t xml:space="preserve">The Leader levels do not have to match your </w:t>
+      </w:r>
+      <w:proofErr w:type="gramStart"/>
+      <w:r>
+        <w:t>Investment</w:t>
+      </w:r>
+      <w:proofErr w:type="gramEnd"/>
+      <w:r>
+        <w:t xml:space="preserve"> levels.</w:t>
+      </w:r>
+    </w:p>
+    <w:p>
+      <w:pPr>
+        <w:pStyle w:val="ListParagraph"/>
+        <w:numPr>
+          <w:ilvl w:val="0"/>
+          <w:numId w:val="59"/>
+        </w:numPr>
+      </w:pPr>
+      <w:r>
+        <w:t>Submit Initial Laws</w:t>
+      </w:r>
+      <w:r>
+        <w:t>.</w:t>
+      </w:r>
+    </w:p>
+    <w:p>
+      <w:pPr>
+        <w:pStyle w:val="ListParagraph"/>
+        <w:numPr>
+          <w:ilvl w:val="1"/>
+          <w:numId w:val="59"/>
+        </w:numPr>
+      </w:pPr>
+      <w:r>
+        <w:t>Give each Player a card marker of their own color.</w:t>
+      </w:r>
+    </w:p>
+    <w:p>
+      <w:pPr>
+        <w:pStyle w:val="ListParagraph"/>
+        <w:numPr>
+          <w:ilvl w:val="1"/>
+          <w:numId w:val="59"/>
+        </w:numPr>
+      </w:pPr>
+      <w:r>
+        <w:lastRenderedPageBreak/>
+        <w:t>Deal 3 Laws to each Player. Make sure players do not look at the Laws they are dealt yet.</w:t>
+      </w:r>
+    </w:p>
+    <w:p>
+      <w:pPr>
+        <w:pStyle w:val="ListParagraph"/>
+        <w:numPr>
+          <w:ilvl w:val="1"/>
+          <w:numId w:val="59"/>
+        </w:numPr>
+      </w:pPr>
+      <w:r>
+        <w:t>At the same time, all Players look at their Laws and race to do the following:</w:t>
+      </w:r>
+    </w:p>
+    <w:p>
+      <w:pPr>
+        <w:pStyle w:val="ListParagraph"/>
+        <w:numPr>
+          <w:ilvl w:val="2"/>
+          <w:numId w:val="59"/>
+        </w:numPr>
+      </w:pPr>
+      <w:r>
+        <w:t>Choose one Law to submit to the Queue</w:t>
+      </w:r>
+      <w:r>
+        <w:t>.</w:t>
+      </w:r>
+    </w:p>
+    <w:p>
+      <w:pPr>
+        <w:pStyle w:val="ListParagraph"/>
+        <w:numPr>
+          <w:ilvl w:val="2"/>
+          <w:numId w:val="59"/>
+        </w:numPr>
+      </w:pPr>
+      <w:r>
+        <w:t>Place your Marker fully on the Law</w:t>
+      </w:r>
+      <w:r>
+        <w:t>.</w:t>
+      </w:r>
+    </w:p>
+    <w:p>
+      <w:pPr>
+        <w:pStyle w:val="ListParagraph"/>
+        <w:numPr>
+          <w:ilvl w:val="2"/>
+          <w:numId w:val="59"/>
+        </w:numPr>
+      </w:pPr>
+      <w:r>
+        <w:t>Place your marked Law faceup at the back of the Queue</w:t>
+      </w:r>
+      <w:r>
+        <w:t>.</w:t>
+      </w:r>
+    </w:p>
+    <w:p>
+      <w:pPr>
+        <w:pStyle w:val="ListParagraph"/>
+        <w:numPr>
+          <w:ilvl w:val="2"/>
+          <w:numId w:val="59"/>
+        </w:numPr>
+      </w:pPr>
+      <w:r>
+        <w:t>Discard remaining Laws</w:t>
+      </w:r>
+      <w:r>
+        <w:t>.</w:t>
+      </w:r>
+    </w:p>
+    <w:p>
+      <w:pPr>
+        <w:pStyle w:val="ListParagraph"/>
+        <w:numPr>
+          <w:ilvl w:val="1"/>
+          <w:numId w:val="59"/>
+        </w:numPr>
+      </w:pPr>
+      <w:r>
+        <w:t>Once all players have submitted a Law, the Player who submitted the first Law makes it the Deliberated Law and chooses its Threshold.</w:t>
+      </w:r>
+    </w:p>
+    <w:p>
+      <w:pPr>
+        <w:pStyle w:val="ListParagraph"/>
+        <w:numPr>
+          <w:ilvl w:val="0"/>
+          <w:numId w:val="59"/>
+        </w:numPr>
+      </w:pPr>
+      <w:r>
+        <w:t>Give each Player the following:</w:t>
+      </w:r>
+    </w:p>
+    <w:p>
+      <w:pPr>
+        <w:pStyle w:val="ListParagraph"/>
+        <w:numPr>
+          <w:ilvl w:val="1"/>
+          <w:numId w:val="59"/>
+        </w:numPr>
+      </w:pPr>
+      <w:r>
+        <w:t>3 Coins</w:t>
+      </w:r>
+      <w:r>
+        <w:t>,</w:t>
+      </w:r>
+    </w:p>
+    <w:p>
+      <w:pPr>
+        <w:pStyle w:val="ListParagraph"/>
+        <w:numPr>
+          <w:ilvl w:val="1"/>
+          <w:numId w:val="59"/>
+        </w:numPr>
+      </w:pPr>
+      <w:r>
+        <w:t>1 Spy</w:t>
+      </w:r>
+      <w:r>
+        <w:t>,</w:t>
+      </w:r>
+    </w:p>
+    <w:p>
+      <w:pPr>
+        <w:pStyle w:val="ListParagraph"/>
+        <w:numPr>
+          <w:ilvl w:val="1"/>
+          <w:numId w:val="59"/>
+        </w:numPr>
+      </w:pPr>
+      <w:r>
+        <w:t>1 Troop per Player</w:t>
+      </w:r>
+      <w:r>
+        <w:t>,</w:t>
+      </w:r>
+    </w:p>
+    <w:p>
+      <w:pPr>
+        <w:pStyle w:val="ListParagraph"/>
+        <w:numPr>
+          <w:ilvl w:val="1"/>
+          <w:numId w:val="59"/>
+        </w:numPr>
+      </w:pPr>
+      <w:r>
+        <w:t>2 cards from each deck</w:t>
+      </w:r>
+      <w:r>
+        <w:t>,</w:t>
+      </w:r>
+    </w:p>
+    <w:p>
+      <w:pPr>
+        <w:pStyle w:val="ListParagraph"/>
+        <w:numPr>
+          <w:ilvl w:val="1"/>
+          <w:numId w:val="59"/>
+        </w:numPr>
+      </w:pPr>
+      <w:r>
+        <w:t>1 Scheme Pouch with 2 Card Markers from each Player</w:t>
+      </w:r>
+      <w:r>
+        <w:t>.</w:t>
+      </w:r>
+    </w:p>
+    <w:p>
+      <w:pPr>
+        <w:pStyle w:val="ListParagraph"/>
+        <w:numPr>
+          <w:ilvl w:val="0"/>
+          <w:numId w:val="59"/>
+        </w:numPr>
+      </w:pPr>
+      <w:r>
+        <w:t>Give the King’s Favor to the oldest (most honored) Player</w:t>
+      </w:r>
+      <w:r>
+        <w:t>.</w:t>
+      </w:r>
+    </w:p>
+    <w:p>
+      <w:pPr>
+        <w:pStyle w:val="Heading1"/>
+      </w:pPr>
+      <w:r>
+        <w:t xml:space="preserve">4. </w:t>
+      </w:r>
+      <w:r>
+        <w:t xml:space="preserve">Game and </w:t>
+      </w:r>
+      <w:r>
+        <w:t>Round Structure</w:t>
+      </w:r>
+    </w:p>
+    <w:p>
+      <w:pPr>
         <w:pStyle w:val="Subtitle"/>
       </w:pPr>
       <w:r>
-        <w:t>Walk</w:t>
-      </w:r>
-      <w:r>
-        <w:t xml:space="preserve"> players through constructing the initial state</w:t>
+        <w:t xml:space="preserve">High-level </w:t>
+      </w:r>
+      <w:r>
+        <w:t xml:space="preserve">overview of </w:t>
+      </w:r>
+      <w:r>
+        <w:t>the entire game progression</w:t>
+      </w:r>
+    </w:p>
+    <w:p>
+      <w:pPr>
+        <w:pStyle w:val="Heading2"/>
+      </w:pPr>
+      <w:r>
+        <w:t>4.1</w:t>
+      </w:r>
+      <w:r>
+        <w:t>.</w:t>
+      </w:r>
+      <w:r>
+        <w:t xml:space="preserve"> </w:t>
+      </w:r>
+      <w:r>
+        <w:t>Game structure</w:t>
+      </w:r>
+    </w:p>
+    <w:p>
+      <w:pPr>
+        <w:pStyle w:val="Heading2"/>
+      </w:pPr>
+      <w:r>
+        <w:t xml:space="preserve">4.2. </w:t>
+      </w:r>
+      <w:r>
+        <w:t>Round structur</w:t>
+      </w:r>
+      <w:r>
+        <w:t>e</w:t>
+      </w:r>
+    </w:p>
+    <w:p>
+      <w:pPr>
+        <w:pStyle w:val="Heading2"/>
+      </w:pPr>
+      <w:r>
+        <w:t xml:space="preserve">4.3. </w:t>
+      </w:r>
+      <w:r>
+        <w:t>Ways to get Honor</w:t>
       </w:r>
     </w:p>
     <w:p>
@@ -817,13 +1307,10 @@
         <w:pStyle w:val="Heading1"/>
       </w:pPr>
       <w:r>
-        <w:t xml:space="preserve">4. </w:t>
-      </w:r>
-      <w:r>
-        <w:t xml:space="preserve">Game and </w:t>
-      </w:r>
-      <w:r>
-        <w:t>Round Structure</w:t>
+        <w:t xml:space="preserve">5. </w:t>
+      </w:r>
+      <w:r>
+        <w:t>Action Phase</w:t>
       </w:r>
     </w:p>
     <w:p>
@@ -831,13 +1318,62 @@
         <w:pStyle w:val="Subtitle"/>
       </w:pPr>
       <w:r>
-        <w:t xml:space="preserve">High-level </w:t>
-      </w:r>
-      <w:r>
-        <w:t xml:space="preserve">overview of </w:t>
-      </w:r>
-      <w:r>
-        <w:t>the entire game progression</w:t>
+        <w:t xml:space="preserve">Detailed description of all </w:t>
+      </w:r>
+      <w:proofErr w:type="gramStart"/>
+      <w:r>
+        <w:t>actions</w:t>
+      </w:r>
+      <w:proofErr w:type="gramEnd"/>
+      <w:r>
+        <w:t xml:space="preserve"> players can take during a turn and interactions allowed between players out of turn</w:t>
+      </w:r>
+    </w:p>
+    <w:p>
+      <w:pPr>
+        <w:pStyle w:val="Heading1"/>
+      </w:pPr>
+      <w:r>
+        <w:lastRenderedPageBreak/>
+        <w:t xml:space="preserve">6. </w:t>
+      </w:r>
+      <w:r>
+        <w:t>Reports Phase</w:t>
+      </w:r>
+    </w:p>
+    <w:p>
+      <w:pPr>
+        <w:pStyle w:val="Subtitle"/>
+      </w:pPr>
+      <w:r>
+        <w:t>Detailed description of all steps to clean up after a round and prepare for the next round</w:t>
+      </w:r>
+    </w:p>
+    <w:p>
+      <w:pPr>
+        <w:pStyle w:val="Heading1"/>
+      </w:pPr>
+      <w:r>
+        <w:t xml:space="preserve">7. </w:t>
+      </w:r>
+      <w:proofErr w:type="spellStart"/>
+      <w:r>
+        <w:t>Subsytems</w:t>
+      </w:r>
+      <w:proofErr w:type="spellEnd"/>
+    </w:p>
+    <w:p>
+      <w:pPr>
+        <w:pStyle w:val="Subtitle"/>
+      </w:pPr>
+      <w:r>
+        <w:t xml:space="preserve">Detailed description of the major </w:t>
+      </w:r>
+      <w:r>
+        <w:t>subsystems</w:t>
+      </w:r>
+      <w:r>
+        <w:t xml:space="preserve"> of the game</w:t>
       </w:r>
     </w:p>
     <w:p>
@@ -845,122 +1381,6 @@
         <w:pStyle w:val="Heading2"/>
       </w:pPr>
       <w:r>
-        <w:t>4.1</w:t>
-      </w:r>
-      <w:r>
-        <w:t>.</w:t>
-      </w:r>
-      <w:r>
-        <w:t xml:space="preserve"> </w:t>
-      </w:r>
-      <w:r>
-        <w:t>Game structure</w:t>
-      </w:r>
-    </w:p>
-    <w:p>
-      <w:pPr>
-        <w:pStyle w:val="Heading2"/>
-      </w:pPr>
-      <w:r>
-        <w:t xml:space="preserve">4.2. </w:t>
-      </w:r>
-      <w:r>
-        <w:t>Round structur</w:t>
-      </w:r>
-      <w:r>
-        <w:t>e</w:t>
-      </w:r>
-    </w:p>
-    <w:p>
-      <w:pPr>
-        <w:pStyle w:val="Heading2"/>
-      </w:pPr>
-      <w:r>
-        <w:t xml:space="preserve">4.3. </w:t>
-      </w:r>
-      <w:r>
-        <w:t>Ways to get Honor</w:t>
-      </w:r>
-    </w:p>
-    <w:p>
-      <w:pPr>
-        <w:pStyle w:val="Heading1"/>
-      </w:pPr>
-      <w:r>
-        <w:t xml:space="preserve">5. </w:t>
-      </w:r>
-      <w:r>
-        <w:t>Action Phase</w:t>
-      </w:r>
-    </w:p>
-    <w:p>
-      <w:pPr>
-        <w:pStyle w:val="Subtitle"/>
-      </w:pPr>
-      <w:r>
-        <w:t xml:space="preserve">Detailed description of all </w:t>
-      </w:r>
-      <w:proofErr w:type="gramStart"/>
-      <w:r>
-        <w:t>actions</w:t>
-      </w:r>
-      <w:proofErr w:type="gramEnd"/>
-      <w:r>
-        <w:t xml:space="preserve"> players can take during a turn and interactions allowed between players out of turn</w:t>
-      </w:r>
-    </w:p>
-    <w:p>
-      <w:pPr>
-        <w:pStyle w:val="Heading1"/>
-      </w:pPr>
-      <w:r>
-        <w:t xml:space="preserve">6. </w:t>
-      </w:r>
-      <w:r>
-        <w:t>Reports Phase</w:t>
-      </w:r>
-    </w:p>
-    <w:p>
-      <w:pPr>
-        <w:pStyle w:val="Subtitle"/>
-      </w:pPr>
-      <w:r>
-        <w:t>Detailed description of all steps to clean up after a round and prepare for the next round</w:t>
-      </w:r>
-    </w:p>
-    <w:p>
-      <w:pPr>
-        <w:pStyle w:val="Heading1"/>
-      </w:pPr>
-      <w:r>
-        <w:t xml:space="preserve">7. </w:t>
-      </w:r>
-      <w:proofErr w:type="spellStart"/>
-      <w:r>
-        <w:t>Subsytems</w:t>
-      </w:r>
-      <w:proofErr w:type="spellEnd"/>
-    </w:p>
-    <w:p>
-      <w:pPr>
-        <w:pStyle w:val="Subtitle"/>
-      </w:pPr>
-      <w:r>
-        <w:t xml:space="preserve">Detailed description of the major </w:t>
-      </w:r>
-      <w:r>
-        <w:t>subsystems</w:t>
-      </w:r>
-      <w:r>
-        <w:t xml:space="preserve"> of the game</w:t>
-      </w:r>
-    </w:p>
-    <w:p>
-      <w:pPr>
-        <w:pStyle w:val="Heading2"/>
-      </w:pPr>
-      <w:r>
-        <w:lastRenderedPageBreak/>
         <w:t xml:space="preserve">7.1. </w:t>
       </w:r>
       <w:r>
@@ -1278,285 +1698,6 @@
       </w:r>
     </w:p>
     <w:p>
-      <w:pPr>
-        <w:rPr>
-          <w:b/>
-          <w:bCs/>
-        </w:rPr>
-      </w:pPr>
-      <w:r>
-        <w:rPr>
-          <w:b/>
-          <w:bCs/>
-        </w:rPr>
-        <w:t>X. Setup</w:t>
-      </w:r>
-    </w:p>
-    <w:p>
-      <w:r>
-        <w:t>X.1 Shuffle all decks</w:t>
-      </w:r>
-    </w:p>
-    <w:p>
-      <w:r>
-        <w:t>X.2 Add 12 Greek Troops per player to the Greek Reserves</w:t>
-      </w:r>
-    </w:p>
-    <w:p>
-      <w:r>
-        <w:t>X.3 Add 1 Coin per player to the Royal Bank</w:t>
-      </w:r>
-    </w:p>
-    <w:p>
-      <w:r>
-        <w:t>X.4 Roll the Market Rate Die</w:t>
-      </w:r>
-    </w:p>
-    <w:p>
-      <w:r>
-        <w:t>X.5 Draft Investments</w:t>
-      </w:r>
-    </w:p>
-    <w:p>
-      <w:pPr>
-        <w:pStyle w:val="ListParagraph"/>
-      </w:pPr>
-      <w:r>
-        <w:t>Deal 5 Investments to each Player</w:t>
-      </w:r>
-    </w:p>
-    <w:p>
-      <w:pPr>
-        <w:pStyle w:val="ListParagraph"/>
-      </w:pPr>
-      <w:r>
-        <w:t xml:space="preserve">Each Player plays 1 Investment from their hand to the table in front of their </w:t>
-      </w:r>
-      <w:r>
-        <w:t>screen</w:t>
-      </w:r>
-      <w:r>
-        <w:t>.</w:t>
-      </w:r>
-    </w:p>
-    <w:p>
-      <w:pPr>
-        <w:pStyle w:val="ListParagraph"/>
-      </w:pPr>
-      <w:r>
-        <w:lastRenderedPageBreak/>
-        <w:t>Each Player passes the rest of their hand to the player on their left.</w:t>
-      </w:r>
-    </w:p>
-    <w:p>
-      <w:pPr>
-        <w:pStyle w:val="ListParagraph"/>
-      </w:pPr>
-      <w:r>
-        <w:t>Repeat Steps 2 and 3 until all Players have exactly 4 Investments. Discard any remaining Investments.</w:t>
-      </w:r>
-    </w:p>
-    <w:p>
-      <w:pPr>
-        <w:pStyle w:val="ListParagraph"/>
-      </w:pPr>
-      <w:r>
-        <w:t>Each Player takes one die per Investment and distributes 8 levels between their four Investments. The sum of the Investment levels must be 8</w:t>
-      </w:r>
-      <w:r>
-        <w:t>.</w:t>
-      </w:r>
-    </w:p>
-    <w:p>
-      <w:pPr>
-        <w:pStyle w:val="ListParagraph"/>
-      </w:pPr>
-      <w:r>
-        <w:t>Take care to keep each Investment no higher than its level cap.</w:t>
-      </w:r>
-    </w:p>
-    <w:p>
-      <w:r>
-        <w:t>X.6 Assign Leader Levels</w:t>
-      </w:r>
-    </w:p>
-    <w:p>
-      <w:pPr>
-        <w:pStyle w:val="ListParagraph"/>
-      </w:pPr>
-      <w:r>
-        <w:t xml:space="preserve">Each Player places 4 Leaders in front of their </w:t>
-      </w:r>
-      <w:r>
-        <w:t>screen</w:t>
-      </w:r>
-      <w:r>
-        <w:t xml:space="preserve"> and distributes 8 levels between their four Leaders. The sum of the Leader levels must be 8.</w:t>
-      </w:r>
-    </w:p>
-    <w:p>
-      <w:pPr>
-        <w:pStyle w:val="ListParagraph"/>
-      </w:pPr>
-      <w:r>
-        <w:t xml:space="preserve">The Leader levels do not have to match your </w:t>
-      </w:r>
-      <w:proofErr w:type="gramStart"/>
-      <w:r>
-        <w:t>Investment</w:t>
-      </w:r>
-      <w:proofErr w:type="gramEnd"/>
-      <w:r>
-        <w:t xml:space="preserve"> levels.</w:t>
-      </w:r>
-    </w:p>
-    <w:p>
-      <w:r>
-        <w:t>X.6 Sub</w:t>
-      </w:r>
-      <w:r>
-        <w:t>mit Initial Laws</w:t>
-      </w:r>
-    </w:p>
-    <w:p>
-      <w:pPr>
-        <w:pStyle w:val="ListParagraph"/>
-      </w:pPr>
-      <w:r>
-        <w:t>Give each Player a card marker of their own color.</w:t>
-      </w:r>
-    </w:p>
-    <w:p>
-      <w:pPr>
-        <w:pStyle w:val="ListParagraph"/>
-      </w:pPr>
-      <w:r>
-        <w:t>Deal 3 Laws to each Player. Make sure players do not look at the Laws they are dealt yet.</w:t>
-      </w:r>
-    </w:p>
-    <w:p>
-      <w:pPr>
-        <w:pStyle w:val="ListParagraph"/>
-      </w:pPr>
-      <w:r>
-        <w:t>At the same time, all Players look at their Laws and race to do the following:</w:t>
-      </w:r>
-    </w:p>
-    <w:p>
-      <w:pPr>
-        <w:pStyle w:val="ListParagraph"/>
-      </w:pPr>
-      <w:r>
-        <w:t>Choose one Law to submit to the Queue</w:t>
-      </w:r>
-    </w:p>
-    <w:p>
-      <w:pPr>
-        <w:pStyle w:val="ListParagraph"/>
-      </w:pPr>
-      <w:r>
-        <w:t>Place your Marker fully on the Law</w:t>
-      </w:r>
-    </w:p>
-    <w:p>
-      <w:pPr>
-        <w:pStyle w:val="ListParagraph"/>
-      </w:pPr>
-      <w:r>
-        <w:t>Place your marked Law faceup at the back of the Queue</w:t>
-      </w:r>
-    </w:p>
-    <w:p>
-      <w:pPr>
-        <w:pStyle w:val="ListParagraph"/>
-      </w:pPr>
-      <w:r>
-        <w:t>Discard remaining Laws</w:t>
-      </w:r>
-    </w:p>
-    <w:p>
-      <w:pPr>
-        <w:pStyle w:val="ListParagraph"/>
-      </w:pPr>
-      <w:r>
-        <w:t>Once all players have submitted a Law, the Player who submitted the first Law makes it the Deliberated Law and chooses its Threshold.</w:t>
-      </w:r>
-    </w:p>
-    <w:p>
-      <w:r>
-        <w:t>X.</w:t>
-      </w:r>
-      <w:r>
-        <w:t>7</w:t>
-      </w:r>
-      <w:r>
-        <w:t xml:space="preserve"> Give each Player the following:</w:t>
-      </w:r>
-    </w:p>
-    <w:p>
-      <w:pPr>
-        <w:pStyle w:val="ListParagraph"/>
-      </w:pPr>
-      <w:r>
-        <w:t>3 Coins</w:t>
-      </w:r>
-    </w:p>
-    <w:p>
-      <w:pPr>
-        <w:pStyle w:val="ListParagraph"/>
-      </w:pPr>
-      <w:r>
-        <w:t>1 Spy</w:t>
-      </w:r>
-    </w:p>
-    <w:p>
-      <w:pPr>
-        <w:pStyle w:val="ListParagraph"/>
-      </w:pPr>
-      <w:r>
-        <w:t>1 Troop per Player</w:t>
-      </w:r>
-    </w:p>
-    <w:p>
-      <w:pPr>
-        <w:pStyle w:val="ListParagraph"/>
-      </w:pPr>
-      <w:r>
-        <w:t>2 cards from each deck</w:t>
-      </w:r>
-    </w:p>
-    <w:p>
-      <w:pPr>
-        <w:pStyle w:val="ListParagraph"/>
-      </w:pPr>
-      <w:r>
-        <w:t xml:space="preserve">1 Scheme Pouch with </w:t>
-      </w:r>
-      <w:r>
-        <w:t>2 Card Markers from each Player</w:t>
-      </w:r>
-    </w:p>
-    <w:p>
-      <w:r>
-        <w:lastRenderedPageBreak/>
-        <w:t>X.</w:t>
-      </w:r>
-      <w:r>
-        <w:t>8</w:t>
-      </w:r>
-      <w:r>
-        <w:t xml:space="preserve"> Give the King’s Favor to the oldest (most honored) Player</w:t>
-      </w:r>
-    </w:p>
-    <w:p>
-      <w:r>
-        <w:t xml:space="preserve">X.9 Have the </w:t>
-      </w:r>
-      <w:r>
-        <w:t>sponsor of the Deliberated Law set its value</w:t>
-      </w:r>
-    </w:p>
-    <w:p>
       <w:r>
         <w:pict w14:anchorId="1EDC79D0">
           <v:rect id="_x0000_i1027" style="width:0;height:1.5pt" o:hralign="center" o:hrstd="t" o:hr="t" fillcolor="#a0a0a0" stroked="f"/>
@@ -1677,6 +1818,7 @@
           <w:b/>
           <w:bCs/>
         </w:rPr>
+        <w:lastRenderedPageBreak/>
         <w:t>Taking a Turn</w:t>
       </w:r>
     </w:p>
@@ -1916,7 +2058,6 @@
     </w:p>
     <w:p>
       <w:r>
-        <w:lastRenderedPageBreak/>
         <w:t xml:space="preserve">There are three categories of </w:t>
       </w:r>
       <w:proofErr w:type="gramStart"/>
@@ -2062,6 +2203,7 @@
           <w:b/>
           <w:bCs/>
         </w:rPr>
+        <w:lastRenderedPageBreak/>
         <w:t>Promote</w:t>
       </w:r>
       <w:r>
@@ -2332,169 +2474,169 @@
           <w:b/>
           <w:bCs/>
         </w:rPr>
+        <w:t>Sell</w:t>
+      </w:r>
+      <w:r>
+        <w:t xml:space="preserve"> — Trade </w:t>
+      </w:r>
+      <w:r>
+        <w:t xml:space="preserve">Commodities with </w:t>
+      </w:r>
+      <w:r>
+        <w:t xml:space="preserve">the Free Bank </w:t>
+      </w:r>
+      <w:r>
+        <w:t xml:space="preserve">for Coins </w:t>
+      </w:r>
+      <w:r>
+        <w:t xml:space="preserve">at </w:t>
+      </w:r>
+      <w:r>
+        <w:t xml:space="preserve">subpar </w:t>
+      </w:r>
+      <w:r>
+        <w:t>rates.</w:t>
+      </w:r>
+    </w:p>
+    <w:p>
+      <w:pPr>
+        <w:numPr>
+          <w:ilvl w:val="0"/>
+          <w:numId w:val="23"/>
+        </w:numPr>
+      </w:pPr>
+      <w:r>
+        <w:rPr>
+          <w:b/>
+          <w:bCs/>
+        </w:rPr>
+        <w:t>Monetize</w:t>
+      </w:r>
+      <w:r>
+        <w:t xml:space="preserve"> — Trade </w:t>
+      </w:r>
+      <w:r>
+        <w:t xml:space="preserve">Cards </w:t>
+      </w:r>
+      <w:r>
+        <w:t xml:space="preserve">with the Free </w:t>
+      </w:r>
+      <w:r>
+        <w:t xml:space="preserve">Bank </w:t>
+      </w:r>
+      <w:r>
+        <w:t xml:space="preserve">for Coins </w:t>
+      </w:r>
+      <w:r>
+        <w:t xml:space="preserve">at </w:t>
+      </w:r>
+      <w:r>
+        <w:t>subpar</w:t>
+      </w:r>
+      <w:r>
+        <w:t xml:space="preserve"> </w:t>
+      </w:r>
+      <w:r>
+        <w:t>rates.</w:t>
+      </w:r>
+    </w:p>
+    <w:p>
+      <w:r>
+        <w:t xml:space="preserve">Imperial Reminder: The King frowns upon </w:t>
+      </w:r>
+      <w:proofErr w:type="spellStart"/>
+      <w:r>
+        <w:t>Undermarket</w:t>
+      </w:r>
+      <w:proofErr w:type="spellEnd"/>
+      <w:r>
+        <w:t xml:space="preserve"> dealings. Fortunately, frowns are not Laws.</w:t>
+      </w:r>
+    </w:p>
+    <w:p/>
+    <w:p>
+      <w:pPr>
+        <w:rPr>
+          <w:b/>
+          <w:bCs/>
+        </w:rPr>
+      </w:pPr>
+      <w:r>
+        <w:rPr>
+          <w:b/>
+          <w:bCs/>
+        </w:rPr>
+        <w:t>6.3 Court Actions</w:t>
+      </w:r>
+    </w:p>
+    <w:p>
+      <w:r>
+        <w:t xml:space="preserve">These represent direct influence </w:t>
+      </w:r>
+      <w:proofErr w:type="gramStart"/>
+      <w:r>
+        <w:t>at</w:t>
+      </w:r>
+      <w:proofErr w:type="gramEnd"/>
+      <w:r>
+        <w:t xml:space="preserve"> the imperial court. Each </w:t>
+      </w:r>
+      <w:r>
+        <w:t>may be used once per round by a single player</w:t>
+      </w:r>
+      <w:r>
+        <w:t>.</w:t>
+      </w:r>
+    </w:p>
+    <w:p>
+      <w:pPr>
+        <w:numPr>
+          <w:ilvl w:val="0"/>
+          <w:numId w:val="22"/>
+        </w:numPr>
+      </w:pPr>
+      <w:r>
+        <w:rPr>
+          <w:b/>
+          <w:bCs/>
+        </w:rPr>
+        <w:t>Petition</w:t>
+      </w:r>
+      <w:r>
+        <w:t xml:space="preserve"> — Add Laws to the queue.</w:t>
+      </w:r>
+    </w:p>
+    <w:p>
+      <w:pPr>
+        <w:numPr>
+          <w:ilvl w:val="0"/>
+          <w:numId w:val="22"/>
+        </w:numPr>
+      </w:pPr>
+      <w:r>
+        <w:rPr>
+          <w:b/>
+          <w:bCs/>
+        </w:rPr>
+        <w:t>Postpone</w:t>
+      </w:r>
+      <w:r>
+        <w:t xml:space="preserve"> — Move the deliberated Law backward.</w:t>
+      </w:r>
+    </w:p>
+    <w:p>
+      <w:pPr>
+        <w:numPr>
+          <w:ilvl w:val="0"/>
+          <w:numId w:val="22"/>
+        </w:numPr>
+      </w:pPr>
+      <w:r>
+        <w:rPr>
+          <w:b/>
+          <w:bCs/>
+        </w:rPr>
         <w:lastRenderedPageBreak/>
-        <w:t>Sell</w:t>
-      </w:r>
-      <w:r>
-        <w:t xml:space="preserve"> — Trade </w:t>
-      </w:r>
-      <w:r>
-        <w:t xml:space="preserve">Commodities with </w:t>
-      </w:r>
-      <w:r>
-        <w:t xml:space="preserve">the Free Bank </w:t>
-      </w:r>
-      <w:r>
-        <w:t xml:space="preserve">for Coins </w:t>
-      </w:r>
-      <w:r>
-        <w:t xml:space="preserve">at </w:t>
-      </w:r>
-      <w:r>
-        <w:t xml:space="preserve">subpar </w:t>
-      </w:r>
-      <w:r>
-        <w:t>rates.</w:t>
-      </w:r>
-    </w:p>
-    <w:p>
-      <w:pPr>
-        <w:numPr>
-          <w:ilvl w:val="0"/>
-          <w:numId w:val="23"/>
-        </w:numPr>
-      </w:pPr>
-      <w:r>
-        <w:rPr>
-          <w:b/>
-          <w:bCs/>
-        </w:rPr>
-        <w:t>Monetize</w:t>
-      </w:r>
-      <w:r>
-        <w:t xml:space="preserve"> — Trade </w:t>
-      </w:r>
-      <w:r>
-        <w:t xml:space="preserve">Cards </w:t>
-      </w:r>
-      <w:r>
-        <w:t xml:space="preserve">with the Free </w:t>
-      </w:r>
-      <w:r>
-        <w:t xml:space="preserve">Bank </w:t>
-      </w:r>
-      <w:r>
-        <w:t xml:space="preserve">for Coins </w:t>
-      </w:r>
-      <w:r>
-        <w:t xml:space="preserve">at </w:t>
-      </w:r>
-      <w:r>
-        <w:t>subpar</w:t>
-      </w:r>
-      <w:r>
-        <w:t xml:space="preserve"> </w:t>
-      </w:r>
-      <w:r>
-        <w:t>rates.</w:t>
-      </w:r>
-    </w:p>
-    <w:p>
-      <w:r>
-        <w:t xml:space="preserve">Imperial Reminder: The King frowns upon </w:t>
-      </w:r>
-      <w:proofErr w:type="spellStart"/>
-      <w:r>
-        <w:t>Undermarket</w:t>
-      </w:r>
-      <w:proofErr w:type="spellEnd"/>
-      <w:r>
-        <w:t xml:space="preserve"> dealings. Fortunately, frowns are not Laws.</w:t>
-      </w:r>
-    </w:p>
-    <w:p/>
-    <w:p>
-      <w:pPr>
-        <w:rPr>
-          <w:b/>
-          <w:bCs/>
-        </w:rPr>
-      </w:pPr>
-      <w:r>
-        <w:rPr>
-          <w:b/>
-          <w:bCs/>
-        </w:rPr>
-        <w:t>6.3 Court Actions</w:t>
-      </w:r>
-    </w:p>
-    <w:p>
-      <w:r>
-        <w:t xml:space="preserve">These represent direct influence </w:t>
-      </w:r>
-      <w:proofErr w:type="gramStart"/>
-      <w:r>
-        <w:t>at</w:t>
-      </w:r>
-      <w:proofErr w:type="gramEnd"/>
-      <w:r>
-        <w:t xml:space="preserve"> the imperial court. Each </w:t>
-      </w:r>
-      <w:r>
-        <w:t>may be used once per round by a single player</w:t>
-      </w:r>
-      <w:r>
-        <w:t>.</w:t>
-      </w:r>
-    </w:p>
-    <w:p>
-      <w:pPr>
-        <w:numPr>
-          <w:ilvl w:val="0"/>
-          <w:numId w:val="22"/>
-        </w:numPr>
-      </w:pPr>
-      <w:r>
-        <w:rPr>
-          <w:b/>
-          <w:bCs/>
-        </w:rPr>
-        <w:t>Petition</w:t>
-      </w:r>
-      <w:r>
-        <w:t xml:space="preserve"> — Add Laws to the queue.</w:t>
-      </w:r>
-    </w:p>
-    <w:p>
-      <w:pPr>
-        <w:numPr>
-          <w:ilvl w:val="0"/>
-          <w:numId w:val="22"/>
-        </w:numPr>
-      </w:pPr>
-      <w:r>
-        <w:rPr>
-          <w:b/>
-          <w:bCs/>
-        </w:rPr>
-        <w:t>Postpone</w:t>
-      </w:r>
-      <w:r>
-        <w:t xml:space="preserve"> — Move the deliberated Law backward.</w:t>
-      </w:r>
-    </w:p>
-    <w:p>
-      <w:pPr>
-        <w:numPr>
-          <w:ilvl w:val="0"/>
-          <w:numId w:val="22"/>
-        </w:numPr>
-      </w:pPr>
-      <w:r>
-        <w:rPr>
-          <w:b/>
-          <w:bCs/>
-        </w:rPr>
         <w:t>Prioritize</w:t>
       </w:r>
       <w:r>
@@ -2716,7 +2858,6 @@
     </w:p>
     <w:p>
       <w:r>
-        <w:lastRenderedPageBreak/>
         <w:t xml:space="preserve">The accusing satrap (the </w:t>
       </w:r>
       <w:r>
@@ -2811,6 +2952,7 @@
         </w:numPr>
       </w:pPr>
       <w:r>
+        <w:lastRenderedPageBreak/>
         <w:t>“My tax ledgers are accurate; perhaps your envy clouds your judgment.”</w:t>
       </w:r>
     </w:p>
@@ -2899,65 +3041,65 @@
     </w:p>
     <w:p>
       <w:r>
+        <w:t>This solemn ritual ensures that both parties enter the Trial with honor—and the necessary funds—firmly in hand.</w:t>
+      </w:r>
+    </w:p>
+    <w:p>
+      <w:pPr>
+        <w:rPr>
+          <w:b/>
+          <w:bCs/>
+        </w:rPr>
+      </w:pPr>
+      <w:r>
+        <w:rPr>
+          <w:b/>
+          <w:bCs/>
+        </w:rPr>
+        <w:t>X.3 Determining the Verdict</w:t>
+      </w:r>
+    </w:p>
+    <w:p>
+      <w:r>
+        <w:t xml:space="preserve">The Trial itself is a battle of cunning and resolve, where fate favors the bold and the prepared. Each satrap commands </w:t>
+      </w:r>
+      <w:proofErr w:type="gramStart"/>
+      <w:r>
+        <w:t>a number of</w:t>
+      </w:r>
+      <w:proofErr w:type="gramEnd"/>
+      <w:r>
+        <w:t xml:space="preserve"> dice equal to their Leader's level, casting them with the weight of their honor.</w:t>
+      </w:r>
+    </w:p>
+    <w:p>
+      <w:r>
+        <w:t>Every die that lands with a value of 4 or higher strikes a Point against the opposition, a testament to skill and fortune intertwined.</w:t>
+      </w:r>
+    </w:p>
+    <w:p>
+      <w:r>
+        <w:t>The satrap who claims the most Points wins the round, but beware—the Trial is a best-of-three duel, demanding endurance and unwavering will to secure ultimate victory.</w:t>
+      </w:r>
+    </w:p>
+    <w:p>
+      <w:pPr>
+        <w:rPr>
+          <w:b/>
+          <w:bCs/>
+        </w:rPr>
+      </w:pPr>
+      <w:r>
+        <w:rPr>
+          <w:b/>
+          <w:bCs/>
+        </w:rPr>
+        <w:t>X.4 Deliver Judgement</w:t>
+      </w:r>
+    </w:p>
+    <w:p>
+      <w:r>
         <w:lastRenderedPageBreak/>
-        <w:t>This solemn ritual ensures that both parties enter the Trial with honor—and the necessary funds—firmly in hand.</w:t>
-      </w:r>
-    </w:p>
-    <w:p>
-      <w:pPr>
-        <w:rPr>
-          <w:b/>
-          <w:bCs/>
-        </w:rPr>
-      </w:pPr>
-      <w:r>
-        <w:rPr>
-          <w:b/>
-          <w:bCs/>
-        </w:rPr>
-        <w:t>X.3 Determining the Verdict</w:t>
-      </w:r>
-    </w:p>
-    <w:p>
-      <w:r>
-        <w:t xml:space="preserve">The Trial itself is a battle of cunning and resolve, where fate favors the bold and the prepared. Each satrap commands </w:t>
-      </w:r>
-      <w:proofErr w:type="gramStart"/>
-      <w:r>
-        <w:t>a number of</w:t>
-      </w:r>
-      <w:proofErr w:type="gramEnd"/>
-      <w:r>
-        <w:t xml:space="preserve"> dice equal to their Leader's level, casting them with the weight of their honor.</w:t>
-      </w:r>
-    </w:p>
-    <w:p>
-      <w:r>
-        <w:t>Every die that lands with a value of 4 or higher strikes a Point against the opposition, a testament to skill and fortune intertwined.</w:t>
-      </w:r>
-    </w:p>
-    <w:p>
-      <w:r>
-        <w:t>The satrap who claims the most Points wins the round, but beware—the Trial is a best-of-three duel, demanding endurance and unwavering will to secure ultimate victory.</w:t>
-      </w:r>
-    </w:p>
-    <w:p>
-      <w:pPr>
-        <w:rPr>
-          <w:b/>
-          <w:bCs/>
-        </w:rPr>
-      </w:pPr>
-      <w:r>
-        <w:rPr>
-          <w:b/>
-          <w:bCs/>
-        </w:rPr>
-        <w:t>X.4 Deliver Judgement</w:t>
-      </w:r>
-    </w:p>
-    <w:p>
-      <w:r>
         <w:t>When the dust settles and honor is measured, the victor claims their rightful spoils. The winner retrieves their Coins from the Royal Bank, along with half (rounded up) of their opponent's Coins held there—reparations for the damages caused by the dispute and Trial. Additionally, the victor earns 1 Honor, a mark of prestige that echoes through the courts.</w:t>
       </w:r>
     </w:p>
@@ -3120,555 +3262,555 @@
     </w:p>
     <w:p>
       <w:r>
+        <w:t xml:space="preserve">Laws that are active </w:t>
+      </w:r>
+      <w:r>
+        <w:t xml:space="preserve">and binding to all Players are known as </w:t>
+      </w:r>
+      <w:r>
+        <w:rPr>
+          <w:b/>
+          <w:bCs/>
+        </w:rPr>
+        <w:t>Edicts</w:t>
+      </w:r>
+      <w:r>
+        <w:t xml:space="preserve">. The game starts with no Edicts, but </w:t>
+      </w:r>
+      <w:r>
+        <w:t>a new Edict will be added at the end of each round, making the rules players must follow that much more complex.</w:t>
+      </w:r>
+    </w:p>
+    <w:p>
+      <w:pPr>
+        <w:rPr>
+          <w:b/>
+          <w:bCs/>
+        </w:rPr>
+      </w:pPr>
+      <w:r>
+        <w:rPr>
+          <w:b/>
+          <w:bCs/>
+        </w:rPr>
+        <w:t>7.1 The Law Queue</w:t>
+      </w:r>
+    </w:p>
+    <w:p>
+      <w:r>
+        <w:t>Th</w:t>
+      </w:r>
+      <w:r>
+        <w:t>is</w:t>
+      </w:r>
+      <w:r>
+        <w:t xml:space="preserve"> is a public timeline of future rules</w:t>
+      </w:r>
+      <w:r>
+        <w:t xml:space="preserve"> and represents the new legal priorities of the Empire</w:t>
+      </w:r>
+      <w:r>
+        <w:t xml:space="preserve">. </w:t>
+      </w:r>
+      <w:r>
+        <w:t>Law</w:t>
+      </w:r>
+      <w:r>
+        <w:t xml:space="preserve"> cards</w:t>
+      </w:r>
+      <w:r>
+        <w:t xml:space="preserve"> </w:t>
+      </w:r>
+      <w:r>
+        <w:t xml:space="preserve">enter </w:t>
+      </w:r>
+      <w:r>
+        <w:t xml:space="preserve">the Queue </w:t>
+      </w:r>
+      <w:r>
+        <w:t xml:space="preserve">via </w:t>
+      </w:r>
+      <w:r>
+        <w:t>Petition</w:t>
+      </w:r>
+      <w:r>
+        <w:t xml:space="preserve"> and eventually</w:t>
+      </w:r>
+      <w:r>
+        <w:t xml:space="preserve"> become Edicts</w:t>
+      </w:r>
+      <w:r>
+        <w:t>.</w:t>
+      </w:r>
+    </w:p>
+    <w:p>
+      <w:pPr>
+        <w:numPr>
+          <w:ilvl w:val="0"/>
+          <w:numId w:val="25"/>
+        </w:numPr>
+      </w:pPr>
+      <w:r>
+        <w:t xml:space="preserve">The top card </w:t>
+      </w:r>
+      <w:r>
+        <w:t xml:space="preserve">of the Queue </w:t>
+      </w:r>
+      <w:r>
+        <w:t xml:space="preserve">is the </w:t>
+      </w:r>
+      <w:r>
+        <w:rPr>
+          <w:b/>
+          <w:bCs/>
+        </w:rPr>
+        <w:t>Deliberated Law</w:t>
+      </w:r>
+      <w:r>
+        <w:t>.</w:t>
+      </w:r>
+      <w:r>
+        <w:t xml:space="preserve"> It is the only card in the Queue with a set Threshold and will become the next active Law unless </w:t>
+      </w:r>
+      <w:r>
+        <w:t>Postponed.</w:t>
+      </w:r>
+    </w:p>
+    <w:p>
+      <w:pPr>
+        <w:numPr>
+          <w:ilvl w:val="0"/>
+          <w:numId w:val="25"/>
+        </w:numPr>
+      </w:pPr>
+      <w:r>
+        <w:t>At the end of each round</w:t>
+      </w:r>
+      <w:r>
+        <w:t xml:space="preserve"> the Deliberated Law</w:t>
+      </w:r>
+      <w:r>
+        <w:t xml:space="preserve"> is </w:t>
+      </w:r>
+      <w:r>
+        <w:rPr>
+          <w:b/>
+          <w:bCs/>
+        </w:rPr>
+        <w:t>Ratified</w:t>
+      </w:r>
+      <w:r>
+        <w:t xml:space="preserve"> </w:t>
+      </w:r>
+      <w:r>
+        <w:t>into an E</w:t>
+      </w:r>
+      <w:r>
+        <w:t xml:space="preserve">dict </w:t>
+      </w:r>
+      <w:r>
+        <w:t xml:space="preserve">and moved </w:t>
+      </w:r>
+      <w:r>
+        <w:t>to the Imperial Edicts section of the board</w:t>
+      </w:r>
+      <w:r>
+        <w:t>.</w:t>
+      </w:r>
+    </w:p>
+    <w:p>
+      <w:pPr>
+        <w:numPr>
+          <w:ilvl w:val="0"/>
+          <w:numId w:val="25"/>
+        </w:numPr>
+      </w:pPr>
+      <w:r>
+        <w:t xml:space="preserve">Once a </w:t>
+      </w:r>
+      <w:r>
+        <w:t xml:space="preserve">Deliberated </w:t>
+      </w:r>
+      <w:r>
+        <w:t xml:space="preserve">Law is Ratified, the </w:t>
+      </w:r>
+      <w:r>
+        <w:t>new top card of the Queue becomes the Deliberated Law, and its sponsor sets its Threshold</w:t>
+      </w:r>
+    </w:p>
+    <w:p>
+      <w:pPr>
+        <w:numPr>
+          <w:ilvl w:val="0"/>
+          <w:numId w:val="25"/>
+        </w:numPr>
+      </w:pPr>
+      <w:r>
         <w:lastRenderedPageBreak/>
-        <w:t xml:space="preserve">Laws that are active </w:t>
-      </w:r>
-      <w:r>
-        <w:t xml:space="preserve">and binding to all Players are known as </w:t>
-      </w:r>
-      <w:r>
-        <w:rPr>
-          <w:b/>
-          <w:bCs/>
-        </w:rPr>
+        <w:t>If the queue is empty</w:t>
+      </w:r>
+      <w:r>
+        <w:t xml:space="preserve"> when setting a Deliberated Law</w:t>
+      </w:r>
+      <w:r>
+        <w:t xml:space="preserve">, draw a new Law </w:t>
+      </w:r>
+      <w:r>
+        <w:t xml:space="preserve">to become the Deliberated Law </w:t>
+      </w:r>
+      <w:r>
+        <w:t>and roll a die to set its Threshold.</w:t>
+      </w:r>
+      <w:r>
+        <w:t xml:space="preserve"> This Law has no sponsor</w:t>
+      </w:r>
+      <w:r>
+        <w:t>.</w:t>
+      </w:r>
+    </w:p>
+    <w:p>
+      <w:pPr>
+        <w:rPr>
+          <w:b/>
+          <w:bCs/>
+        </w:rPr>
+      </w:pPr>
+      <w:r>
+        <w:rPr>
+          <w:b/>
+          <w:bCs/>
+        </w:rPr>
+        <w:t>7.2 Sanctions</w:t>
+      </w:r>
+    </w:p>
+    <w:p>
+      <w:r>
+        <w:t>If</w:t>
+      </w:r>
+      <w:r>
+        <w:t xml:space="preserve"> a player is in</w:t>
+      </w:r>
+      <w:r>
+        <w:t xml:space="preserve"> </w:t>
+      </w:r>
+      <w:r>
+        <w:t>violat</w:t>
+      </w:r>
+      <w:r>
+        <w:t>ion of an Edict</w:t>
+      </w:r>
+      <w:r>
+        <w:t>:</w:t>
+      </w:r>
+    </w:p>
+    <w:p>
+      <w:pPr>
+        <w:numPr>
+          <w:ilvl w:val="0"/>
+          <w:numId w:val="26"/>
+        </w:numPr>
+      </w:pPr>
+      <w:r>
+        <w:t xml:space="preserve">Every time </w:t>
+      </w:r>
+      <w:r>
+        <w:t xml:space="preserve">the player </w:t>
+      </w:r>
+      <w:r>
+        <w:t>take</w:t>
+      </w:r>
+      <w:r>
+        <w:t>s</w:t>
+      </w:r>
+      <w:r>
+        <w:t xml:space="preserve"> the sanctioned action, </w:t>
+      </w:r>
+      <w:r>
+        <w:t xml:space="preserve">their </w:t>
+      </w:r>
+      <w:r>
+        <w:t xml:space="preserve">Leader acts at </w:t>
+      </w:r>
+      <w:r>
+        <w:rPr>
+          <w:b/>
+          <w:bCs/>
+        </w:rPr>
+        <w:t>–1 Level</w:t>
+      </w:r>
+      <w:r>
+        <w:t>.</w:t>
+      </w:r>
+    </w:p>
+    <w:p>
+      <w:pPr>
+        <w:numPr>
+          <w:ilvl w:val="0"/>
+          <w:numId w:val="26"/>
+        </w:numPr>
+      </w:pPr>
+      <w:r>
+        <w:t xml:space="preserve">Sanctions </w:t>
+      </w:r>
+      <w:r>
+        <w:rPr>
+          <w:b/>
+          <w:bCs/>
+        </w:rPr>
+        <w:t>stack</w:t>
+      </w:r>
+      <w:r>
+        <w:t xml:space="preserve"> across multiple</w:t>
+      </w:r>
+      <w:r>
+        <w:t xml:space="preserve"> Edicts</w:t>
+      </w:r>
+      <w:r>
+        <w:t>.</w:t>
+      </w:r>
+    </w:p>
+    <w:p>
+      <w:pPr>
+        <w:numPr>
+          <w:ilvl w:val="0"/>
+          <w:numId w:val="26"/>
+        </w:numPr>
+      </w:pPr>
+      <w:r>
+        <w:t xml:space="preserve">Sanctions </w:t>
+      </w:r>
+      <w:r>
+        <w:rPr>
+          <w:b/>
+          <w:bCs/>
+        </w:rPr>
+        <w:t>persist</w:t>
+      </w:r>
+      <w:r>
+        <w:t xml:space="preserve"> until </w:t>
+      </w:r>
+      <w:r>
+        <w:t xml:space="preserve">the player </w:t>
+      </w:r>
+      <w:r>
+        <w:t>compl</w:t>
+      </w:r>
+      <w:r>
+        <w:t>ies with the Edict</w:t>
+      </w:r>
+      <w:r>
+        <w:t>.</w:t>
+      </w:r>
+    </w:p>
+    <w:p>
+      <w:pPr>
+        <w:rPr>
+          <w:b/>
+          <w:bCs/>
+        </w:rPr>
+      </w:pPr>
+      <w:r>
+        <w:rPr>
+          <w:b/>
+          <w:bCs/>
+        </w:rPr>
+        <w:t>7.3 Taxes</w:t>
+      </w:r>
+    </w:p>
+    <w:p>
+      <w:r>
+        <w:t>Any player in violation of a</w:t>
+      </w:r>
+      <w:r>
+        <w:t>n Edict</w:t>
+      </w:r>
+      <w:r>
+        <w:t xml:space="preserve"> must pay </w:t>
+      </w:r>
+      <w:r>
+        <w:t xml:space="preserve">a fine to </w:t>
+      </w:r>
+      <w:r>
+        <w:t xml:space="preserve">the King </w:t>
+      </w:r>
+      <w:r>
+        <w:t>to compensate for their lack of obedience.</w:t>
+      </w:r>
+    </w:p>
+    <w:p>
+      <w:r>
+        <w:t xml:space="preserve">Taxes </w:t>
+      </w:r>
+      <w:r>
+        <w:t>for all</w:t>
+      </w:r>
+      <w:r>
+        <w:t xml:space="preserve"> Edicts</w:t>
+      </w:r>
+      <w:r>
+        <w:t xml:space="preserve"> </w:t>
+      </w:r>
+      <w:r>
+        <w:t xml:space="preserve">are typically </w:t>
+      </w:r>
+      <w:r>
+        <w:t>due a</w:t>
+      </w:r>
+      <w:r>
+        <w:t xml:space="preserve">t the start of the Imperial Reports </w:t>
+      </w:r>
+      <w:proofErr w:type="gramStart"/>
+      <w:r>
+        <w:t>Phase</w:t>
+      </w:r>
+      <w:proofErr w:type="gramEnd"/>
+      <w:r>
+        <w:t xml:space="preserve"> but </w:t>
+      </w:r>
+      <w:r>
+        <w:t xml:space="preserve">a player </w:t>
+      </w:r>
+      <w:r>
+        <w:t xml:space="preserve">may demand </w:t>
+      </w:r>
+      <w:r>
+        <w:t>advance payment</w:t>
+      </w:r>
+      <w:r>
+        <w:t xml:space="preserve"> for their sponsored</w:t>
+      </w:r>
+      <w:r>
+        <w:t xml:space="preserve"> Edicts</w:t>
+      </w:r>
+      <w:r>
+        <w:t xml:space="preserve"> </w:t>
+      </w:r>
+      <w:r>
+        <w:t xml:space="preserve">if </w:t>
+      </w:r>
+      <w:r>
+        <w:t xml:space="preserve">they </w:t>
+      </w:r>
+      <w:r>
+        <w:t>take the Tax action space</w:t>
+      </w:r>
+      <w:r>
+        <w:t xml:space="preserve"> during the Action Phase</w:t>
+      </w:r>
+      <w:r>
+        <w:t>. When taxes come due</w:t>
+      </w:r>
+      <w:r>
+        <w:t xml:space="preserve"> on </w:t>
+      </w:r>
+      <w:r>
+        <w:t>an Edict</w:t>
+      </w:r>
+      <w:r>
+        <w:t>,</w:t>
+      </w:r>
+    </w:p>
+    <w:p>
+      <w:pPr>
+        <w:numPr>
+          <w:ilvl w:val="0"/>
+          <w:numId w:val="27"/>
+        </w:numPr>
+      </w:pPr>
+      <w:r>
+        <w:t>Each</w:t>
+      </w:r>
+      <w:r>
+        <w:t xml:space="preserve"> player in violation of the</w:t>
+      </w:r>
+      <w:r>
+        <w:t xml:space="preserve"> Edict</w:t>
+      </w:r>
+      <w:r>
+        <w:t xml:space="preserve"> </w:t>
+      </w:r>
+      <w:r>
+        <w:t>pays 1 Coin</w:t>
+      </w:r>
+      <w:r>
+        <w:t xml:space="preserve"> to the Royal Bank</w:t>
+      </w:r>
+      <w:r>
+        <w:t>.</w:t>
+      </w:r>
+    </w:p>
+    <w:p>
+      <w:pPr>
+        <w:numPr>
+          <w:ilvl w:val="0"/>
+          <w:numId w:val="27"/>
+        </w:numPr>
+        <w:rPr>
+          <w:b/>
+          <w:bCs/>
+        </w:rPr>
+      </w:pPr>
+      <w:r>
+        <w:t xml:space="preserve">If </w:t>
+      </w:r>
+      <w:r>
+        <w:t>the S</w:t>
+      </w:r>
+      <w:r>
+        <w:t>ponsor</w:t>
+      </w:r>
+      <w:r>
+        <w:t xml:space="preserve"> of the </w:t>
+      </w:r>
+      <w:r>
+        <w:t xml:space="preserve">Edict </w:t>
+      </w:r>
+      <w:r>
+        <w:t xml:space="preserve">demanded </w:t>
+      </w:r>
+      <w:r>
+        <w:t>advance payment</w:t>
+      </w:r>
+      <w:r>
+        <w:t xml:space="preserve"> during the Action Phase</w:t>
+      </w:r>
+      <w:r>
+        <w:t>, they may</w:t>
+      </w:r>
+      <w:r>
+        <w:t xml:space="preserve"> </w:t>
+      </w:r>
+      <w:r>
+        <w:t xml:space="preserve">take Coins </w:t>
+      </w:r>
+      <w:r>
+        <w:t>up to their Leader’s Level</w:t>
+      </w:r>
+      <w:r>
+        <w:t xml:space="preserve"> from the Royal Bank, but no more than </w:t>
+      </w:r>
+      <w:r>
+        <w:t>what was just added</w:t>
+      </w:r>
+      <w:r>
+        <w:t xml:space="preserve"> by the Tax</w:t>
+      </w:r>
+      <w:r>
+        <w:t xml:space="preserve"> action</w:t>
+      </w:r>
+      <w:r>
+        <w:t>.</w:t>
+      </w:r>
+      <w:r>
+        <w:t xml:space="preserve"> </w:t>
+      </w:r>
+      <w:r>
         <w:t>Edicts</w:t>
       </w:r>
       <w:r>
-        <w:t xml:space="preserve">. The game starts with no Edicts, but </w:t>
-      </w:r>
-      <w:r>
-        <w:t>a new Edict will be added at the end of each round, making the rules players must follow that much more complex.</w:t>
-      </w:r>
-    </w:p>
-    <w:p>
-      <w:pPr>
-        <w:rPr>
-          <w:b/>
-          <w:bCs/>
-        </w:rPr>
-      </w:pPr>
-      <w:r>
-        <w:rPr>
-          <w:b/>
-          <w:bCs/>
-        </w:rPr>
-        <w:t>7.1 The Law Queue</w:t>
-      </w:r>
-    </w:p>
-    <w:p>
-      <w:r>
-        <w:t>Th</w:t>
-      </w:r>
-      <w:r>
-        <w:t>is</w:t>
-      </w:r>
-      <w:r>
-        <w:t xml:space="preserve"> is a public timeline of future rules</w:t>
-      </w:r>
-      <w:r>
-        <w:t xml:space="preserve"> and represents the new legal priorities of the Empire</w:t>
-      </w:r>
-      <w:r>
-        <w:t xml:space="preserve">. </w:t>
-      </w:r>
-      <w:r>
-        <w:t>Law</w:t>
-      </w:r>
-      <w:r>
-        <w:t xml:space="preserve"> cards</w:t>
-      </w:r>
-      <w:r>
         <w:t xml:space="preserve"> </w:t>
       </w:r>
       <w:r>
-        <w:t xml:space="preserve">enter </w:t>
-      </w:r>
-      <w:r>
-        <w:t xml:space="preserve">the Queue </w:t>
-      </w:r>
-      <w:r>
-        <w:t xml:space="preserve">via </w:t>
-      </w:r>
-      <w:r>
-        <w:t>Petition</w:t>
-      </w:r>
-      <w:r>
-        <w:t xml:space="preserve"> and eventually</w:t>
-      </w:r>
-      <w:r>
-        <w:t xml:space="preserve"> become Edicts</w:t>
-      </w:r>
-      <w:r>
-        <w:t>.</w:t>
-      </w:r>
-    </w:p>
-    <w:p>
-      <w:pPr>
-        <w:numPr>
-          <w:ilvl w:val="0"/>
-          <w:numId w:val="25"/>
-        </w:numPr>
-      </w:pPr>
-      <w:r>
-        <w:t xml:space="preserve">The top card </w:t>
-      </w:r>
-      <w:r>
-        <w:t xml:space="preserve">of the Queue </w:t>
-      </w:r>
-      <w:r>
-        <w:t xml:space="preserve">is the </w:t>
-      </w:r>
-      <w:r>
-        <w:rPr>
-          <w:b/>
-          <w:bCs/>
-        </w:rPr>
-        <w:t>Deliberated Law</w:t>
-      </w:r>
-      <w:r>
-        <w:t>.</w:t>
-      </w:r>
-      <w:r>
-        <w:t xml:space="preserve"> It is the only card in the Queue with a set Threshold and will become the next active Law unless </w:t>
-      </w:r>
-      <w:r>
-        <w:t>Postponed.</w:t>
-      </w:r>
-    </w:p>
-    <w:p>
-      <w:pPr>
-        <w:numPr>
-          <w:ilvl w:val="0"/>
-          <w:numId w:val="25"/>
-        </w:numPr>
-      </w:pPr>
-      <w:r>
-        <w:t>At the end of each round</w:t>
-      </w:r>
-      <w:r>
-        <w:t xml:space="preserve"> the Deliberated Law</w:t>
-      </w:r>
-      <w:r>
-        <w:t xml:space="preserve"> is </w:t>
-      </w:r>
-      <w:r>
-        <w:rPr>
-          <w:b/>
-          <w:bCs/>
-        </w:rPr>
-        <w:t>Ratified</w:t>
-      </w:r>
-      <w:r>
-        <w:t xml:space="preserve"> </w:t>
-      </w:r>
-      <w:r>
-        <w:t>into an E</w:t>
-      </w:r>
-      <w:r>
-        <w:t xml:space="preserve">dict </w:t>
-      </w:r>
-      <w:r>
-        <w:t xml:space="preserve">and moved </w:t>
-      </w:r>
-      <w:r>
-        <w:t>to the Imperial Edicts section of the board</w:t>
-      </w:r>
-      <w:r>
-        <w:t>.</w:t>
-      </w:r>
-    </w:p>
-    <w:p>
-      <w:pPr>
-        <w:numPr>
-          <w:ilvl w:val="0"/>
-          <w:numId w:val="25"/>
-        </w:numPr>
-      </w:pPr>
-      <w:r>
-        <w:t xml:space="preserve">Once a </w:t>
-      </w:r>
-      <w:r>
-        <w:t xml:space="preserve">Deliberated </w:t>
-      </w:r>
-      <w:r>
-        <w:t xml:space="preserve">Law is Ratified, the </w:t>
-      </w:r>
-      <w:r>
-        <w:t>new top card of the Queue becomes the Deliberated Law, and its sponsor sets its Threshold</w:t>
-      </w:r>
-    </w:p>
-    <w:p>
-      <w:pPr>
-        <w:numPr>
-          <w:ilvl w:val="0"/>
-          <w:numId w:val="25"/>
-        </w:numPr>
-      </w:pPr>
-      <w:r>
-        <w:t>If the queue is empty</w:t>
-      </w:r>
-      <w:r>
-        <w:t xml:space="preserve"> when setting a Deliberated Law</w:t>
-      </w:r>
-      <w:r>
-        <w:t xml:space="preserve">, draw a new Law </w:t>
-      </w:r>
-      <w:r>
-        <w:t xml:space="preserve">to become the Deliberated Law </w:t>
-      </w:r>
-      <w:r>
-        <w:t>and roll a die to set its Threshold.</w:t>
-      </w:r>
-      <w:r>
-        <w:t xml:space="preserve"> This Law has no sponsor</w:t>
-      </w:r>
-      <w:r>
-        <w:t>.</w:t>
-      </w:r>
-    </w:p>
-    <w:p>
-      <w:pPr>
-        <w:rPr>
-          <w:b/>
-          <w:bCs/>
-        </w:rPr>
-      </w:pPr>
-      <w:r>
-        <w:rPr>
-          <w:b/>
-          <w:bCs/>
-        </w:rPr>
-        <w:t>7.2 Sanctions</w:t>
-      </w:r>
-    </w:p>
-    <w:p>
-      <w:r>
-        <w:t>If</w:t>
-      </w:r>
-      <w:r>
-        <w:t xml:space="preserve"> a player is in</w:t>
-      </w:r>
-      <w:r>
-        <w:t xml:space="preserve"> </w:t>
-      </w:r>
-      <w:r>
-        <w:t>violat</w:t>
-      </w:r>
-      <w:r>
-        <w:t>ion of an Edict</w:t>
-      </w:r>
-      <w:r>
-        <w:t>:</w:t>
-      </w:r>
-    </w:p>
-    <w:p>
-      <w:pPr>
-        <w:numPr>
-          <w:ilvl w:val="0"/>
-          <w:numId w:val="26"/>
-        </w:numPr>
-      </w:pPr>
-      <w:r>
-        <w:t xml:space="preserve">Every time </w:t>
-      </w:r>
-      <w:r>
-        <w:t xml:space="preserve">the player </w:t>
-      </w:r>
-      <w:r>
-        <w:t>take</w:t>
-      </w:r>
-      <w:r>
-        <w:t>s</w:t>
-      </w:r>
-      <w:r>
-        <w:t xml:space="preserve"> the sanctioned action, </w:t>
-      </w:r>
-      <w:r>
-        <w:t xml:space="preserve">their </w:t>
-      </w:r>
-      <w:r>
-        <w:t xml:space="preserve">Leader acts at </w:t>
-      </w:r>
-      <w:r>
-        <w:rPr>
-          <w:b/>
-          <w:bCs/>
-        </w:rPr>
-        <w:t>–1 Level</w:t>
-      </w:r>
-      <w:r>
-        <w:t>.</w:t>
-      </w:r>
-    </w:p>
-    <w:p>
-      <w:pPr>
-        <w:numPr>
-          <w:ilvl w:val="0"/>
-          <w:numId w:val="26"/>
-        </w:numPr>
-      </w:pPr>
-      <w:r>
-        <w:t xml:space="preserve">Sanctions </w:t>
-      </w:r>
-      <w:r>
-        <w:rPr>
-          <w:b/>
-          <w:bCs/>
-        </w:rPr>
-        <w:t>stack</w:t>
-      </w:r>
-      <w:r>
-        <w:t xml:space="preserve"> across multiple</w:t>
-      </w:r>
-      <w:r>
-        <w:t xml:space="preserve"> Edicts</w:t>
-      </w:r>
-      <w:r>
-        <w:t>.</w:t>
-      </w:r>
-    </w:p>
-    <w:p>
-      <w:pPr>
-        <w:numPr>
-          <w:ilvl w:val="0"/>
-          <w:numId w:val="26"/>
-        </w:numPr>
-      </w:pPr>
-      <w:r>
-        <w:t xml:space="preserve">Sanctions </w:t>
-      </w:r>
-      <w:r>
-        <w:rPr>
-          <w:b/>
-          <w:bCs/>
-        </w:rPr>
-        <w:t>persist</w:t>
-      </w:r>
-      <w:r>
-        <w:t xml:space="preserve"> until </w:t>
-      </w:r>
-      <w:r>
-        <w:t xml:space="preserve">the player </w:t>
-      </w:r>
-      <w:r>
-        <w:t>compl</w:t>
-      </w:r>
-      <w:r>
-        <w:t>ies with the Edict</w:t>
-      </w:r>
-      <w:r>
-        <w:t>.</w:t>
-      </w:r>
-    </w:p>
-    <w:p>
-      <w:pPr>
-        <w:rPr>
-          <w:b/>
-          <w:bCs/>
-        </w:rPr>
-      </w:pPr>
-      <w:r>
-        <w:rPr>
-          <w:b/>
-          <w:bCs/>
-        </w:rPr>
-        <w:t>7.3 Taxes</w:t>
-      </w:r>
-    </w:p>
-    <w:p>
-      <w:r>
-        <w:t>Any player in violation of a</w:t>
-      </w:r>
-      <w:r>
-        <w:t>n Edict</w:t>
-      </w:r>
-      <w:r>
-        <w:t xml:space="preserve"> must pay </w:t>
-      </w:r>
-      <w:r>
-        <w:t xml:space="preserve">a fine to </w:t>
-      </w:r>
-      <w:r>
-        <w:t xml:space="preserve">the King </w:t>
-      </w:r>
-      <w:r>
-        <w:t>to compensate for their lack of obedience.</w:t>
-      </w:r>
-    </w:p>
-    <w:p>
-      <w:r>
-        <w:t xml:space="preserve">Taxes </w:t>
-      </w:r>
-      <w:r>
-        <w:t>for all</w:t>
-      </w:r>
-      <w:r>
-        <w:t xml:space="preserve"> Edicts</w:t>
-      </w:r>
-      <w:r>
-        <w:t xml:space="preserve"> </w:t>
-      </w:r>
-      <w:r>
-        <w:t xml:space="preserve">are typically </w:t>
-      </w:r>
-      <w:r>
-        <w:t>due a</w:t>
-      </w:r>
-      <w:r>
-        <w:t xml:space="preserve">t the start of the Imperial Reports </w:t>
-      </w:r>
-      <w:proofErr w:type="gramStart"/>
-      <w:r>
-        <w:t>Phase</w:t>
-      </w:r>
-      <w:proofErr w:type="gramEnd"/>
-      <w:r>
-        <w:t xml:space="preserve"> but </w:t>
-      </w:r>
-      <w:r>
-        <w:t xml:space="preserve">a player </w:t>
-      </w:r>
-      <w:r>
-        <w:t xml:space="preserve">may demand </w:t>
-      </w:r>
-      <w:r>
-        <w:t>advance payment</w:t>
-      </w:r>
-      <w:r>
-        <w:t xml:space="preserve"> for their sponsored</w:t>
-      </w:r>
-      <w:r>
-        <w:t xml:space="preserve"> Edicts</w:t>
-      </w:r>
-      <w:r>
-        <w:t xml:space="preserve"> </w:t>
-      </w:r>
-      <w:r>
-        <w:t xml:space="preserve">if </w:t>
-      </w:r>
-      <w:r>
-        <w:t xml:space="preserve">they </w:t>
-      </w:r>
-      <w:r>
-        <w:t>take the Tax action space</w:t>
-      </w:r>
-      <w:r>
-        <w:t xml:space="preserve"> during the Action Phase</w:t>
-      </w:r>
-      <w:r>
-        <w:t>. When taxes come due</w:t>
-      </w:r>
-      <w:r>
-        <w:t xml:space="preserve"> on </w:t>
-      </w:r>
-      <w:r>
-        <w:t>an Edict</w:t>
-      </w:r>
-      <w:r>
-        <w:t>,</w:t>
-      </w:r>
-    </w:p>
-    <w:p>
-      <w:pPr>
-        <w:numPr>
-          <w:ilvl w:val="0"/>
-          <w:numId w:val="27"/>
-        </w:numPr>
-      </w:pPr>
-      <w:r>
-        <w:t>Each</w:t>
-      </w:r>
-      <w:r>
-        <w:t xml:space="preserve"> player in violation of the</w:t>
-      </w:r>
-      <w:r>
-        <w:t xml:space="preserve"> Edict</w:t>
-      </w:r>
-      <w:r>
-        <w:t xml:space="preserve"> </w:t>
-      </w:r>
-      <w:r>
-        <w:t>pays 1 Coin</w:t>
-      </w:r>
-      <w:r>
-        <w:t xml:space="preserve"> to the Royal Bank</w:t>
-      </w:r>
-      <w:r>
-        <w:t>.</w:t>
-      </w:r>
-    </w:p>
-    <w:p>
-      <w:pPr>
-        <w:numPr>
-          <w:ilvl w:val="0"/>
-          <w:numId w:val="27"/>
-        </w:numPr>
-        <w:rPr>
-          <w:b/>
-          <w:bCs/>
-        </w:rPr>
-      </w:pPr>
-      <w:r>
-        <w:t xml:space="preserve">If </w:t>
-      </w:r>
-      <w:r>
-        <w:t>the S</w:t>
-      </w:r>
-      <w:r>
-        <w:t>ponsor</w:t>
-      </w:r>
-      <w:r>
-        <w:t xml:space="preserve"> of the </w:t>
-      </w:r>
-      <w:r>
-        <w:t xml:space="preserve">Edict </w:t>
-      </w:r>
-      <w:r>
-        <w:t xml:space="preserve">demanded </w:t>
-      </w:r>
-      <w:r>
-        <w:t>advance payment</w:t>
-      </w:r>
-      <w:r>
-        <w:t xml:space="preserve"> during the Action Phase</w:t>
-      </w:r>
-      <w:r>
-        <w:t>, they may</w:t>
-      </w:r>
-      <w:r>
-        <w:t xml:space="preserve"> </w:t>
-      </w:r>
-      <w:r>
-        <w:t xml:space="preserve">take Coins </w:t>
-      </w:r>
-      <w:r>
-        <w:t>up to their Leader’s Level</w:t>
-      </w:r>
-      <w:r>
-        <w:t xml:space="preserve"> from the Royal Bank, but no more than </w:t>
-      </w:r>
-      <w:r>
-        <w:t>what was just added</w:t>
-      </w:r>
-      <w:r>
-        <w:t xml:space="preserve"> by the Tax</w:t>
-      </w:r>
-      <w:r>
-        <w:t xml:space="preserve"> action</w:t>
-      </w:r>
-      <w:r>
-        <w:t>.</w:t>
-      </w:r>
-      <w:r>
-        <w:t xml:space="preserve"> </w:t>
-      </w:r>
-      <w:r>
-        <w:t>Edicts</w:t>
-      </w:r>
-      <w:r>
-        <w:t xml:space="preserve"> </w:t>
-      </w:r>
-      <w:r>
         <w:t xml:space="preserve">taxed </w:t>
       </w:r>
       <w:r>
@@ -3690,7 +3832,6 @@
           <w:b/>
           <w:bCs/>
         </w:rPr>
-        <w:lastRenderedPageBreak/>
         <w:t>7.4 Modifying Laws</w:t>
       </w:r>
     </w:p>
@@ -3773,6 +3914,7 @@
     </w:p>
     <w:p>
       <w:r>
+        <w:lastRenderedPageBreak/>
         <w:t>At the start of each round, redistribute all Scheme pouches with their correct markers so each player receives their own pouch containing all Scheme cards marked with their markers.</w:t>
       </w:r>
     </w:p>
@@ -3960,7 +4102,6 @@
         </w:numPr>
       </w:pPr>
       <w:r>
-        <w:lastRenderedPageBreak/>
         <w:t>Schemes inside are resolved in the order drawn.</w:t>
       </w:r>
     </w:p>
@@ -4066,6 +4207,7 @@
           <w:b/>
           <w:bCs/>
         </w:rPr>
+        <w:lastRenderedPageBreak/>
         <w:t>10. Market Rate</w:t>
       </w:r>
     </w:p>
@@ -4274,15 +4416,7 @@
           <w:b/>
           <w:bCs/>
         </w:rPr>
-        <w:t xml:space="preserve"> upheld the King’s order, which faltered, and how the empire must prepare for the next </w:t>
-      </w:r>
-      <w:r>
-        <w:rPr>
-          <w:b/>
-          <w:bCs/>
-        </w:rPr>
-        <w:lastRenderedPageBreak/>
-        <w:t xml:space="preserve">day’s maneuvers. Resolve the following matters in the exact order presented, for the empire tolerates no disorder in </w:t>
+        <w:t xml:space="preserve"> upheld the King’s order, which faltered, and how the empire must prepare for the next day’s maneuvers. Resolve the following matters in the exact order presented, for the empire tolerates no disorder in </w:t>
       </w:r>
       <w:proofErr w:type="gramStart"/>
       <w:r>
@@ -4412,6 +4546,7 @@
           <w:b/>
           <w:bCs/>
         </w:rPr>
+        <w:lastRenderedPageBreak/>
         <w:t>Sanctions imposed during the day remain in effect until the satrap restores their compliance, for the King does not forget disobedience lightly.</w:t>
       </w:r>
     </w:p>
@@ -4631,7 +4766,6 @@
     </w:p>
     <w:p>
       <w:r>
-        <w:lastRenderedPageBreak/>
         <w:t>Roll one die per player, halve each (rounded up), and sum the results.</w:t>
       </w:r>
       <w:r>
@@ -4746,6 +4880,7 @@
         </w:numPr>
       </w:pPr>
       <w:r>
+        <w:lastRenderedPageBreak/>
         <w:t>Remaining Greeks attack the satrap who deployed the fewest Troops.</w:t>
       </w:r>
     </w:p>
@@ -4975,7 +5110,6 @@
           <w:b/>
           <w:bCs/>
         </w:rPr>
-        <w:lastRenderedPageBreak/>
         <w:t>12.4 Resolve Schemes</w:t>
       </w:r>
     </w:p>
@@ -5065,6 +5199,7 @@
           <w:i/>
           <w:iCs/>
         </w:rPr>
+        <w:lastRenderedPageBreak/>
         <w:t>(The complete rules for Schemes, guard rolls, card rolls, and clandestine consequences appear in the Schemes section.)</w:t>
       </w:r>
     </w:p>
@@ -5350,110 +5485,110 @@
           <w:b/>
           <w:bCs/>
         </w:rPr>
+        <w:t xml:space="preserve">The Royal Bank receives 1 Coin per </w:t>
+      </w:r>
+      <w:proofErr w:type="gramStart"/>
+      <w:r>
+        <w:rPr>
+          <w:b/>
+          <w:bCs/>
+        </w:rPr>
+        <w:t>satrap</w:t>
+      </w:r>
+      <w:proofErr w:type="gramEnd"/>
+      <w:r>
+        <w:rPr>
+          <w:b/>
+          <w:bCs/>
+        </w:rPr>
+        <w:t>, representing the King’s distant holdings and the steady flow of imperial tribute.</w:t>
+      </w:r>
+    </w:p>
+    <w:p>
+      <w:pPr>
+        <w:numPr>
+          <w:ilvl w:val="0"/>
+          <w:numId w:val="53"/>
+        </w:numPr>
+        <w:rPr>
+          <w:b/>
+          <w:bCs/>
+        </w:rPr>
+      </w:pPr>
+      <w:r>
+        <w:rPr>
+          <w:b/>
+          <w:bCs/>
+        </w:rPr>
+        <w:t>The Market Rate is adjusted according to the method described in the Market rules, reflecting the shifting fortunes of merchants and caravans across the empire.</w:t>
+      </w:r>
+    </w:p>
+    <w:p>
+      <w:pPr>
+        <w:rPr>
+          <w:b/>
+          <w:bCs/>
+        </w:rPr>
+      </w:pPr>
+      <w:r>
+        <w:rPr>
+          <w:b/>
+          <w:bCs/>
+        </w:rPr>
+        <w:t>12.8 Reassign the King’s Favor</w:t>
+      </w:r>
+    </w:p>
+    <w:p>
+      <w:pPr>
+        <w:rPr>
+          <w:b/>
+          <w:bCs/>
+        </w:rPr>
+      </w:pPr>
+      <w:r>
+        <w:rPr>
+          <w:b/>
+          <w:bCs/>
+        </w:rPr>
+        <w:t>The King’s Favor is bestowed upon the satrap whose loyalty to imperial Law shines brightest.</w:t>
+      </w:r>
+    </w:p>
+    <w:p>
+      <w:pPr>
+        <w:numPr>
+          <w:ilvl w:val="0"/>
+          <w:numId w:val="54"/>
+        </w:numPr>
+        <w:rPr>
+          <w:b/>
+          <w:bCs/>
+        </w:rPr>
+      </w:pPr>
+      <w:r>
+        <w:rPr>
+          <w:b/>
+          <w:bCs/>
+        </w:rPr>
+        <w:t>The scribes determine which satrap obeys the greatest number of active Laws.</w:t>
+      </w:r>
+    </w:p>
+    <w:p>
+      <w:pPr>
+        <w:numPr>
+          <w:ilvl w:val="0"/>
+          <w:numId w:val="54"/>
+        </w:numPr>
+        <w:rPr>
+          <w:b/>
+          <w:bCs/>
+        </w:rPr>
+      </w:pPr>
+      <w:r>
+        <w:rPr>
+          <w:b/>
+          <w:bCs/>
+        </w:rPr>
         <w:lastRenderedPageBreak/>
-        <w:t xml:space="preserve">The Royal Bank receives 1 Coin per </w:t>
-      </w:r>
-      <w:proofErr w:type="gramStart"/>
-      <w:r>
-        <w:rPr>
-          <w:b/>
-          <w:bCs/>
-        </w:rPr>
-        <w:t>satrap</w:t>
-      </w:r>
-      <w:proofErr w:type="gramEnd"/>
-      <w:r>
-        <w:rPr>
-          <w:b/>
-          <w:bCs/>
-        </w:rPr>
-        <w:t>, representing the King’s distant holdings and the steady flow of imperial tribute.</w:t>
-      </w:r>
-    </w:p>
-    <w:p>
-      <w:pPr>
-        <w:numPr>
-          <w:ilvl w:val="0"/>
-          <w:numId w:val="53"/>
-        </w:numPr>
-        <w:rPr>
-          <w:b/>
-          <w:bCs/>
-        </w:rPr>
-      </w:pPr>
-      <w:r>
-        <w:rPr>
-          <w:b/>
-          <w:bCs/>
-        </w:rPr>
-        <w:t>The Market Rate is adjusted according to the method described in the Market rules, reflecting the shifting fortunes of merchants and caravans across the empire.</w:t>
-      </w:r>
-    </w:p>
-    <w:p>
-      <w:pPr>
-        <w:rPr>
-          <w:b/>
-          <w:bCs/>
-        </w:rPr>
-      </w:pPr>
-      <w:r>
-        <w:rPr>
-          <w:b/>
-          <w:bCs/>
-        </w:rPr>
-        <w:t>12.8 Reassign the King’s Favor</w:t>
-      </w:r>
-    </w:p>
-    <w:p>
-      <w:pPr>
-        <w:rPr>
-          <w:b/>
-          <w:bCs/>
-        </w:rPr>
-      </w:pPr>
-      <w:r>
-        <w:rPr>
-          <w:b/>
-          <w:bCs/>
-        </w:rPr>
-        <w:t>The King’s Favor is bestowed upon the satrap whose loyalty to imperial Law shines brightest.</w:t>
-      </w:r>
-    </w:p>
-    <w:p>
-      <w:pPr>
-        <w:numPr>
-          <w:ilvl w:val="0"/>
-          <w:numId w:val="54"/>
-        </w:numPr>
-        <w:rPr>
-          <w:b/>
-          <w:bCs/>
-        </w:rPr>
-      </w:pPr>
-      <w:r>
-        <w:rPr>
-          <w:b/>
-          <w:bCs/>
-        </w:rPr>
-        <w:t>The scribes determine which satrap obeys the greatest number of active Laws.</w:t>
-      </w:r>
-    </w:p>
-    <w:p>
-      <w:pPr>
-        <w:numPr>
-          <w:ilvl w:val="0"/>
-          <w:numId w:val="54"/>
-        </w:numPr>
-        <w:rPr>
-          <w:b/>
-          <w:bCs/>
-        </w:rPr>
-      </w:pPr>
-      <w:r>
-        <w:rPr>
-          <w:b/>
-          <w:bCs/>
-        </w:rPr>
         <w:t xml:space="preserve">That </w:t>
       </w:r>
       <w:proofErr w:type="gramStart"/>
@@ -5665,7 +5800,6 @@
     </w:p>
     <w:p>
       <w:r>
-        <w:lastRenderedPageBreak/>
         <w:t>The satrap with the most Honor is declared:</w:t>
       </w:r>
     </w:p>
@@ -5767,6 +5901,7 @@
         </w:numPr>
       </w:pPr>
       <w:r>
+        <w:lastRenderedPageBreak/>
         <w:t>Sanctions from multiple Laws stack.</w:t>
       </w:r>
     </w:p>
@@ -6044,7 +6179,6 @@
         </w:numPr>
       </w:pPr>
       <w:r>
-        <w:lastRenderedPageBreak/>
         <w:t>Inactive Leaders cannot be targeted by Schemes.</w:t>
       </w:r>
     </w:p>
@@ -6156,6 +6290,7 @@
         </w:numPr>
       </w:pPr>
       <w:r>
+        <w:lastRenderedPageBreak/>
         <w:t>Tokens are worth Honor at game end.</w:t>
       </w:r>
     </w:p>
@@ -8604,6 +8739,155 @@
     </w:lvl>
   </w:abstractNum>
   <w:abstractNum w:abstractNumId="17" w15:restartNumberingAfterBreak="0">
+    <w:nsid w:val="1AFD0EF8"/>
+    <w:multiLevelType w:val="multilevel"/>
+    <w:tmpl w:val="1144CC08"/>
+    <w:lvl w:ilvl="0">
+      <w:start w:val="1"/>
+      <w:numFmt w:val="decimal"/>
+      <w:lvlText w:val="%1."/>
+      <w:lvlJc w:val="left"/>
+      <w:pPr>
+        <w:tabs>
+          <w:tab w:val="num" w:pos="720"/>
+        </w:tabs>
+        <w:ind w:left="720" w:hanging="360"/>
+      </w:pPr>
+      <w:rPr>
+        <w:rFonts w:hint="default"/>
+        <w:sz w:val="20"/>
+      </w:rPr>
+    </w:lvl>
+    <w:lvl w:ilvl="1" w:tentative="1">
+      <w:start w:val="1"/>
+      <w:numFmt w:val="bullet"/>
+      <w:lvlText w:val="o"/>
+      <w:lvlJc w:val="left"/>
+      <w:pPr>
+        <w:tabs>
+          <w:tab w:val="num" w:pos="1440"/>
+        </w:tabs>
+        <w:ind w:left="1440" w:hanging="360"/>
+      </w:pPr>
+      <w:rPr>
+        <w:rFonts w:ascii="Courier New" w:hAnsi="Courier New" w:hint="default"/>
+        <w:sz w:val="20"/>
+      </w:rPr>
+    </w:lvl>
+    <w:lvl w:ilvl="2" w:tentative="1">
+      <w:start w:val="1"/>
+      <w:numFmt w:val="bullet"/>
+      <w:lvlText w:val=""/>
+      <w:lvlJc w:val="left"/>
+      <w:pPr>
+        <w:tabs>
+          <w:tab w:val="num" w:pos="2160"/>
+        </w:tabs>
+        <w:ind w:left="2160" w:hanging="360"/>
+      </w:pPr>
+      <w:rPr>
+        <w:rFonts w:ascii="Wingdings" w:hAnsi="Wingdings" w:hint="default"/>
+        <w:sz w:val="20"/>
+      </w:rPr>
+    </w:lvl>
+    <w:lvl w:ilvl="3" w:tentative="1">
+      <w:start w:val="1"/>
+      <w:numFmt w:val="bullet"/>
+      <w:lvlText w:val=""/>
+      <w:lvlJc w:val="left"/>
+      <w:pPr>
+        <w:tabs>
+          <w:tab w:val="num" w:pos="2880"/>
+        </w:tabs>
+        <w:ind w:left="2880" w:hanging="360"/>
+      </w:pPr>
+      <w:rPr>
+        <w:rFonts w:ascii="Wingdings" w:hAnsi="Wingdings" w:hint="default"/>
+        <w:sz w:val="20"/>
+      </w:rPr>
+    </w:lvl>
+    <w:lvl w:ilvl="4" w:tentative="1">
+      <w:start w:val="1"/>
+      <w:numFmt w:val="bullet"/>
+      <w:lvlText w:val=""/>
+      <w:lvlJc w:val="left"/>
+      <w:pPr>
+        <w:tabs>
+          <w:tab w:val="num" w:pos="3600"/>
+        </w:tabs>
+        <w:ind w:left="3600" w:hanging="360"/>
+      </w:pPr>
+      <w:rPr>
+        <w:rFonts w:ascii="Wingdings" w:hAnsi="Wingdings" w:hint="default"/>
+        <w:sz w:val="20"/>
+      </w:rPr>
+    </w:lvl>
+    <w:lvl w:ilvl="5" w:tentative="1">
+      <w:start w:val="1"/>
+      <w:numFmt w:val="bullet"/>
+      <w:lvlText w:val=""/>
+      <w:lvlJc w:val="left"/>
+      <w:pPr>
+        <w:tabs>
+          <w:tab w:val="num" w:pos="4320"/>
+        </w:tabs>
+        <w:ind w:left="4320" w:hanging="360"/>
+      </w:pPr>
+      <w:rPr>
+        <w:rFonts w:ascii="Wingdings" w:hAnsi="Wingdings" w:hint="default"/>
+        <w:sz w:val="20"/>
+      </w:rPr>
+    </w:lvl>
+    <w:lvl w:ilvl="6" w:tentative="1">
+      <w:start w:val="1"/>
+      <w:numFmt w:val="bullet"/>
+      <w:lvlText w:val=""/>
+      <w:lvlJc w:val="left"/>
+      <w:pPr>
+        <w:tabs>
+          <w:tab w:val="num" w:pos="5040"/>
+        </w:tabs>
+        <w:ind w:left="5040" w:hanging="360"/>
+      </w:pPr>
+      <w:rPr>
+        <w:rFonts w:ascii="Wingdings" w:hAnsi="Wingdings" w:hint="default"/>
+        <w:sz w:val="20"/>
+      </w:rPr>
+    </w:lvl>
+    <w:lvl w:ilvl="7" w:tentative="1">
+      <w:start w:val="1"/>
+      <w:numFmt w:val="bullet"/>
+      <w:lvlText w:val=""/>
+      <w:lvlJc w:val="left"/>
+      <w:pPr>
+        <w:tabs>
+          <w:tab w:val="num" w:pos="5760"/>
+        </w:tabs>
+        <w:ind w:left="5760" w:hanging="360"/>
+      </w:pPr>
+      <w:rPr>
+        <w:rFonts w:ascii="Wingdings" w:hAnsi="Wingdings" w:hint="default"/>
+        <w:sz w:val="20"/>
+      </w:rPr>
+    </w:lvl>
+    <w:lvl w:ilvl="8" w:tentative="1">
+      <w:start w:val="1"/>
+      <w:numFmt w:val="bullet"/>
+      <w:lvlText w:val=""/>
+      <w:lvlJc w:val="left"/>
+      <w:pPr>
+        <w:tabs>
+          <w:tab w:val="num" w:pos="6480"/>
+        </w:tabs>
+        <w:ind w:left="6480" w:hanging="360"/>
+      </w:pPr>
+      <w:rPr>
+        <w:rFonts w:ascii="Wingdings" w:hAnsi="Wingdings" w:hint="default"/>
+        <w:sz w:val="20"/>
+      </w:rPr>
+    </w:lvl>
+  </w:abstractNum>
+  <w:abstractNum w:abstractNumId="18" w15:restartNumberingAfterBreak="0">
     <w:nsid w:val="1CA923CE"/>
     <w:multiLevelType w:val="multilevel"/>
     <w:tmpl w:val="AA983B34"/>
@@ -8752,7 +9036,7 @@
       </w:rPr>
     </w:lvl>
   </w:abstractNum>
-  <w:abstractNum w:abstractNumId="18" w15:restartNumberingAfterBreak="0">
+  <w:abstractNum w:abstractNumId="19" w15:restartNumberingAfterBreak="0">
     <w:nsid w:val="22219AC1"/>
     <w:multiLevelType w:val="multilevel"/>
     <w:tmpl w:val="330EF36C"/>
@@ -8838,7 +9122,7 @@
       </w:pPr>
     </w:lvl>
   </w:abstractNum>
-  <w:abstractNum w:abstractNumId="19" w15:restartNumberingAfterBreak="0">
+  <w:abstractNum w:abstractNumId="20" w15:restartNumberingAfterBreak="0">
     <w:nsid w:val="28A92534"/>
     <w:multiLevelType w:val="multilevel"/>
     <w:tmpl w:val="C8A84C14"/>
@@ -8987,7 +9271,7 @@
       </w:rPr>
     </w:lvl>
   </w:abstractNum>
-  <w:abstractNum w:abstractNumId="20" w15:restartNumberingAfterBreak="0">
+  <w:abstractNum w:abstractNumId="21" w15:restartNumberingAfterBreak="0">
     <w:nsid w:val="28D3BFAC"/>
     <w:multiLevelType w:val="hybridMultilevel"/>
     <w:tmpl w:val="6A14F720"/>
@@ -9100,7 +9384,7 @@
       </w:rPr>
     </w:lvl>
   </w:abstractNum>
-  <w:abstractNum w:abstractNumId="21" w15:restartNumberingAfterBreak="0">
+  <w:abstractNum w:abstractNumId="22" w15:restartNumberingAfterBreak="0">
     <w:nsid w:val="33F913D8"/>
     <w:multiLevelType w:val="multilevel"/>
     <w:tmpl w:val="FDDEF1B2"/>
@@ -9249,7 +9533,7 @@
       </w:rPr>
     </w:lvl>
   </w:abstractNum>
-  <w:abstractNum w:abstractNumId="22" w15:restartNumberingAfterBreak="0">
+  <w:abstractNum w:abstractNumId="23" w15:restartNumberingAfterBreak="0">
     <w:nsid w:val="37A661EC"/>
     <w:multiLevelType w:val="multilevel"/>
     <w:tmpl w:val="3EDE44D8"/>
@@ -9335,7 +9619,7 @@
       </w:pPr>
     </w:lvl>
   </w:abstractNum>
-  <w:abstractNum w:abstractNumId="23" w15:restartNumberingAfterBreak="0">
+  <w:abstractNum w:abstractNumId="24" w15:restartNumberingAfterBreak="0">
     <w:nsid w:val="3852DE94"/>
     <w:multiLevelType w:val="hybridMultilevel"/>
     <w:tmpl w:val="43EE76BE"/>
@@ -9424,7 +9708,7 @@
       </w:pPr>
     </w:lvl>
   </w:abstractNum>
-  <w:abstractNum w:abstractNumId="24" w15:restartNumberingAfterBreak="0">
+  <w:abstractNum w:abstractNumId="25" w15:restartNumberingAfterBreak="0">
     <w:nsid w:val="39BD38BF"/>
     <w:multiLevelType w:val="multilevel"/>
     <w:tmpl w:val="475E3D66"/>
@@ -9573,7 +9857,7 @@
       </w:rPr>
     </w:lvl>
   </w:abstractNum>
-  <w:abstractNum w:abstractNumId="25" w15:restartNumberingAfterBreak="0">
+  <w:abstractNum w:abstractNumId="26" w15:restartNumberingAfterBreak="0">
     <w:nsid w:val="3ED94EF2"/>
     <w:multiLevelType w:val="multilevel"/>
     <w:tmpl w:val="D9760BC2"/>
@@ -9722,7 +10006,96 @@
       </w:rPr>
     </w:lvl>
   </w:abstractNum>
-  <w:abstractNum w:abstractNumId="26" w15:restartNumberingAfterBreak="0">
+  <w:abstractNum w:abstractNumId="27" w15:restartNumberingAfterBreak="0">
+    <w:nsid w:val="3F153BEB"/>
+    <w:multiLevelType w:val="hybridMultilevel"/>
+    <w:tmpl w:val="775436DA"/>
+    <w:lvl w:ilvl="0" w:tplc="3224EB5A">
+      <w:start w:val="1"/>
+      <w:numFmt w:val="decimal"/>
+      <w:lvlText w:val="%1."/>
+      <w:lvlJc w:val="left"/>
+      <w:pPr>
+        <w:ind w:left="1080" w:hanging="360"/>
+      </w:pPr>
+      <w:rPr>
+        <w:rFonts w:hint="default"/>
+      </w:rPr>
+    </w:lvl>
+    <w:lvl w:ilvl="1" w:tplc="04090019" w:tentative="1">
+      <w:start w:val="1"/>
+      <w:numFmt w:val="lowerLetter"/>
+      <w:lvlText w:val="%2."/>
+      <w:lvlJc w:val="left"/>
+      <w:pPr>
+        <w:ind w:left="1800" w:hanging="360"/>
+      </w:pPr>
+    </w:lvl>
+    <w:lvl w:ilvl="2" w:tplc="0409001B" w:tentative="1">
+      <w:start w:val="1"/>
+      <w:numFmt w:val="lowerRoman"/>
+      <w:lvlText w:val="%3."/>
+      <w:lvlJc w:val="right"/>
+      <w:pPr>
+        <w:ind w:left="2520" w:hanging="180"/>
+      </w:pPr>
+    </w:lvl>
+    <w:lvl w:ilvl="3" w:tplc="0409000F" w:tentative="1">
+      <w:start w:val="1"/>
+      <w:numFmt w:val="decimal"/>
+      <w:lvlText w:val="%4."/>
+      <w:lvlJc w:val="left"/>
+      <w:pPr>
+        <w:ind w:left="3240" w:hanging="360"/>
+      </w:pPr>
+    </w:lvl>
+    <w:lvl w:ilvl="4" w:tplc="04090019" w:tentative="1">
+      <w:start w:val="1"/>
+      <w:numFmt w:val="lowerLetter"/>
+      <w:lvlText w:val="%5."/>
+      <w:lvlJc w:val="left"/>
+      <w:pPr>
+        <w:ind w:left="3960" w:hanging="360"/>
+      </w:pPr>
+    </w:lvl>
+    <w:lvl w:ilvl="5" w:tplc="0409001B" w:tentative="1">
+      <w:start w:val="1"/>
+      <w:numFmt w:val="lowerRoman"/>
+      <w:lvlText w:val="%6."/>
+      <w:lvlJc w:val="right"/>
+      <w:pPr>
+        <w:ind w:left="4680" w:hanging="180"/>
+      </w:pPr>
+    </w:lvl>
+    <w:lvl w:ilvl="6" w:tplc="0409000F" w:tentative="1">
+      <w:start w:val="1"/>
+      <w:numFmt w:val="decimal"/>
+      <w:lvlText w:val="%7."/>
+      <w:lvlJc w:val="left"/>
+      <w:pPr>
+        <w:ind w:left="5400" w:hanging="360"/>
+      </w:pPr>
+    </w:lvl>
+    <w:lvl w:ilvl="7" w:tplc="04090019" w:tentative="1">
+      <w:start w:val="1"/>
+      <w:numFmt w:val="lowerLetter"/>
+      <w:lvlText w:val="%8."/>
+      <w:lvlJc w:val="left"/>
+      <w:pPr>
+        <w:ind w:left="6120" w:hanging="360"/>
+      </w:pPr>
+    </w:lvl>
+    <w:lvl w:ilvl="8" w:tplc="0409001B" w:tentative="1">
+      <w:start w:val="1"/>
+      <w:numFmt w:val="lowerRoman"/>
+      <w:lvlText w:val="%9."/>
+      <w:lvlJc w:val="right"/>
+      <w:pPr>
+        <w:ind w:left="6840" w:hanging="180"/>
+      </w:pPr>
+    </w:lvl>
+  </w:abstractNum>
+  <w:abstractNum w:abstractNumId="28" w15:restartNumberingAfterBreak="0">
     <w:nsid w:val="3F17269E"/>
     <w:multiLevelType w:val="multilevel"/>
     <w:tmpl w:val="526671E8"/>
@@ -9871,7 +10244,7 @@
       </w:rPr>
     </w:lvl>
   </w:abstractNum>
-  <w:abstractNum w:abstractNumId="27" w15:restartNumberingAfterBreak="0">
+  <w:abstractNum w:abstractNumId="29" w15:restartNumberingAfterBreak="0">
     <w:nsid w:val="3FE73216"/>
     <w:multiLevelType w:val="multilevel"/>
     <w:tmpl w:val="53FE9602"/>
@@ -10020,7 +10393,7 @@
       </w:rPr>
     </w:lvl>
   </w:abstractNum>
-  <w:abstractNum w:abstractNumId="28" w15:restartNumberingAfterBreak="0">
+  <w:abstractNum w:abstractNumId="30" w15:restartNumberingAfterBreak="0">
     <w:nsid w:val="406651B2"/>
     <w:multiLevelType w:val="multilevel"/>
     <w:tmpl w:val="9CA01EF4"/>
@@ -10169,7 +10542,7 @@
       </w:rPr>
     </w:lvl>
   </w:abstractNum>
-  <w:abstractNum w:abstractNumId="29" w15:restartNumberingAfterBreak="0">
+  <w:abstractNum w:abstractNumId="31" w15:restartNumberingAfterBreak="0">
     <w:nsid w:val="410D5A20"/>
     <w:multiLevelType w:val="multilevel"/>
     <w:tmpl w:val="86C6F3D4"/>
@@ -10318,7 +10691,7 @@
       </w:rPr>
     </w:lvl>
   </w:abstractNum>
-  <w:abstractNum w:abstractNumId="30" w15:restartNumberingAfterBreak="0">
+  <w:abstractNum w:abstractNumId="32" w15:restartNumberingAfterBreak="0">
     <w:nsid w:val="43DD39BF"/>
     <w:multiLevelType w:val="multilevel"/>
     <w:tmpl w:val="29980B08"/>
@@ -10467,7 +10840,7 @@
       </w:rPr>
     </w:lvl>
   </w:abstractNum>
-  <w:abstractNum w:abstractNumId="31" w15:restartNumberingAfterBreak="0">
+  <w:abstractNum w:abstractNumId="33" w15:restartNumberingAfterBreak="0">
     <w:nsid w:val="44F356B4"/>
     <w:multiLevelType w:val="multilevel"/>
     <w:tmpl w:val="EF06727A"/>
@@ -10616,7 +10989,7 @@
       </w:rPr>
     </w:lvl>
   </w:abstractNum>
-  <w:abstractNum w:abstractNumId="32" w15:restartNumberingAfterBreak="0">
+  <w:abstractNum w:abstractNumId="34" w15:restartNumberingAfterBreak="0">
     <w:nsid w:val="463FB284"/>
     <w:multiLevelType w:val="hybridMultilevel"/>
     <w:tmpl w:val="A25C31EA"/>
@@ -10705,7 +11078,305 @@
       </w:pPr>
     </w:lvl>
   </w:abstractNum>
-  <w:abstractNum w:abstractNumId="33" w15:restartNumberingAfterBreak="0">
+  <w:abstractNum w:abstractNumId="35" w15:restartNumberingAfterBreak="0">
+    <w:nsid w:val="4A142B59"/>
+    <w:multiLevelType w:val="multilevel"/>
+    <w:tmpl w:val="0E70304C"/>
+    <w:lvl w:ilvl="0">
+      <w:start w:val="1"/>
+      <w:numFmt w:val="decimal"/>
+      <w:lvlText w:val="%1."/>
+      <w:lvlJc w:val="left"/>
+      <w:pPr>
+        <w:tabs>
+          <w:tab w:val="num" w:pos="720"/>
+        </w:tabs>
+        <w:ind w:left="720" w:hanging="360"/>
+      </w:pPr>
+      <w:rPr>
+        <w:rFonts w:hint="default"/>
+        <w:sz w:val="20"/>
+      </w:rPr>
+    </w:lvl>
+    <w:lvl w:ilvl="1" w:tentative="1">
+      <w:start w:val="1"/>
+      <w:numFmt w:val="bullet"/>
+      <w:lvlText w:val="o"/>
+      <w:lvlJc w:val="left"/>
+      <w:pPr>
+        <w:tabs>
+          <w:tab w:val="num" w:pos="1440"/>
+        </w:tabs>
+        <w:ind w:left="1440" w:hanging="360"/>
+      </w:pPr>
+      <w:rPr>
+        <w:rFonts w:ascii="Courier New" w:hAnsi="Courier New" w:hint="default"/>
+        <w:sz w:val="20"/>
+      </w:rPr>
+    </w:lvl>
+    <w:lvl w:ilvl="2" w:tentative="1">
+      <w:start w:val="1"/>
+      <w:numFmt w:val="bullet"/>
+      <w:lvlText w:val=""/>
+      <w:lvlJc w:val="left"/>
+      <w:pPr>
+        <w:tabs>
+          <w:tab w:val="num" w:pos="2160"/>
+        </w:tabs>
+        <w:ind w:left="2160" w:hanging="360"/>
+      </w:pPr>
+      <w:rPr>
+        <w:rFonts w:ascii="Wingdings" w:hAnsi="Wingdings" w:hint="default"/>
+        <w:sz w:val="20"/>
+      </w:rPr>
+    </w:lvl>
+    <w:lvl w:ilvl="3" w:tentative="1">
+      <w:start w:val="1"/>
+      <w:numFmt w:val="bullet"/>
+      <w:lvlText w:val=""/>
+      <w:lvlJc w:val="left"/>
+      <w:pPr>
+        <w:tabs>
+          <w:tab w:val="num" w:pos="2880"/>
+        </w:tabs>
+        <w:ind w:left="2880" w:hanging="360"/>
+      </w:pPr>
+      <w:rPr>
+        <w:rFonts w:ascii="Wingdings" w:hAnsi="Wingdings" w:hint="default"/>
+        <w:sz w:val="20"/>
+      </w:rPr>
+    </w:lvl>
+    <w:lvl w:ilvl="4" w:tentative="1">
+      <w:start w:val="1"/>
+      <w:numFmt w:val="bullet"/>
+      <w:lvlText w:val=""/>
+      <w:lvlJc w:val="left"/>
+      <w:pPr>
+        <w:tabs>
+          <w:tab w:val="num" w:pos="3600"/>
+        </w:tabs>
+        <w:ind w:left="3600" w:hanging="360"/>
+      </w:pPr>
+      <w:rPr>
+        <w:rFonts w:ascii="Wingdings" w:hAnsi="Wingdings" w:hint="default"/>
+        <w:sz w:val="20"/>
+      </w:rPr>
+    </w:lvl>
+    <w:lvl w:ilvl="5" w:tentative="1">
+      <w:start w:val="1"/>
+      <w:numFmt w:val="bullet"/>
+      <w:lvlText w:val=""/>
+      <w:lvlJc w:val="left"/>
+      <w:pPr>
+        <w:tabs>
+          <w:tab w:val="num" w:pos="4320"/>
+        </w:tabs>
+        <w:ind w:left="4320" w:hanging="360"/>
+      </w:pPr>
+      <w:rPr>
+        <w:rFonts w:ascii="Wingdings" w:hAnsi="Wingdings" w:hint="default"/>
+        <w:sz w:val="20"/>
+      </w:rPr>
+    </w:lvl>
+    <w:lvl w:ilvl="6" w:tentative="1">
+      <w:start w:val="1"/>
+      <w:numFmt w:val="bullet"/>
+      <w:lvlText w:val=""/>
+      <w:lvlJc w:val="left"/>
+      <w:pPr>
+        <w:tabs>
+          <w:tab w:val="num" w:pos="5040"/>
+        </w:tabs>
+        <w:ind w:left="5040" w:hanging="360"/>
+      </w:pPr>
+      <w:rPr>
+        <w:rFonts w:ascii="Wingdings" w:hAnsi="Wingdings" w:hint="default"/>
+        <w:sz w:val="20"/>
+      </w:rPr>
+    </w:lvl>
+    <w:lvl w:ilvl="7" w:tentative="1">
+      <w:start w:val="1"/>
+      <w:numFmt w:val="bullet"/>
+      <w:lvlText w:val=""/>
+      <w:lvlJc w:val="left"/>
+      <w:pPr>
+        <w:tabs>
+          <w:tab w:val="num" w:pos="5760"/>
+        </w:tabs>
+        <w:ind w:left="5760" w:hanging="360"/>
+      </w:pPr>
+      <w:rPr>
+        <w:rFonts w:ascii="Wingdings" w:hAnsi="Wingdings" w:hint="default"/>
+        <w:sz w:val="20"/>
+      </w:rPr>
+    </w:lvl>
+    <w:lvl w:ilvl="8" w:tentative="1">
+      <w:start w:val="1"/>
+      <w:numFmt w:val="bullet"/>
+      <w:lvlText w:val=""/>
+      <w:lvlJc w:val="left"/>
+      <w:pPr>
+        <w:tabs>
+          <w:tab w:val="num" w:pos="6480"/>
+        </w:tabs>
+        <w:ind w:left="6480" w:hanging="360"/>
+      </w:pPr>
+      <w:rPr>
+        <w:rFonts w:ascii="Wingdings" w:hAnsi="Wingdings" w:hint="default"/>
+        <w:sz w:val="20"/>
+      </w:rPr>
+    </w:lvl>
+  </w:abstractNum>
+  <w:abstractNum w:abstractNumId="36" w15:restartNumberingAfterBreak="0">
+    <w:nsid w:val="4D5D2794"/>
+    <w:multiLevelType w:val="multilevel"/>
+    <w:tmpl w:val="4574F41C"/>
+    <w:lvl w:ilvl="0">
+      <w:start w:val="1"/>
+      <w:numFmt w:val="decimal"/>
+      <w:lvlText w:val="%1."/>
+      <w:lvlJc w:val="left"/>
+      <w:pPr>
+        <w:tabs>
+          <w:tab w:val="num" w:pos="720"/>
+        </w:tabs>
+        <w:ind w:left="720" w:hanging="360"/>
+      </w:pPr>
+      <w:rPr>
+        <w:rFonts w:hint="default"/>
+        <w:sz w:val="20"/>
+      </w:rPr>
+    </w:lvl>
+    <w:lvl w:ilvl="1" w:tentative="1">
+      <w:start w:val="1"/>
+      <w:numFmt w:val="bullet"/>
+      <w:lvlText w:val="o"/>
+      <w:lvlJc w:val="left"/>
+      <w:pPr>
+        <w:tabs>
+          <w:tab w:val="num" w:pos="1440"/>
+        </w:tabs>
+        <w:ind w:left="1440" w:hanging="360"/>
+      </w:pPr>
+      <w:rPr>
+        <w:rFonts w:ascii="Courier New" w:hAnsi="Courier New" w:hint="default"/>
+        <w:sz w:val="20"/>
+      </w:rPr>
+    </w:lvl>
+    <w:lvl w:ilvl="2" w:tentative="1">
+      <w:start w:val="1"/>
+      <w:numFmt w:val="bullet"/>
+      <w:lvlText w:val=""/>
+      <w:lvlJc w:val="left"/>
+      <w:pPr>
+        <w:tabs>
+          <w:tab w:val="num" w:pos="2160"/>
+        </w:tabs>
+        <w:ind w:left="2160" w:hanging="360"/>
+      </w:pPr>
+      <w:rPr>
+        <w:rFonts w:ascii="Wingdings" w:hAnsi="Wingdings" w:hint="default"/>
+        <w:sz w:val="20"/>
+      </w:rPr>
+    </w:lvl>
+    <w:lvl w:ilvl="3" w:tentative="1">
+      <w:start w:val="1"/>
+      <w:numFmt w:val="bullet"/>
+      <w:lvlText w:val=""/>
+      <w:lvlJc w:val="left"/>
+      <w:pPr>
+        <w:tabs>
+          <w:tab w:val="num" w:pos="2880"/>
+        </w:tabs>
+        <w:ind w:left="2880" w:hanging="360"/>
+      </w:pPr>
+      <w:rPr>
+        <w:rFonts w:ascii="Wingdings" w:hAnsi="Wingdings" w:hint="default"/>
+        <w:sz w:val="20"/>
+      </w:rPr>
+    </w:lvl>
+    <w:lvl w:ilvl="4" w:tentative="1">
+      <w:start w:val="1"/>
+      <w:numFmt w:val="bullet"/>
+      <w:lvlText w:val=""/>
+      <w:lvlJc w:val="left"/>
+      <w:pPr>
+        <w:tabs>
+          <w:tab w:val="num" w:pos="3600"/>
+        </w:tabs>
+        <w:ind w:left="3600" w:hanging="360"/>
+      </w:pPr>
+      <w:rPr>
+        <w:rFonts w:ascii="Wingdings" w:hAnsi="Wingdings" w:hint="default"/>
+        <w:sz w:val="20"/>
+      </w:rPr>
+    </w:lvl>
+    <w:lvl w:ilvl="5" w:tentative="1">
+      <w:start w:val="1"/>
+      <w:numFmt w:val="bullet"/>
+      <w:lvlText w:val=""/>
+      <w:lvlJc w:val="left"/>
+      <w:pPr>
+        <w:tabs>
+          <w:tab w:val="num" w:pos="4320"/>
+        </w:tabs>
+        <w:ind w:left="4320" w:hanging="360"/>
+      </w:pPr>
+      <w:rPr>
+        <w:rFonts w:ascii="Wingdings" w:hAnsi="Wingdings" w:hint="default"/>
+        <w:sz w:val="20"/>
+      </w:rPr>
+    </w:lvl>
+    <w:lvl w:ilvl="6" w:tentative="1">
+      <w:start w:val="1"/>
+      <w:numFmt w:val="bullet"/>
+      <w:lvlText w:val=""/>
+      <w:lvlJc w:val="left"/>
+      <w:pPr>
+        <w:tabs>
+          <w:tab w:val="num" w:pos="5040"/>
+        </w:tabs>
+        <w:ind w:left="5040" w:hanging="360"/>
+      </w:pPr>
+      <w:rPr>
+        <w:rFonts w:ascii="Wingdings" w:hAnsi="Wingdings" w:hint="default"/>
+        <w:sz w:val="20"/>
+      </w:rPr>
+    </w:lvl>
+    <w:lvl w:ilvl="7" w:tentative="1">
+      <w:start w:val="1"/>
+      <w:numFmt w:val="bullet"/>
+      <w:lvlText w:val=""/>
+      <w:lvlJc w:val="left"/>
+      <w:pPr>
+        <w:tabs>
+          <w:tab w:val="num" w:pos="5760"/>
+        </w:tabs>
+        <w:ind w:left="5760" w:hanging="360"/>
+      </w:pPr>
+      <w:rPr>
+        <w:rFonts w:ascii="Wingdings" w:hAnsi="Wingdings" w:hint="default"/>
+        <w:sz w:val="20"/>
+      </w:rPr>
+    </w:lvl>
+    <w:lvl w:ilvl="8" w:tentative="1">
+      <w:start w:val="1"/>
+      <w:numFmt w:val="bullet"/>
+      <w:lvlText w:val=""/>
+      <w:lvlJc w:val="left"/>
+      <w:pPr>
+        <w:tabs>
+          <w:tab w:val="num" w:pos="6480"/>
+        </w:tabs>
+        <w:ind w:left="6480" w:hanging="360"/>
+      </w:pPr>
+      <w:rPr>
+        <w:rFonts w:ascii="Wingdings" w:hAnsi="Wingdings" w:hint="default"/>
+        <w:sz w:val="20"/>
+      </w:rPr>
+    </w:lvl>
+  </w:abstractNum>
+  <w:abstractNum w:abstractNumId="37" w15:restartNumberingAfterBreak="0">
     <w:nsid w:val="51032369"/>
     <w:multiLevelType w:val="multilevel"/>
     <w:tmpl w:val="562EA79A"/>
@@ -10854,7 +11525,7 @@
       </w:rPr>
     </w:lvl>
   </w:abstractNum>
-  <w:abstractNum w:abstractNumId="34" w15:restartNumberingAfterBreak="0">
+  <w:abstractNum w:abstractNumId="38" w15:restartNumberingAfterBreak="0">
     <w:nsid w:val="51B305CE"/>
     <w:multiLevelType w:val="multilevel"/>
     <w:tmpl w:val="9ACC0BC4"/>
@@ -11003,7 +11674,156 @@
       </w:rPr>
     </w:lvl>
   </w:abstractNum>
-  <w:abstractNum w:abstractNumId="35" w15:restartNumberingAfterBreak="0">
+  <w:abstractNum w:abstractNumId="39" w15:restartNumberingAfterBreak="0">
+    <w:nsid w:val="52026ACE"/>
+    <w:multiLevelType w:val="multilevel"/>
+    <w:tmpl w:val="E45E7D24"/>
+    <w:lvl w:ilvl="0">
+      <w:start w:val="1"/>
+      <w:numFmt w:val="decimal"/>
+      <w:lvlText w:val="%1."/>
+      <w:lvlJc w:val="left"/>
+      <w:pPr>
+        <w:tabs>
+          <w:tab w:val="num" w:pos="720"/>
+        </w:tabs>
+        <w:ind w:left="720" w:hanging="360"/>
+      </w:pPr>
+      <w:rPr>
+        <w:rFonts w:hint="default"/>
+        <w:sz w:val="20"/>
+      </w:rPr>
+    </w:lvl>
+    <w:lvl w:ilvl="1" w:tentative="1">
+      <w:start w:val="1"/>
+      <w:numFmt w:val="bullet"/>
+      <w:lvlText w:val="o"/>
+      <w:lvlJc w:val="left"/>
+      <w:pPr>
+        <w:tabs>
+          <w:tab w:val="num" w:pos="1440"/>
+        </w:tabs>
+        <w:ind w:left="1440" w:hanging="360"/>
+      </w:pPr>
+      <w:rPr>
+        <w:rFonts w:ascii="Courier New" w:hAnsi="Courier New" w:hint="default"/>
+        <w:sz w:val="20"/>
+      </w:rPr>
+    </w:lvl>
+    <w:lvl w:ilvl="2" w:tentative="1">
+      <w:start w:val="1"/>
+      <w:numFmt w:val="bullet"/>
+      <w:lvlText w:val=""/>
+      <w:lvlJc w:val="left"/>
+      <w:pPr>
+        <w:tabs>
+          <w:tab w:val="num" w:pos="2160"/>
+        </w:tabs>
+        <w:ind w:left="2160" w:hanging="360"/>
+      </w:pPr>
+      <w:rPr>
+        <w:rFonts w:ascii="Wingdings" w:hAnsi="Wingdings" w:hint="default"/>
+        <w:sz w:val="20"/>
+      </w:rPr>
+    </w:lvl>
+    <w:lvl w:ilvl="3" w:tentative="1">
+      <w:start w:val="1"/>
+      <w:numFmt w:val="bullet"/>
+      <w:lvlText w:val=""/>
+      <w:lvlJc w:val="left"/>
+      <w:pPr>
+        <w:tabs>
+          <w:tab w:val="num" w:pos="2880"/>
+        </w:tabs>
+        <w:ind w:left="2880" w:hanging="360"/>
+      </w:pPr>
+      <w:rPr>
+        <w:rFonts w:ascii="Wingdings" w:hAnsi="Wingdings" w:hint="default"/>
+        <w:sz w:val="20"/>
+      </w:rPr>
+    </w:lvl>
+    <w:lvl w:ilvl="4" w:tentative="1">
+      <w:start w:val="1"/>
+      <w:numFmt w:val="bullet"/>
+      <w:lvlText w:val=""/>
+      <w:lvlJc w:val="left"/>
+      <w:pPr>
+        <w:tabs>
+          <w:tab w:val="num" w:pos="3600"/>
+        </w:tabs>
+        <w:ind w:left="3600" w:hanging="360"/>
+      </w:pPr>
+      <w:rPr>
+        <w:rFonts w:ascii="Wingdings" w:hAnsi="Wingdings" w:hint="default"/>
+        <w:sz w:val="20"/>
+      </w:rPr>
+    </w:lvl>
+    <w:lvl w:ilvl="5" w:tentative="1">
+      <w:start w:val="1"/>
+      <w:numFmt w:val="bullet"/>
+      <w:lvlText w:val=""/>
+      <w:lvlJc w:val="left"/>
+      <w:pPr>
+        <w:tabs>
+          <w:tab w:val="num" w:pos="4320"/>
+        </w:tabs>
+        <w:ind w:left="4320" w:hanging="360"/>
+      </w:pPr>
+      <w:rPr>
+        <w:rFonts w:ascii="Wingdings" w:hAnsi="Wingdings" w:hint="default"/>
+        <w:sz w:val="20"/>
+      </w:rPr>
+    </w:lvl>
+    <w:lvl w:ilvl="6" w:tentative="1">
+      <w:start w:val="1"/>
+      <w:numFmt w:val="bullet"/>
+      <w:lvlText w:val=""/>
+      <w:lvlJc w:val="left"/>
+      <w:pPr>
+        <w:tabs>
+          <w:tab w:val="num" w:pos="5040"/>
+        </w:tabs>
+        <w:ind w:left="5040" w:hanging="360"/>
+      </w:pPr>
+      <w:rPr>
+        <w:rFonts w:ascii="Wingdings" w:hAnsi="Wingdings" w:hint="default"/>
+        <w:sz w:val="20"/>
+      </w:rPr>
+    </w:lvl>
+    <w:lvl w:ilvl="7" w:tentative="1">
+      <w:start w:val="1"/>
+      <w:numFmt w:val="bullet"/>
+      <w:lvlText w:val=""/>
+      <w:lvlJc w:val="left"/>
+      <w:pPr>
+        <w:tabs>
+          <w:tab w:val="num" w:pos="5760"/>
+        </w:tabs>
+        <w:ind w:left="5760" w:hanging="360"/>
+      </w:pPr>
+      <w:rPr>
+        <w:rFonts w:ascii="Wingdings" w:hAnsi="Wingdings" w:hint="default"/>
+        <w:sz w:val="20"/>
+      </w:rPr>
+    </w:lvl>
+    <w:lvl w:ilvl="8" w:tentative="1">
+      <w:start w:val="1"/>
+      <w:numFmt w:val="bullet"/>
+      <w:lvlText w:val=""/>
+      <w:lvlJc w:val="left"/>
+      <w:pPr>
+        <w:tabs>
+          <w:tab w:val="num" w:pos="6480"/>
+        </w:tabs>
+        <w:ind w:left="6480" w:hanging="360"/>
+      </w:pPr>
+      <w:rPr>
+        <w:rFonts w:ascii="Wingdings" w:hAnsi="Wingdings" w:hint="default"/>
+        <w:sz w:val="20"/>
+      </w:rPr>
+    </w:lvl>
+  </w:abstractNum>
+  <w:abstractNum w:abstractNumId="40" w15:restartNumberingAfterBreak="0">
     <w:nsid w:val="5293254C"/>
     <w:multiLevelType w:val="multilevel"/>
     <w:tmpl w:val="FD12623A"/>
@@ -11152,7 +11972,7 @@
       </w:rPr>
     </w:lvl>
   </w:abstractNum>
-  <w:abstractNum w:abstractNumId="36" w15:restartNumberingAfterBreak="0">
+  <w:abstractNum w:abstractNumId="41" w15:restartNumberingAfterBreak="0">
     <w:nsid w:val="558C416D"/>
     <w:multiLevelType w:val="hybridMultilevel"/>
     <w:tmpl w:val="8A1A9450"/>
@@ -11238,7 +12058,7 @@
       </w:pPr>
     </w:lvl>
   </w:abstractNum>
-  <w:abstractNum w:abstractNumId="37" w15:restartNumberingAfterBreak="0">
+  <w:abstractNum w:abstractNumId="42" w15:restartNumberingAfterBreak="0">
     <w:nsid w:val="56A0B343"/>
     <w:multiLevelType w:val="hybridMultilevel"/>
     <w:tmpl w:val="D7348D24"/>
@@ -11324,7 +12144,7 @@
       </w:pPr>
     </w:lvl>
   </w:abstractNum>
-  <w:abstractNum w:abstractNumId="38" w15:restartNumberingAfterBreak="0">
+  <w:abstractNum w:abstractNumId="43" w15:restartNumberingAfterBreak="0">
     <w:nsid w:val="57B876BF"/>
     <w:multiLevelType w:val="multilevel"/>
     <w:tmpl w:val="A678D4CE"/>
@@ -11473,7 +12293,7 @@
       </w:rPr>
     </w:lvl>
   </w:abstractNum>
-  <w:abstractNum w:abstractNumId="39" w15:restartNumberingAfterBreak="0">
+  <w:abstractNum w:abstractNumId="44" w15:restartNumberingAfterBreak="0">
     <w:nsid w:val="589C1050"/>
     <w:multiLevelType w:val="hybridMultilevel"/>
     <w:tmpl w:val="F488B1C4"/>
@@ -11586,7 +12406,7 @@
       </w:rPr>
     </w:lvl>
   </w:abstractNum>
-  <w:abstractNum w:abstractNumId="40" w15:restartNumberingAfterBreak="0">
+  <w:abstractNum w:abstractNumId="45" w15:restartNumberingAfterBreak="0">
     <w:nsid w:val="5977666B"/>
     <w:multiLevelType w:val="multilevel"/>
     <w:tmpl w:val="AC026804"/>
@@ -11735,7 +12555,7 @@
       </w:rPr>
     </w:lvl>
   </w:abstractNum>
-  <w:abstractNum w:abstractNumId="41" w15:restartNumberingAfterBreak="0">
+  <w:abstractNum w:abstractNumId="46" w15:restartNumberingAfterBreak="0">
     <w:nsid w:val="5A74648D"/>
     <w:multiLevelType w:val="multilevel"/>
     <w:tmpl w:val="9916680A"/>
@@ -11884,7 +12704,96 @@
       </w:rPr>
     </w:lvl>
   </w:abstractNum>
-  <w:abstractNum w:abstractNumId="42" w15:restartNumberingAfterBreak="0">
+  <w:abstractNum w:abstractNumId="47" w15:restartNumberingAfterBreak="0">
+    <w:nsid w:val="5AC7533C"/>
+    <w:multiLevelType w:val="hybridMultilevel"/>
+    <w:tmpl w:val="60F6577E"/>
+    <w:lvl w:ilvl="0" w:tplc="0409000F">
+      <w:start w:val="1"/>
+      <w:numFmt w:val="decimal"/>
+      <w:lvlText w:val="%1."/>
+      <w:lvlJc w:val="left"/>
+      <w:pPr>
+        <w:ind w:left="720" w:hanging="360"/>
+      </w:pPr>
+      <w:rPr>
+        <w:rFonts w:hint="default"/>
+      </w:rPr>
+    </w:lvl>
+    <w:lvl w:ilvl="1" w:tplc="04090019">
+      <w:start w:val="1"/>
+      <w:numFmt w:val="lowerLetter"/>
+      <w:lvlText w:val="%2."/>
+      <w:lvlJc w:val="left"/>
+      <w:pPr>
+        <w:ind w:left="1440" w:hanging="360"/>
+      </w:pPr>
+    </w:lvl>
+    <w:lvl w:ilvl="2" w:tplc="0409001B">
+      <w:start w:val="1"/>
+      <w:numFmt w:val="lowerRoman"/>
+      <w:lvlText w:val="%3."/>
+      <w:lvlJc w:val="right"/>
+      <w:pPr>
+        <w:ind w:left="2160" w:hanging="180"/>
+      </w:pPr>
+    </w:lvl>
+    <w:lvl w:ilvl="3" w:tplc="0409000F" w:tentative="1">
+      <w:start w:val="1"/>
+      <w:numFmt w:val="decimal"/>
+      <w:lvlText w:val="%4."/>
+      <w:lvlJc w:val="left"/>
+      <w:pPr>
+        <w:ind w:left="2880" w:hanging="360"/>
+      </w:pPr>
+    </w:lvl>
+    <w:lvl w:ilvl="4" w:tplc="04090019" w:tentative="1">
+      <w:start w:val="1"/>
+      <w:numFmt w:val="lowerLetter"/>
+      <w:lvlText w:val="%5."/>
+      <w:lvlJc w:val="left"/>
+      <w:pPr>
+        <w:ind w:left="3600" w:hanging="360"/>
+      </w:pPr>
+    </w:lvl>
+    <w:lvl w:ilvl="5" w:tplc="0409001B" w:tentative="1">
+      <w:start w:val="1"/>
+      <w:numFmt w:val="lowerRoman"/>
+      <w:lvlText w:val="%6."/>
+      <w:lvlJc w:val="right"/>
+      <w:pPr>
+        <w:ind w:left="4320" w:hanging="180"/>
+      </w:pPr>
+    </w:lvl>
+    <w:lvl w:ilvl="6" w:tplc="0409000F" w:tentative="1">
+      <w:start w:val="1"/>
+      <w:numFmt w:val="decimal"/>
+      <w:lvlText w:val="%7."/>
+      <w:lvlJc w:val="left"/>
+      <w:pPr>
+        <w:ind w:left="5040" w:hanging="360"/>
+      </w:pPr>
+    </w:lvl>
+    <w:lvl w:ilvl="7" w:tplc="04090019" w:tentative="1">
+      <w:start w:val="1"/>
+      <w:numFmt w:val="lowerLetter"/>
+      <w:lvlText w:val="%8."/>
+      <w:lvlJc w:val="left"/>
+      <w:pPr>
+        <w:ind w:left="5760" w:hanging="360"/>
+      </w:pPr>
+    </w:lvl>
+    <w:lvl w:ilvl="8" w:tplc="0409001B" w:tentative="1">
+      <w:start w:val="1"/>
+      <w:numFmt w:val="lowerRoman"/>
+      <w:lvlText w:val="%9."/>
+      <w:lvlJc w:val="right"/>
+      <w:pPr>
+        <w:ind w:left="6480" w:hanging="180"/>
+      </w:pPr>
+    </w:lvl>
+  </w:abstractNum>
+  <w:abstractNum w:abstractNumId="48" w15:restartNumberingAfterBreak="0">
     <w:nsid w:val="5C248C1E"/>
     <w:multiLevelType w:val="hybridMultilevel"/>
     <w:tmpl w:val="CE8AFB58"/>
@@ -11970,7 +12879,7 @@
       </w:pPr>
     </w:lvl>
   </w:abstractNum>
-  <w:abstractNum w:abstractNumId="43" w15:restartNumberingAfterBreak="0">
+  <w:abstractNum w:abstractNumId="49" w15:restartNumberingAfterBreak="0">
     <w:nsid w:val="5E67A39C"/>
     <w:multiLevelType w:val="hybridMultilevel"/>
     <w:tmpl w:val="C4407572"/>
@@ -12083,7 +12992,7 @@
       </w:rPr>
     </w:lvl>
   </w:abstractNum>
-  <w:abstractNum w:abstractNumId="44" w15:restartNumberingAfterBreak="0">
+  <w:abstractNum w:abstractNumId="50" w15:restartNumberingAfterBreak="0">
     <w:nsid w:val="62B0364C"/>
     <w:multiLevelType w:val="hybridMultilevel"/>
     <w:tmpl w:val="C9D8F948"/>
@@ -12196,7 +13105,7 @@
       </w:rPr>
     </w:lvl>
   </w:abstractNum>
-  <w:abstractNum w:abstractNumId="45" w15:restartNumberingAfterBreak="0">
+  <w:abstractNum w:abstractNumId="51" w15:restartNumberingAfterBreak="0">
     <w:nsid w:val="636B5038"/>
     <w:multiLevelType w:val="multilevel"/>
     <w:tmpl w:val="57BACBAA"/>
@@ -12309,7 +13218,7 @@
       </w:pPr>
     </w:lvl>
   </w:abstractNum>
-  <w:abstractNum w:abstractNumId="46" w15:restartNumberingAfterBreak="0">
+  <w:abstractNum w:abstractNumId="52" w15:restartNumberingAfterBreak="0">
     <w:nsid w:val="65860B0E"/>
     <w:multiLevelType w:val="multilevel"/>
     <w:tmpl w:val="71B80B58"/>
@@ -12458,7 +13367,7 @@
       </w:rPr>
     </w:lvl>
   </w:abstractNum>
-  <w:abstractNum w:abstractNumId="47" w15:restartNumberingAfterBreak="0">
+  <w:abstractNum w:abstractNumId="53" w15:restartNumberingAfterBreak="0">
     <w:nsid w:val="697E6624"/>
     <w:multiLevelType w:val="multilevel"/>
     <w:tmpl w:val="5EC06994"/>
@@ -12607,7 +13516,7 @@
       </w:rPr>
     </w:lvl>
   </w:abstractNum>
-  <w:abstractNum w:abstractNumId="48" w15:restartNumberingAfterBreak="0">
+  <w:abstractNum w:abstractNumId="54" w15:restartNumberingAfterBreak="0">
     <w:nsid w:val="6AAB5DDD"/>
     <w:multiLevelType w:val="multilevel"/>
     <w:tmpl w:val="4CEA439C"/>
@@ -12757,7 +13666,7 @@
       </w:rPr>
     </w:lvl>
   </w:abstractNum>
-  <w:abstractNum w:abstractNumId="49" w15:restartNumberingAfterBreak="0">
+  <w:abstractNum w:abstractNumId="55" w15:restartNumberingAfterBreak="0">
     <w:nsid w:val="6EC01A2D"/>
     <w:multiLevelType w:val="multilevel"/>
     <w:tmpl w:val="D640D5A4"/>
@@ -12906,7 +13815,7 @@
       </w:rPr>
     </w:lvl>
   </w:abstractNum>
-  <w:abstractNum w:abstractNumId="50" w15:restartNumberingAfterBreak="0">
+  <w:abstractNum w:abstractNumId="56" w15:restartNumberingAfterBreak="0">
     <w:nsid w:val="6EE055C8"/>
     <w:multiLevelType w:val="multilevel"/>
     <w:tmpl w:val="5470AC9C"/>
@@ -13055,7 +13964,7 @@
       </w:rPr>
     </w:lvl>
   </w:abstractNum>
-  <w:abstractNum w:abstractNumId="51" w15:restartNumberingAfterBreak="0">
+  <w:abstractNum w:abstractNumId="57" w15:restartNumberingAfterBreak="0">
     <w:nsid w:val="70AF2B73"/>
     <w:multiLevelType w:val="multilevel"/>
     <w:tmpl w:val="4306C818"/>
@@ -13204,7 +14113,7 @@
       </w:rPr>
     </w:lvl>
   </w:abstractNum>
-  <w:abstractNum w:abstractNumId="52" w15:restartNumberingAfterBreak="0">
+  <w:abstractNum w:abstractNumId="58" w15:restartNumberingAfterBreak="0">
     <w:nsid w:val="750D566F"/>
     <w:multiLevelType w:val="multilevel"/>
     <w:tmpl w:val="44E0D92E"/>
@@ -13353,7 +14262,7 @@
       </w:rPr>
     </w:lvl>
   </w:abstractNum>
-  <w:abstractNum w:abstractNumId="53" w15:restartNumberingAfterBreak="0">
+  <w:abstractNum w:abstractNumId="59" w15:restartNumberingAfterBreak="0">
     <w:nsid w:val="78AD4989"/>
     <w:multiLevelType w:val="multilevel"/>
     <w:tmpl w:val="82B612B2"/>
@@ -13502,7 +14411,7 @@
       </w:rPr>
     </w:lvl>
   </w:abstractNum>
-  <w:abstractNum w:abstractNumId="54" w15:restartNumberingAfterBreak="0">
+  <w:abstractNum w:abstractNumId="60" w15:restartNumberingAfterBreak="0">
     <w:nsid w:val="79C40D65"/>
     <w:multiLevelType w:val="hybridMultilevel"/>
     <w:tmpl w:val="AE7AEEF4"/>
@@ -13588,7 +14497,7 @@
       </w:pPr>
     </w:lvl>
   </w:abstractNum>
-  <w:abstractNum w:abstractNumId="55" w15:restartNumberingAfterBreak="0">
+  <w:abstractNum w:abstractNumId="61" w15:restartNumberingAfterBreak="0">
     <w:nsid w:val="7E815FE7"/>
     <w:multiLevelType w:val="multilevel"/>
     <w:tmpl w:val="CEE4AE80"/>
@@ -13737,7 +14646,7 @@
       </w:rPr>
     </w:lvl>
   </w:abstractNum>
-  <w:abstractNum w:abstractNumId="56" w15:restartNumberingAfterBreak="0">
+  <w:abstractNum w:abstractNumId="62" w15:restartNumberingAfterBreak="0">
     <w:nsid w:val="7F48440D"/>
     <w:multiLevelType w:val="multilevel"/>
     <w:tmpl w:val="B5BC9562"/>
@@ -13887,22 +14796,22 @@
     </w:lvl>
   </w:abstractNum>
   <w:num w:numId="1" w16cid:durableId="1822892785">
-    <w:abstractNumId w:val="36"/>
+    <w:abstractNumId w:val="41"/>
   </w:num>
   <w:num w:numId="2" w16cid:durableId="1814525139">
-    <w:abstractNumId w:val="20"/>
+    <w:abstractNumId w:val="21"/>
   </w:num>
   <w:num w:numId="3" w16cid:durableId="516047140">
-    <w:abstractNumId w:val="23"/>
+    <w:abstractNumId w:val="24"/>
   </w:num>
   <w:num w:numId="4" w16cid:durableId="665133332">
-    <w:abstractNumId w:val="32"/>
+    <w:abstractNumId w:val="34"/>
   </w:num>
   <w:num w:numId="5" w16cid:durableId="2066486569">
-    <w:abstractNumId w:val="18"/>
+    <w:abstractNumId w:val="19"/>
   </w:num>
   <w:num w:numId="6" w16cid:durableId="947590974">
-    <w:abstractNumId w:val="22"/>
+    <w:abstractNumId w:val="23"/>
   </w:num>
   <w:num w:numId="7" w16cid:durableId="1413970514">
     <w:abstractNumId w:val="9"/>
@@ -13911,25 +14820,25 @@
     <w:abstractNumId w:val="15"/>
   </w:num>
   <w:num w:numId="9" w16cid:durableId="139808521">
-    <w:abstractNumId w:val="37"/>
+    <w:abstractNumId w:val="42"/>
   </w:num>
   <w:num w:numId="10" w16cid:durableId="872958811">
-    <w:abstractNumId w:val="42"/>
+    <w:abstractNumId w:val="48"/>
   </w:num>
   <w:num w:numId="11" w16cid:durableId="271132188">
-    <w:abstractNumId w:val="54"/>
+    <w:abstractNumId w:val="60"/>
   </w:num>
   <w:num w:numId="12" w16cid:durableId="1460492444">
-    <w:abstractNumId w:val="39"/>
+    <w:abstractNumId w:val="44"/>
   </w:num>
   <w:num w:numId="13" w16cid:durableId="1110858751">
-    <w:abstractNumId w:val="43"/>
+    <w:abstractNumId w:val="49"/>
   </w:num>
   <w:num w:numId="14" w16cid:durableId="636374392">
-    <w:abstractNumId w:val="44"/>
+    <w:abstractNumId w:val="50"/>
   </w:num>
   <w:num w:numId="15" w16cid:durableId="113134803">
-    <w:abstractNumId w:val="48"/>
+    <w:abstractNumId w:val="54"/>
   </w:num>
   <w:num w:numId="16" w16cid:durableId="1780562213">
     <w:abstractNumId w:val="4"/>
@@ -13941,22 +14850,22 @@
     <w:abstractNumId w:val="3"/>
   </w:num>
   <w:num w:numId="19" w16cid:durableId="1461414331">
-    <w:abstractNumId w:val="46"/>
+    <w:abstractNumId w:val="52"/>
   </w:num>
   <w:num w:numId="20" w16cid:durableId="1423644515">
-    <w:abstractNumId w:val="47"/>
+    <w:abstractNumId w:val="53"/>
   </w:num>
   <w:num w:numId="21" w16cid:durableId="647981484">
-    <w:abstractNumId w:val="50"/>
+    <w:abstractNumId w:val="56"/>
   </w:num>
   <w:num w:numId="22" w16cid:durableId="515773890">
-    <w:abstractNumId w:val="27"/>
+    <w:abstractNumId w:val="29"/>
   </w:num>
   <w:num w:numId="23" w16cid:durableId="863641273">
-    <w:abstractNumId w:val="38"/>
+    <w:abstractNumId w:val="43"/>
   </w:num>
   <w:num w:numId="24" w16cid:durableId="730613728">
-    <w:abstractNumId w:val="33"/>
+    <w:abstractNumId w:val="37"/>
   </w:num>
   <w:num w:numId="25" w16cid:durableId="886719058">
     <w:abstractNumId w:val="16"/>
@@ -13968,25 +14877,25 @@
     <w:abstractNumId w:val="1"/>
   </w:num>
   <w:num w:numId="28" w16cid:durableId="117769347">
-    <w:abstractNumId w:val="19"/>
+    <w:abstractNumId w:val="20"/>
   </w:num>
   <w:num w:numId="29" w16cid:durableId="343436975">
-    <w:abstractNumId w:val="31"/>
+    <w:abstractNumId w:val="33"/>
   </w:num>
   <w:num w:numId="30" w16cid:durableId="1424762989">
-    <w:abstractNumId w:val="49"/>
+    <w:abstractNumId w:val="55"/>
   </w:num>
   <w:num w:numId="31" w16cid:durableId="275136404">
     <w:abstractNumId w:val="12"/>
   </w:num>
   <w:num w:numId="32" w16cid:durableId="1957061484">
-    <w:abstractNumId w:val="28"/>
+    <w:abstractNumId w:val="30"/>
   </w:num>
   <w:num w:numId="33" w16cid:durableId="1575432985">
-    <w:abstractNumId w:val="51"/>
+    <w:abstractNumId w:val="57"/>
   </w:num>
   <w:num w:numId="34" w16cid:durableId="1363557376">
-    <w:abstractNumId w:val="53"/>
+    <w:abstractNumId w:val="59"/>
   </w:num>
   <w:num w:numId="35" w16cid:durableId="1638339705">
     <w:abstractNumId w:val="14"/>
@@ -13995,66 +14904,84 @@
     <w:abstractNumId w:val="11"/>
   </w:num>
   <w:num w:numId="37" w16cid:durableId="1622809468">
-    <w:abstractNumId w:val="45"/>
+    <w:abstractNumId w:val="51"/>
   </w:num>
   <w:num w:numId="38" w16cid:durableId="879897924">
     <w:abstractNumId w:val="7"/>
   </w:num>
   <w:num w:numId="39" w16cid:durableId="2125074677">
-    <w:abstractNumId w:val="24"/>
+    <w:abstractNumId w:val="25"/>
   </w:num>
   <w:num w:numId="40" w16cid:durableId="738021629">
-    <w:abstractNumId w:val="25"/>
+    <w:abstractNumId w:val="26"/>
   </w:num>
   <w:num w:numId="41" w16cid:durableId="1051265878">
-    <w:abstractNumId w:val="30"/>
+    <w:abstractNumId w:val="32"/>
   </w:num>
   <w:num w:numId="42" w16cid:durableId="1630359803">
-    <w:abstractNumId w:val="17"/>
+    <w:abstractNumId w:val="18"/>
   </w:num>
   <w:num w:numId="43" w16cid:durableId="1234048302">
     <w:abstractNumId w:val="2"/>
   </w:num>
   <w:num w:numId="44" w16cid:durableId="2028436058">
-    <w:abstractNumId w:val="21"/>
+    <w:abstractNumId w:val="22"/>
   </w:num>
   <w:num w:numId="45" w16cid:durableId="257643694">
     <w:abstractNumId w:val="13"/>
   </w:num>
   <w:num w:numId="46" w16cid:durableId="1881744389">
-    <w:abstractNumId w:val="41"/>
+    <w:abstractNumId w:val="46"/>
   </w:num>
   <w:num w:numId="47" w16cid:durableId="1233472117">
     <w:abstractNumId w:val="5"/>
   </w:num>
   <w:num w:numId="48" w16cid:durableId="813985041">
-    <w:abstractNumId w:val="26"/>
+    <w:abstractNumId w:val="28"/>
   </w:num>
   <w:num w:numId="49" w16cid:durableId="702828686">
-    <w:abstractNumId w:val="56"/>
+    <w:abstractNumId w:val="62"/>
   </w:num>
   <w:num w:numId="50" w16cid:durableId="1542399132">
     <w:abstractNumId w:val="10"/>
   </w:num>
   <w:num w:numId="51" w16cid:durableId="1574655919">
-    <w:abstractNumId w:val="29"/>
+    <w:abstractNumId w:val="31"/>
   </w:num>
   <w:num w:numId="52" w16cid:durableId="376247629">
     <w:abstractNumId w:val="6"/>
   </w:num>
   <w:num w:numId="53" w16cid:durableId="1300841452">
-    <w:abstractNumId w:val="34"/>
+    <w:abstractNumId w:val="38"/>
   </w:num>
   <w:num w:numId="54" w16cid:durableId="1023704020">
-    <w:abstractNumId w:val="52"/>
+    <w:abstractNumId w:val="58"/>
   </w:num>
   <w:num w:numId="55" w16cid:durableId="1820146759">
+    <w:abstractNumId w:val="45"/>
+  </w:num>
+  <w:num w:numId="56" w16cid:durableId="2001616775">
+    <w:abstractNumId w:val="61"/>
+  </w:num>
+  <w:num w:numId="57" w16cid:durableId="1418285265">
     <w:abstractNumId w:val="40"/>
   </w:num>
-  <w:num w:numId="56" w16cid:durableId="2001616775">
-    <w:abstractNumId w:val="55"/>
+  <w:num w:numId="58" w16cid:durableId="1453356043">
+    <w:abstractNumId w:val="27"/>
   </w:num>
-  <w:num w:numId="57" w16cid:durableId="1418285265">
+  <w:num w:numId="59" w16cid:durableId="971668183">
+    <w:abstractNumId w:val="47"/>
+  </w:num>
+  <w:num w:numId="60" w16cid:durableId="35735469">
+    <w:abstractNumId w:val="17"/>
+  </w:num>
+  <w:num w:numId="61" w16cid:durableId="891766441">
+    <w:abstractNumId w:val="39"/>
+  </w:num>
+  <w:num w:numId="62" w16cid:durableId="77677232">
+    <w:abstractNumId w:val="36"/>
+  </w:num>
+  <w:num w:numId="63" w16cid:durableId="872235455">
     <w:abstractNumId w:val="35"/>
   </w:num>
 </w:numbering>

</xml_diff>

<commit_message>
Added more to the Rulebook
</commit_message>
<xml_diff>
--- a/Rulebook.docx
+++ b/Rulebook.docx
@@ -3152,13 +3152,13 @@
         <w:pStyle w:val="Heading1"/>
       </w:pPr>
       <w:r>
+        <w:rPr/>
         <w:t xml:space="preserve">7. </w:t>
       </w:r>
-      <w:proofErr w:type="spellStart"/>
-      <w:r>
-        <w:t>Subsytems</w:t>
-      </w:r>
-      <w:proofErr w:type="spellEnd"/>
+      <w:r>
+        <w:rPr/>
+        <w:t>Subsystems</w:t>
+      </w:r>
     </w:p>
     <w:p>
       <w:pPr>
@@ -5623,8 +5623,100 @@
         <w:pStyle w:val="Heading2"/>
       </w:pPr>
       <w:r>
+        <w:rPr/>
         <w:t>7.5. Player Trades</w:t>
       </w:r>
+    </w:p>
+    <w:p/>
+    <w:p>
+      <w:r>
+        <w:rPr/>
+        <w:t>Players may trade Coins or Commodities freely at any time during the game, regardless of whose turn it is. To trade non</w:t>
+      </w:r>
+      <w:r>
+        <w:noBreakHyphen/>
+      </w:r>
+      <w:r>
+        <w:rPr/>
+        <w:t>liquid assets (cards, Leaders, Investments, etc.):</w:t>
+      </w:r>
+    </w:p>
+    <w:p>
+      <w:pPr>
+        <w:numPr>
+          <w:ilvl w:val="0"/>
+          <w:numId w:val="47"/>
+        </w:numPr>
+        <w:rPr/>
+      </w:pPr>
+      <w:r>
+        <w:rPr/>
+        <w:t xml:space="preserve">Both players must exchange </w:t>
+      </w:r>
+      <w:r>
+        <w:rPr>
+          <w:b w:val="1"/>
+          <w:bCs w:val="1"/>
+        </w:rPr>
+        <w:t>one Alliance Token</w:t>
+      </w:r>
+      <w:r>
+        <w:rPr/>
+        <w:t>.</w:t>
+      </w:r>
+    </w:p>
+    <w:p>
+      <w:pPr>
+        <w:numPr>
+          <w:ilvl w:val="0"/>
+          <w:numId w:val="47"/>
+        </w:numPr>
+        <w:rPr/>
+      </w:pPr>
+      <w:r>
+        <w:rPr/>
+        <w:t xml:space="preserve">Each token is worth </w:t>
+      </w:r>
+      <w:r>
+        <w:rPr>
+          <w:b w:val="1"/>
+          <w:bCs w:val="1"/>
+        </w:rPr>
+        <w:t>1 Honor</w:t>
+      </w:r>
+      <w:r>
+        <w:rPr/>
+        <w:t xml:space="preserve"> at game end.</w:t>
+      </w:r>
+    </w:p>
+    <w:p>
+      <w:pPr>
+        <w:numPr>
+          <w:ilvl w:val="0"/>
+          <w:numId w:val="47"/>
+        </w:numPr>
+        <w:rPr/>
+      </w:pPr>
+      <w:r>
+        <w:rPr/>
+        <w:t xml:space="preserve">Alliances are bilateral and formed only through </w:t>
+      </w:r>
+      <w:r>
+        <w:rPr>
+          <w:b w:val="1"/>
+          <w:bCs w:val="1"/>
+        </w:rPr>
+        <w:t>Negotiate</w:t>
+      </w:r>
+      <w:r>
+        <w:rPr/>
+        <w:t>.</w:t>
+      </w:r>
+    </w:p>
+    <w:p>
+      <w:pPr>
+        <w:pStyle w:val="Normal"/>
+      </w:pPr>
     </w:p>
     <w:p>
       <w:pPr>
@@ -5697,89 +5789,10 @@
       </w:pPr>
       <w:r>
         <w:rPr>
-          <w:b/>
-          <w:bCs/>
+          <w:b w:val="1"/>
+          <w:bCs w:val="1"/>
         </w:rPr>
         <w:t>11. Diplomacy and Alliances</w:t>
-      </w:r>
-    </w:p>
-    <w:p>
-      <w:r>
-        <w:t>Players may trade Coins or Commodities freely at any time.</w:t>
-      </w:r>
-    </w:p>
-    <w:p>
-      <w:r>
-        <w:t>To trade non</w:t>
-      </w:r>
-      <w:r>
-        <w:noBreakHyphen/>
-      </w:r>
-      <w:r>
-        <w:t>liquid assets (cards, Leaders, Investments, etc.):</w:t>
-      </w:r>
-    </w:p>
-    <w:p>
-      <w:pPr>
-        <w:numPr>
-          <w:ilvl w:val="0"/>
-          <w:numId w:val="47"/>
-        </w:numPr>
-      </w:pPr>
-      <w:r>
-        <w:t xml:space="preserve">Both players must exchange </w:t>
-      </w:r>
-      <w:r>
-        <w:rPr>
-          <w:b/>
-          <w:bCs/>
-        </w:rPr>
-        <w:t>one Alliance Token</w:t>
-      </w:r>
-      <w:r>
-        <w:t>.</w:t>
-      </w:r>
-    </w:p>
-    <w:p>
-      <w:pPr>
-        <w:numPr>
-          <w:ilvl w:val="0"/>
-          <w:numId w:val="47"/>
-        </w:numPr>
-      </w:pPr>
-      <w:r>
-        <w:t xml:space="preserve">Each token is worth </w:t>
-      </w:r>
-      <w:r>
-        <w:rPr>
-          <w:b/>
-          <w:bCs/>
-        </w:rPr>
-        <w:t>1 Honor</w:t>
-      </w:r>
-      <w:r>
-        <w:t xml:space="preserve"> at game end.</w:t>
-      </w:r>
-    </w:p>
-    <w:p>
-      <w:pPr>
-        <w:numPr>
-          <w:ilvl w:val="0"/>
-          <w:numId w:val="47"/>
-        </w:numPr>
-      </w:pPr>
-      <w:r>
-        <w:t xml:space="preserve">Alliances are bilateral and formed only through </w:t>
-      </w:r>
-      <w:r>
-        <w:rPr>
-          <w:b/>
-          <w:bCs/>
-        </w:rPr>
-        <w:t>Negotiate</w:t>
-      </w:r>
-      <w:r>
-        <w:t>.</w:t>
       </w:r>
     </w:p>
     <w:p>

</xml_diff>

<commit_message>
Added rules for choosing initial Edict during setup
</commit_message>
<xml_diff>
--- a/Rulebook.docx
+++ b/Rulebook.docx
@@ -853,26 +853,69 @@
     <w:p>
       <w:pPr>
         <w:pStyle w:val="ListParagraph"/>
-      </w:pPr>
-      <w:r>
-        <w:t>Roll the Market Rate Die</w:t>
-      </w:r>
-      <w:r>
-        <w:t xml:space="preserve"> and place it on the corresponding space, next to the Royal Bank</w:t>
-      </w:r>
-      <w:r>
-        <w:t>.</w:t>
-      </w:r>
-    </w:p>
-    <w:p>
-      <w:pPr>
-        <w:pStyle w:val="ListParagraph"/>
         <w:numPr>
           <w:ilvl w:val="0"/>
           <w:numId w:val="12"/>
         </w:numPr>
       </w:pPr>
       <w:r>
+        <w:t>Roll the Market Rate Die</w:t>
+      </w:r>
+      <w:r>
+        <w:t xml:space="preserve"> and place it on the corresponding space, next to the Royal Bank</w:t>
+      </w:r>
+      <w:r>
+        <w:t>.</w:t>
+      </w:r>
+    </w:p>
+    <w:p>
+      <w:pPr>
+        <w:pStyle w:val="ListParagraph"/>
+        <w:numPr>
+          <w:ilvl w:val="0"/>
+          <w:numId w:val="12"/>
+        </w:numPr>
+      </w:pPr>
+      <w:r>
+        <w:t>Reveal 3 random Law cards to the table</w:t>
+      </w:r>
+      <w:r>
+        <w:t>.</w:t>
+      </w:r>
+      <w:r>
+        <w:t xml:space="preserve"> </w:t>
+      </w:r>
+      <w:r>
+        <w:t>C</w:t>
+      </w:r>
+      <w:r>
+        <w:t>ollectively choose one to be</w:t>
+      </w:r>
+      <w:r>
+        <w:t>come an Edict</w:t>
+      </w:r>
+      <w:r>
+        <w:t xml:space="preserve"> and discard the other two</w:t>
+      </w:r>
+      <w:r>
+        <w:t xml:space="preserve">. Once chosen, roll a non-player die to determine the </w:t>
+      </w:r>
+      <w:r>
+        <w:t xml:space="preserve">Threshold of the Edict. This </w:t>
+      </w:r>
+      <w:r>
+        <w:t>represents the historical Edict inherited from the previous generation of rulers of the Empire.</w:t>
+      </w:r>
+    </w:p>
+    <w:p>
+      <w:pPr>
+        <w:pStyle w:val="ListParagraph"/>
+        <w:numPr>
+          <w:ilvl w:val="0"/>
+          <w:numId w:val="12"/>
+        </w:numPr>
+      </w:pPr>
+      <w:r>
         <w:t>Draft Investments</w:t>
       </w:r>
       <w:r>
@@ -897,27 +940,19 @@
     <w:p>
       <w:pPr>
         <w:pStyle w:val="ListParagraph"/>
-      </w:pPr>
-      <w:r>
-        <w:t xml:space="preserve">Each Player plays 1 Investment from their hand </w:t>
-      </w:r>
-      <w:r>
-        <w:t xml:space="preserve">faceup </w:t>
-      </w:r>
-      <w:r>
-        <w:t>to the table in front of their screen.</w:t>
-      </w:r>
-    </w:p>
-    <w:p>
-      <w:pPr>
-        <w:pStyle w:val="ListParagraph"/>
         <w:numPr>
           <w:ilvl w:val="1"/>
           <w:numId w:val="12"/>
         </w:numPr>
       </w:pPr>
       <w:r>
-        <w:t>Each Player passes the rest of their hand to the player on their left.</w:t>
+        <w:t xml:space="preserve">Each Player plays 1 Investment from their hand </w:t>
+      </w:r>
+      <w:r>
+        <w:t xml:space="preserve">faceup </w:t>
+      </w:r>
+      <w:r>
+        <w:t>to the table in front of their screen.</w:t>
       </w:r>
     </w:p>
     <w:p>
@@ -929,7 +964,7 @@
         </w:numPr>
       </w:pPr>
       <w:r>
-        <w:t>Repeat Steps 2 and 3 until all Players have exactly 4 Investments. Discard any remaining Investments.</w:t>
+        <w:t>Each Player passes the rest of their hand to the player on their left.</w:t>
       </w:r>
     </w:p>
     <w:p>
@@ -941,7 +976,7 @@
         </w:numPr>
       </w:pPr>
       <w:r>
-        <w:t>Each Player takes one die per Investment and distributes 8 levels between their four Investments. The sum of the Investment levels must be 8.</w:t>
+        <w:t>Repeat Steps 2 and 3 until all Players have exactly 4 Investments. Discard any remaining Investments.</w:t>
       </w:r>
     </w:p>
     <w:p>
@@ -953,6 +988,18 @@
         </w:numPr>
       </w:pPr>
       <w:r>
+        <w:t>Each Player takes one die per Investment and distributes 8 levels between their four Investments. The sum of the Investment levels must be 8.</w:t>
+      </w:r>
+    </w:p>
+    <w:p>
+      <w:pPr>
+        <w:pStyle w:val="ListParagraph"/>
+        <w:numPr>
+          <w:ilvl w:val="1"/>
+          <w:numId w:val="12"/>
+        </w:numPr>
+      </w:pPr>
+      <w:r>
         <w:t>Take care to keep each Investment no higher than its level cap.</w:t>
       </w:r>
     </w:p>
@@ -980,6 +1027,7 @@
         </w:numPr>
       </w:pPr>
       <w:r>
+        <w:lastRenderedPageBreak/>
         <w:t>Each Player places 4 Leaders in front of their screen and distributes 8 levels between their four Leaders. The sum of the Leader levels must be 8.</w:t>
       </w:r>
     </w:p>
@@ -1019,7 +1067,6 @@
         </w:numPr>
       </w:pPr>
       <w:r>
-        <w:lastRenderedPageBreak/>
         <w:t>Give each Player a card marker of their own color.</w:t>
       </w:r>
     </w:p>
@@ -1211,11 +1258,32 @@
         </w:numPr>
       </w:pPr>
       <w:r>
-        <w:t>Give the King’s Favor to the oldest (most honored) Player</w:t>
+        <w:t xml:space="preserve">Give the King’s Favor to the oldest (most honored) </w:t>
+      </w:r>
+      <w:r>
+        <w:t>p</w:t>
+      </w:r>
+      <w:r>
+        <w:t>layer</w:t>
       </w:r>
       <w:r>
         <w:t>.</w:t>
       </w:r>
+      <w:r>
+        <w:t xml:space="preserve"> The player to the right of the </w:t>
+      </w:r>
+      <w:r>
+        <w:t xml:space="preserve">oldest player </w:t>
+      </w:r>
+      <w:r>
+        <w:t xml:space="preserve">(last in turn order) </w:t>
+      </w:r>
+      <w:r>
+        <w:t xml:space="preserve">takes sponsorship of the </w:t>
+      </w:r>
+      <w:r>
+        <w:t>starting Edict.</w:t>
+      </w:r>
     </w:p>
     <w:p>
       <w:pPr>
@@ -1282,7 +1350,11 @@
         <w:t xml:space="preserve">phase. </w:t>
       </w:r>
       <w:r>
-        <w:t xml:space="preserve">Each round, the Greeks will attack the players, and the players must defend against them, gaining honor through battle and other </w:t>
+        <w:t xml:space="preserve">Each round, the Greeks will attack the players, and the players must defend against </w:t>
+      </w:r>
+      <w:r>
+        <w:lastRenderedPageBreak/>
+        <w:t xml:space="preserve">them, gaining honor through battle and other </w:t>
       </w:r>
       <w:r>
         <w:t xml:space="preserve">roundabout means. </w:t>
@@ -1324,7 +1396,6 @@
         <w:pStyle w:val="Heading2"/>
       </w:pPr>
       <w:r>
-        <w:lastRenderedPageBreak/>
         <w:t>4.</w:t>
       </w:r>
       <w:r>
@@ -1522,6 +1593,7 @@
         <w:pStyle w:val="ListParagraph"/>
       </w:pPr>
       <w:r>
+        <w:lastRenderedPageBreak/>
         <w:t>The player takes the corresponding action. The higher level the Leader used, the more effective the action can be.</w:t>
       </w:r>
       <w:r>
@@ -1538,11 +1610,414 @@
         <w:pStyle w:val="Heading2"/>
       </w:pPr>
       <w:r>
+        <w:t>5.</w:t>
+      </w:r>
+      <w:r>
+        <w:t>2. List of Actions</w:t>
+      </w:r>
+    </w:p>
+    <w:p>
+      <w:pPr>
+        <w:pStyle w:val="Heading3"/>
+      </w:pPr>
+      <w:r>
+        <w:t>5.2.1. Provincial Actions</w:t>
+      </w:r>
+    </w:p>
+    <w:p>
+      <w:r>
+        <w:t>These represent common actions involved in governing your province. Each may be used once per player per round.</w:t>
+      </w:r>
+    </w:p>
+    <w:p>
+      <w:pPr>
+        <w:pStyle w:val="ListParagraph"/>
+      </w:pPr>
+      <w:r>
+        <w:rPr>
+          <w:rStyle w:val="SubtleReference"/>
+        </w:rPr>
+        <w:t xml:space="preserve">Collect </w:t>
+      </w:r>
+      <w:r>
+        <w:t>– Gain 2 Commodities per Leader Level.</w:t>
+      </w:r>
+    </w:p>
+    <w:p>
+      <w:pPr>
+        <w:pStyle w:val="ListParagraph"/>
+      </w:pPr>
+      <w:r>
+        <w:rPr>
+          <w:rStyle w:val="SubtleReference"/>
+        </w:rPr>
+        <w:t xml:space="preserve">Brainstorm </w:t>
+      </w:r>
+      <w:r>
+        <w:t>– Draw 1 card per Leader Level from each deck.</w:t>
+      </w:r>
+    </w:p>
+    <w:p>
+      <w:pPr>
+        <w:pStyle w:val="ListParagraph"/>
+      </w:pPr>
+      <w:r>
+        <w:rPr>
+          <w:rStyle w:val="SubtleReference"/>
+        </w:rPr>
+        <w:t xml:space="preserve">Tax </w:t>
+      </w:r>
+      <w:r>
+        <w:t>– Take 1 Coin from each player violating one of your Edicts for each Edict they are violating. Keep 1 of the taken Coins per Leader level and put the rest in the Royal Bank.</w:t>
+      </w:r>
+    </w:p>
+    <w:p>
+      <w:pPr>
+        <w:pStyle w:val="ListParagraph"/>
+      </w:pPr>
+      <w:r>
+        <w:t>Laws taxed using this action will not be taxed during the Reports Phase.</w:t>
+      </w:r>
+    </w:p>
+    <w:p>
+      <w:pPr>
+        <w:pStyle w:val="ListParagraph"/>
+      </w:pPr>
+      <w:r>
+        <w:t>You may only tax your own Edicts.</w:t>
+      </w:r>
+    </w:p>
+    <w:p>
+      <w:pPr>
+        <w:pStyle w:val="ListParagraph"/>
+      </w:pPr>
+      <w:r>
+        <w:rPr>
+          <w:rStyle w:val="SubtleReference"/>
+        </w:rPr>
+        <w:t xml:space="preserve">Deploy </w:t>
+      </w:r>
+      <w:r>
+        <w:t>– Send 1 Troop per Leader Level to the leftmost empty Persian space on the Battlefield. Gain half (rounded up) the number of your deployed Troops in Coins from the Royal Bank.</w:t>
+      </w:r>
+    </w:p>
+    <w:p>
+      <w:pPr>
+        <w:pStyle w:val="ListParagraph"/>
+      </w:pPr>
+      <w:r>
+        <w:t xml:space="preserve">Place the Leader used to Deploy in the Battlefield next to your Troops. This will help the Reports phase </w:t>
+      </w:r>
+    </w:p>
+    <w:p>
+      <w:pPr>
+        <w:pStyle w:val="ListParagraph"/>
+      </w:pPr>
+      <w:r>
+        <w:rPr>
+          <w:rStyle w:val="SubtleReference"/>
+        </w:rPr>
+        <w:t xml:space="preserve">Recruit </w:t>
+      </w:r>
+      <w:r>
+        <w:t xml:space="preserve">– Pay 1 Coin </w:t>
+      </w:r>
+      <w:r>
+        <w:t xml:space="preserve">per Leader Level to </w:t>
+      </w:r>
+      <w:r>
+        <w:t>the Free Bank and gain 1 Troop</w:t>
+      </w:r>
+      <w:r>
+        <w:t xml:space="preserve"> per Coin paid</w:t>
+      </w:r>
+      <w:r>
+        <w:t>.</w:t>
+      </w:r>
+    </w:p>
+    <w:p>
+      <w:pPr>
+        <w:pStyle w:val="ListParagraph"/>
+      </w:pPr>
+      <w:r>
+        <w:rPr>
+          <w:rStyle w:val="SubtleReference"/>
+        </w:rPr>
+        <w:t xml:space="preserve">Infiltrate </w:t>
+      </w:r>
+      <w:r>
+        <w:t xml:space="preserve">– Pay 1 Coin </w:t>
+      </w:r>
+      <w:r>
+        <w:t xml:space="preserve">per Leader Level </w:t>
+      </w:r>
+      <w:r>
+        <w:t>to the Free Bank and gain 1 Spy</w:t>
+      </w:r>
+      <w:r>
+        <w:t xml:space="preserve"> per Coin paid</w:t>
+      </w:r>
+      <w:r>
+        <w:t>.</w:t>
+      </w:r>
+    </w:p>
+    <w:p>
+      <w:pPr>
+        <w:pStyle w:val="ListParagraph"/>
+      </w:pPr>
+      <w:r>
+        <w:rPr>
+          <w:rStyle w:val="SubtleReference"/>
+        </w:rPr>
+        <w:t xml:space="preserve">Build </w:t>
+      </w:r>
+      <w:r>
+        <w:t>– Play a single Investment from your hand to the table, pay 1 Commodity per Leader Level, and set the new Investment’s level to the number of Commodities paid.</w:t>
+      </w:r>
+    </w:p>
+    <w:p>
+      <w:pPr>
+        <w:pStyle w:val="ListParagraph"/>
+      </w:pPr>
+      <w:r>
+        <w:t>You may choose to build an Investment with a level lower than your Leader’s level.</w:t>
+      </w:r>
+    </w:p>
+    <w:p>
+      <w:pPr>
+        <w:pStyle w:val="ListParagraph"/>
+      </w:pPr>
+      <w:r>
+        <w:t>There is no limit to the number of Investments a player may have.</w:t>
+      </w:r>
+    </w:p>
+    <w:p>
+      <w:pPr>
+        <w:pStyle w:val="ListParagraph"/>
+      </w:pPr>
+      <w:r>
+        <w:rPr>
+          <w:rStyle w:val="SubtleReference"/>
+        </w:rPr>
         <w:lastRenderedPageBreak/>
-        <w:t>5.</w:t>
-      </w:r>
-      <w:r>
-        <w:t>2. List of Actions</w:t>
+        <w:t>Upgrade</w:t>
+      </w:r>
+      <w:r>
+        <w:rPr>
+          <w:rStyle w:val="SubtleReference"/>
+        </w:rPr>
+        <w:t xml:space="preserve"> </w:t>
+      </w:r>
+      <w:r>
+        <w:t xml:space="preserve">– Pay 1 Commodity </w:t>
+      </w:r>
+      <w:r>
+        <w:t xml:space="preserve">per Leader Level </w:t>
+      </w:r>
+      <w:r>
+        <w:t>and increase your Investments’ level by 1</w:t>
+      </w:r>
+      <w:r>
+        <w:t xml:space="preserve"> per Commodity paid</w:t>
+      </w:r>
+      <w:r>
+        <w:t>.</w:t>
+      </w:r>
+    </w:p>
+    <w:p>
+      <w:pPr>
+        <w:pStyle w:val="ListParagraph"/>
+      </w:pPr>
+      <w:r>
+        <w:t xml:space="preserve">This action </w:t>
+      </w:r>
+      <w:r>
+        <w:t xml:space="preserve">may </w:t>
+      </w:r>
+      <w:r>
+        <w:t xml:space="preserve">upgrade </w:t>
+      </w:r>
+      <w:r>
+        <w:t xml:space="preserve">multiple </w:t>
+      </w:r>
+      <w:r>
+        <w:t>Investment</w:t>
+      </w:r>
+      <w:r>
+        <w:t>s</w:t>
+      </w:r>
+      <w:r>
+        <w:t>, but the total number of Investment levels increased may be no more than the Leader’s Level</w:t>
+      </w:r>
+      <w:r>
+        <w:t>.</w:t>
+      </w:r>
+    </w:p>
+    <w:p>
+      <w:pPr>
+        <w:pStyle w:val="ListParagraph"/>
+      </w:pPr>
+      <w:r>
+        <w:t>The maximum Investment level is either 3 or 6, depending on the Investment.</w:t>
+      </w:r>
+    </w:p>
+    <w:p>
+      <w:pPr>
+        <w:pStyle w:val="ListParagraph"/>
+      </w:pPr>
+      <w:r>
+        <w:rPr>
+          <w:rStyle w:val="SubtleReference"/>
+        </w:rPr>
+        <w:t xml:space="preserve">Commission </w:t>
+      </w:r>
+      <w:r>
+        <w:t>– Immediately gain a new Leader and place it on this action space next to your original Leader. Set the new Leader’s level to half (rounded up) of the original Leader’s level.</w:t>
+      </w:r>
+    </w:p>
+    <w:p>
+      <w:pPr>
+        <w:pStyle w:val="ListParagraph"/>
+        <w:ind w:left="1800"/>
+      </w:pPr>
+      <w:r>
+        <w:t>The maximum number of Leaders a player may have is 10.</w:t>
+      </w:r>
+    </w:p>
+    <w:p>
+      <w:pPr>
+        <w:pStyle w:val="ListParagraph"/>
+      </w:pPr>
+      <w:r>
+        <w:rPr>
+          <w:rStyle w:val="SubtleReference"/>
+        </w:rPr>
+        <w:t xml:space="preserve">Promote </w:t>
+      </w:r>
+      <w:r>
+        <w:t>– Immediately increase your Leader’s Level by 1.</w:t>
+      </w:r>
+    </w:p>
+    <w:p>
+      <w:pPr>
+        <w:pStyle w:val="ListParagraph"/>
+      </w:pPr>
+      <w:r>
+        <w:t xml:space="preserve">The maximum </w:t>
+      </w:r>
+      <w:r>
+        <w:t xml:space="preserve">Leader level </w:t>
+      </w:r>
+      <w:r>
+        <w:t xml:space="preserve">is </w:t>
+      </w:r>
+      <w:r>
+        <w:t>6.</w:t>
+      </w:r>
+    </w:p>
+    <w:p>
+      <w:pPr>
+        <w:pStyle w:val="ListParagraph"/>
+      </w:pPr>
+      <w:r>
+        <w:rPr>
+          <w:rStyle w:val="SubtleReference"/>
+        </w:rPr>
+        <w:t xml:space="preserve">Sue </w:t>
+      </w:r>
+      <w:r>
+        <w:t xml:space="preserve">– Initiate a Trial against another player. The </w:t>
+      </w:r>
+      <w:r>
+        <w:t xml:space="preserve">other </w:t>
+      </w:r>
+      <w:r>
+        <w:t xml:space="preserve">player must immediately place an unused </w:t>
+      </w:r>
+      <w:r>
+        <w:t>L</w:t>
+      </w:r>
+      <w:r>
+        <w:t>eader on this action. The two players then perform a Trial</w:t>
+      </w:r>
+      <w:r>
+        <w:t>, following the instructions in 7.2</w:t>
+      </w:r>
+      <w:r>
+        <w:t>.</w:t>
+      </w:r>
+    </w:p>
+    <w:p>
+      <w:pPr>
+        <w:pStyle w:val="ListParagraph"/>
+      </w:pPr>
+      <w:r>
+        <w:t>The other player cannot deny performing this action.</w:t>
+      </w:r>
+    </w:p>
+    <w:p>
+      <w:pPr>
+        <w:pStyle w:val="ListParagraph"/>
+      </w:pPr>
+      <w:r>
+        <w:rPr>
+          <w:rStyle w:val="SubtleReference"/>
+        </w:rPr>
+        <w:t>Negotiate</w:t>
+      </w:r>
+      <w:r>
+        <w:rPr>
+          <w:rStyle w:val="SubtleReference"/>
+        </w:rPr>
+        <w:t xml:space="preserve"> </w:t>
+      </w:r>
+      <w:r>
+        <w:t xml:space="preserve">– </w:t>
+      </w:r>
+      <w:r>
+        <w:t xml:space="preserve">Form an alliance with another player. The other player </w:t>
+      </w:r>
+      <w:r>
+        <w:t>immediateply places an unused Leader on this action.</w:t>
+      </w:r>
+      <w:r>
+        <w:t xml:space="preserve"> The two players</w:t>
+      </w:r>
+      <w:r>
+        <w:t xml:space="preserve"> then exchange 1 Alliance Token per Leader level they used.</w:t>
+      </w:r>
+    </w:p>
+    <w:p>
+      <w:pPr>
+        <w:pStyle w:val="ListParagraph"/>
+      </w:pPr>
+      <w:r>
+        <w:t>The other player may dany performing this action. In this case, the first player may choose another player to ally with or take the action back entirely.</w:t>
+      </w:r>
+    </w:p>
+    <w:p>
+      <w:pPr>
+        <w:pStyle w:val="ListParagraph"/>
+      </w:pPr>
+      <w:r>
+        <w:t xml:space="preserve">The two players using this action may only give 1 Alliance Token per Leader level they used. This may result in an uneven exchange </w:t>
+      </w:r>
+      <w:r>
+        <w:t xml:space="preserve">of Alliance Tokens </w:t>
+      </w:r>
+      <w:r>
+        <w:t>if the players used Leaders of unequal levels</w:t>
+      </w:r>
+      <w:r>
+        <w:t>.</w:t>
+      </w:r>
+    </w:p>
+    <w:p>
+      <w:pPr>
+        <w:pStyle w:val="Quote"/>
+      </w:pPr>
+      <w:r>
+        <w:t>Margin Note — Persian Fact: Only one satrap could “petition” the King at a time, but provincial matters were handled independently.</w:t>
       </w:r>
     </w:p>
     <w:p>
@@ -1550,115 +2025,38 @@
         <w:pStyle w:val="Heading3"/>
       </w:pPr>
       <w:r>
-        <w:t>5.2.1. Provincial Actions</w:t>
-      </w:r>
-    </w:p>
-    <w:p>
-      <w:r>
-        <w:t>These represent common actions involved in governing your province. Each may be used once per player per round.</w:t>
-      </w:r>
-    </w:p>
-    <w:p>
-      <w:pPr>
-        <w:pStyle w:val="ListParagraph"/>
-      </w:pPr>
-      <w:r>
-        <w:rPr>
-          <w:rStyle w:val="SubtleReference"/>
-        </w:rPr>
-        <w:t xml:space="preserve">Collect </w:t>
-      </w:r>
-      <w:r>
-        <w:t>– Gain 2 Commodities per Leader Level.</w:t>
-      </w:r>
-    </w:p>
-    <w:p>
-      <w:pPr>
-        <w:pStyle w:val="ListParagraph"/>
-      </w:pPr>
-      <w:r>
-        <w:rPr>
-          <w:rStyle w:val="SubtleReference"/>
-        </w:rPr>
-        <w:t xml:space="preserve">Brainstorm </w:t>
-      </w:r>
-      <w:r>
-        <w:t>– Draw 1 card per Leader Level from each deck.</w:t>
-      </w:r>
-    </w:p>
-    <w:p>
-      <w:pPr>
-        <w:pStyle w:val="ListParagraph"/>
-      </w:pPr>
-      <w:r>
-        <w:rPr>
-          <w:rStyle w:val="SubtleReference"/>
-        </w:rPr>
-        <w:t xml:space="preserve">Tax </w:t>
-      </w:r>
-      <w:r>
-        <w:t>– Take 1 Coin from each player violating one of your Edicts for each Edict they are violating. Keep 1 of the taken Coins per Leader level and put the rest in the Royal Bank.</w:t>
-      </w:r>
-    </w:p>
-    <w:p>
-      <w:pPr>
-        <w:pStyle w:val="ListParagraph"/>
-      </w:pPr>
-      <w:r>
-        <w:t>Laws taxed using this action will not be taxed during the Reports Phase.</w:t>
-      </w:r>
-    </w:p>
-    <w:p>
-      <w:pPr>
-        <w:pStyle w:val="ListParagraph"/>
-      </w:pPr>
-      <w:r>
-        <w:t>You may only tax your own Edicts.</w:t>
-      </w:r>
-    </w:p>
-    <w:p>
-      <w:pPr>
-        <w:pStyle w:val="ListParagraph"/>
-      </w:pPr>
-      <w:r>
-        <w:rPr>
-          <w:rStyle w:val="SubtleReference"/>
-        </w:rPr>
-        <w:t xml:space="preserve">Deploy </w:t>
-      </w:r>
-      <w:r>
-        <w:t>– Send 1 Troop per Leader Level to the leftmost empty Persian space on the Battlefield. Gain half (rounded up) the number of your deployed Troops in Coins from the Royal Bank.</w:t>
-      </w:r>
-    </w:p>
-    <w:p>
-      <w:pPr>
-        <w:pStyle w:val="ListParagraph"/>
-      </w:pPr>
-      <w:r>
-        <w:t xml:space="preserve">Place the Leader used to Deploy in the Battlefield next to your Troops. This will help the Reports phase </w:t>
-      </w:r>
-    </w:p>
-    <w:p>
-      <w:pPr>
-        <w:pStyle w:val="ListParagraph"/>
-      </w:pPr>
-      <w:r>
-        <w:rPr>
-          <w:rStyle w:val="SubtleReference"/>
-        </w:rPr>
-        <w:t xml:space="preserve">Recruit </w:t>
-      </w:r>
-      <w:r>
-        <w:t xml:space="preserve">– Pay 1 Coin </w:t>
-      </w:r>
-      <w:r>
-        <w:t xml:space="preserve">per Leader Level to </w:t>
-      </w:r>
-      <w:r>
-        <w:t>the Free Bank and gain 1 Troop</w:t>
-      </w:r>
-      <w:r>
-        <w:t xml:space="preserve"> per Coin paid</w:t>
+        <w:t>5.2.2. Undermarket Actions</w:t>
+      </w:r>
+    </w:p>
+    <w:p>
+      <w:r>
+        <w:t>These represent illicit dealings outside the King’s oversight</w:t>
+      </w:r>
+      <w:r>
+        <w:t xml:space="preserve"> and come with a penalty for use</w:t>
+      </w:r>
+      <w:r>
+        <w:t>. Each may be used once per player per round.</w:t>
+      </w:r>
+    </w:p>
+    <w:p>
+      <w:pPr>
+        <w:pStyle w:val="ListParagraph"/>
+      </w:pPr>
+      <w:r>
+        <w:rPr>
+          <w:rStyle w:val="SubtleReference"/>
+        </w:rPr>
+        <w:t xml:space="preserve">Buy </w:t>
+      </w:r>
+      <w:r>
+        <w:t>– Pay 1 Coin per Leader Level and gain Commodities</w:t>
+      </w:r>
+      <w:r>
+        <w:t xml:space="preserve"> according to the Market Rate</w:t>
+      </w:r>
+      <w:r>
+        <w:t xml:space="preserve"> minus 1</w:t>
       </w:r>
       <w:r>
         <w:t>.</w:t>
@@ -1669,22 +2067,20 @@
         <w:pStyle w:val="ListParagraph"/>
       </w:pPr>
       <w:r>
-        <w:rPr>
-          <w:rStyle w:val="SubtleReference"/>
-        </w:rPr>
-        <w:t xml:space="preserve">Infiltrate </w:t>
-      </w:r>
-      <w:r>
-        <w:t xml:space="preserve">– Pay 1 Coin </w:t>
-      </w:r>
-      <w:r>
-        <w:t xml:space="preserve">per Leader Level </w:t>
-      </w:r>
-      <w:r>
-        <w:t>to the Free Bank and gain 1 Spy</w:t>
-      </w:r>
-      <w:r>
-        <w:t xml:space="preserve"> per Coin paid</w:t>
+        <w:lastRenderedPageBreak/>
+        <w:t>Ex. At a Market Rate of 4, paying 2 Coins will earn you 6 Commodities. 2 * (4</w:t>
+      </w:r>
+      <w:r>
+        <w:t xml:space="preserve"> </w:t>
+      </w:r>
+      <w:r>
+        <w:t>-</w:t>
+      </w:r>
+      <w:r>
+        <w:t xml:space="preserve"> </w:t>
+      </w:r>
+      <w:r>
+        <w:t>1) = 6</w:t>
       </w:r>
       <w:r>
         <w:t>.</w:t>
@@ -1698,55 +2094,93 @@
         <w:rPr>
           <w:rStyle w:val="SubtleReference"/>
         </w:rPr>
-        <w:t xml:space="preserve">Build </w:t>
-      </w:r>
-      <w:r>
-        <w:t>– Play a single Investment from your hand to the table, pay 1 Commodity per Leader Level, and set the new Investment’s level to the number of Commodities paid.</w:t>
-      </w:r>
-    </w:p>
-    <w:p>
-      <w:pPr>
-        <w:pStyle w:val="ListParagraph"/>
-      </w:pPr>
-      <w:r>
-        <w:t>You may choose to build an Investment with a level lower than your Leader’s level.</w:t>
-      </w:r>
-    </w:p>
-    <w:p>
-      <w:pPr>
-        <w:pStyle w:val="ListParagraph"/>
-      </w:pPr>
-      <w:r>
-        <w:t>There is no limit to the number of Investments a player may have.</w:t>
-      </w:r>
-    </w:p>
-    <w:p>
-      <w:pPr>
-        <w:pStyle w:val="ListParagraph"/>
-      </w:pPr>
-      <w:r>
-        <w:rPr>
-          <w:rStyle w:val="SubtleReference"/>
-        </w:rPr>
-        <w:t>Upgrade</w:t>
-      </w:r>
-      <w:r>
-        <w:rPr>
-          <w:rStyle w:val="SubtleReference"/>
-        </w:rPr>
-        <w:t xml:space="preserve"> </w:t>
-      </w:r>
-      <w:r>
-        <w:t xml:space="preserve">– Pay 1 Commodity </w:t>
-      </w:r>
-      <w:r>
-        <w:t xml:space="preserve">per Leader Level </w:t>
-      </w:r>
-      <w:r>
-        <w:t>and increase your Investments’ level by 1</w:t>
-      </w:r>
-      <w:r>
-        <w:t xml:space="preserve"> per Commodity paid</w:t>
+        <w:t xml:space="preserve">Sell </w:t>
+      </w:r>
+      <w:r>
+        <w:t xml:space="preserve">– Pay Commodities and gain up to Leader </w:t>
+      </w:r>
+      <w:r>
+        <w:t>l</w:t>
+      </w:r>
+      <w:r>
+        <w:t>evel Coins according to the Market Rate plus 1.</w:t>
+      </w:r>
+    </w:p>
+    <w:p>
+      <w:pPr>
+        <w:pStyle w:val="ListParagraph"/>
+      </w:pPr>
+      <w:r>
+        <w:t xml:space="preserve">Ex. At a Market Rate of 4, paying 10 Commodities will earn you 2 Coins. 10 / (4 + 1) </w:t>
+      </w:r>
+      <w:r>
+        <w:t>= 2.</w:t>
+      </w:r>
+    </w:p>
+    <w:p>
+      <w:pPr>
+        <w:pStyle w:val="ListParagraph"/>
+      </w:pPr>
+      <w:r>
+        <w:rPr>
+          <w:rStyle w:val="SubtleReference"/>
+        </w:rPr>
+        <w:t xml:space="preserve">Monetize </w:t>
+      </w:r>
+      <w:r>
+        <w:t xml:space="preserve">– Discard Cards and gain up to Leader </w:t>
+      </w:r>
+      <w:r>
+        <w:t>l</w:t>
+      </w:r>
+      <w:r>
+        <w:t>evel Coins according to 7 minus the Market Rate minus 1.</w:t>
+      </w:r>
+    </w:p>
+    <w:p>
+      <w:pPr>
+        <w:pStyle w:val="ListParagraph"/>
+      </w:pPr>
+      <w:r>
+        <w:t xml:space="preserve">Ex. At a Market Rate of 4, discarding 8 Cards will earn you 2 Coins. 8 / (7 - </w:t>
+      </w:r>
+      <w:r>
+        <w:t>(</w:t>
+      </w:r>
+      <w:r>
+        <w:t xml:space="preserve">4 </w:t>
+      </w:r>
+      <w:r>
+        <w:t>-</w:t>
+      </w:r>
+      <w:r>
+        <w:t xml:space="preserve"> 1)</w:t>
+      </w:r>
+      <w:r>
+        <w:t>)</w:t>
+      </w:r>
+      <w:r>
+        <w:t xml:space="preserve"> = 2.</w:t>
+      </w:r>
+    </w:p>
+    <w:p>
+      <w:pPr>
+        <w:pStyle w:val="ListParagraph"/>
+      </w:pPr>
+      <w:r>
+        <w:rPr>
+          <w:rStyle w:val="SubtleReference"/>
+        </w:rPr>
+        <w:t xml:space="preserve">Donate </w:t>
+      </w:r>
+      <w:r>
+        <w:t>– Pay 1 Coin per Leader level</w:t>
+      </w:r>
+      <w:r>
+        <w:t xml:space="preserve"> to the Royal Bank and gain half (rounded up) the number of donated Coins in Honor. Immediately decrease the level of the </w:t>
+      </w:r>
+      <w:r>
+        <w:t>Leader used by 1</w:t>
       </w:r>
       <w:r>
         <w:t>.</w:t>
@@ -1754,525 +2188,163 @@
     </w:p>
     <w:p>
       <w:pPr>
-        <w:pStyle w:val="ListParagraph"/>
-      </w:pPr>
-      <w:r>
-        <w:t xml:space="preserve">This action </w:t>
-      </w:r>
-      <w:r>
-        <w:t xml:space="preserve">may </w:t>
-      </w:r>
-      <w:r>
-        <w:t xml:space="preserve">upgrade </w:t>
-      </w:r>
-      <w:r>
-        <w:t xml:space="preserve">multiple </w:t>
-      </w:r>
-      <w:r>
-        <w:t>Investment</w:t>
-      </w:r>
-      <w:r>
-        <w:t>s</w:t>
-      </w:r>
-      <w:r>
-        <w:t>, but the total number of Investment levels increased may be no more than the Leader’s Level</w:t>
-      </w:r>
-      <w:r>
-        <w:t>.</w:t>
-      </w:r>
-    </w:p>
-    <w:p>
-      <w:pPr>
-        <w:pStyle w:val="ListParagraph"/>
-      </w:pPr>
-      <w:r>
-        <w:t>The maximum Investment level is either 3 or 6, depending on the Investment.</w:t>
-      </w:r>
-    </w:p>
-    <w:p>
-      <w:pPr>
-        <w:pStyle w:val="ListParagraph"/>
-      </w:pPr>
-      <w:r>
-        <w:rPr>
-          <w:rStyle w:val="SubtleReference"/>
-        </w:rPr>
+        <w:pStyle w:val="Quote"/>
+      </w:pPr>
+      <w:r>
+        <w:t>Imperial Reminder: The King frowns upon Undermarket dealings. Fortunately, frowns are not Laws.</w:t>
+      </w:r>
+    </w:p>
+    <w:p>
+      <w:pPr>
+        <w:pStyle w:val="Heading3"/>
+      </w:pPr>
+      <w:r>
+        <w:t>5.2.3. Court Actions</w:t>
+      </w:r>
+    </w:p>
+    <w:p>
+      <w:r>
+        <w:t xml:space="preserve">These actions represent </w:t>
+      </w:r>
+      <w:r>
+        <w:t xml:space="preserve">direct interactions with </w:t>
+      </w:r>
+      <w:r>
+        <w:t>the King and his Court</w:t>
+      </w:r>
+      <w:r>
+        <w:t>. Each may be used once per round by a single player.</w:t>
+      </w:r>
+    </w:p>
+    <w:p>
+      <w:pPr>
+        <w:pStyle w:val="ListParagraph"/>
+      </w:pPr>
+      <w:r>
+        <w:rPr>
+          <w:rStyle w:val="SubtleReference"/>
+        </w:rPr>
+        <w:t xml:space="preserve">Petition </w:t>
+      </w:r>
+      <w:r>
+        <w:t>– Play 1 Law per Leader level from your hand to the back of the Law Queue.</w:t>
+      </w:r>
+      <w:r>
+        <w:t xml:space="preserve"> Put one of your Card Markers on each Law played.</w:t>
+      </w:r>
+    </w:p>
+    <w:p>
+      <w:pPr>
+        <w:pStyle w:val="ListParagraph"/>
+      </w:pPr>
+      <w:r>
+        <w:rPr>
+          <w:rStyle w:val="SubtleReference"/>
+        </w:rPr>
+        <w:t xml:space="preserve">Postpone </w:t>
+      </w:r>
+      <w:r>
+        <w:t>– Move the Deliberated Law 1 space per Leader level backward in the Law Queue. Immediately make the f</w:t>
+      </w:r>
+      <w:r>
+        <w:t>ir</w:t>
+      </w:r>
+      <w:r>
+        <w:t>st Law in the Queue the new Deliberated Law.</w:t>
+      </w:r>
+    </w:p>
+    <w:p>
+      <w:pPr>
+        <w:pStyle w:val="ListParagraph"/>
+      </w:pPr>
+      <w:r>
+        <w:rPr>
+          <w:rStyle w:val="SubtleReference"/>
+        </w:rPr>
+        <w:t xml:space="preserve">Prioritize </w:t>
+      </w:r>
+      <w:r>
+        <w:t>– Move any Law in the Queue, except the Deliberated Law, forward 1 space per Leader Level.</w:t>
+      </w:r>
+    </w:p>
+    <w:p>
+      <w:pPr>
+        <w:pStyle w:val="ListParagraph"/>
+      </w:pPr>
+      <w:r>
+        <w:t>The moved Law may never replace the Deliberated Law.</w:t>
+      </w:r>
+    </w:p>
+    <w:p>
+      <w:pPr>
+        <w:pStyle w:val="ListParagraph"/>
+      </w:pPr>
+      <w:r>
+        <w:rPr>
+          <w:rStyle w:val="SubtleReference"/>
+        </w:rPr>
+        <w:t xml:space="preserve">Flatter </w:t>
+      </w:r>
+      <w:r>
+        <w:t>– Gain the King’s Favor and half the Leader’s level in Coins from the Royal Bank.</w:t>
+      </w:r>
+    </w:p>
+    <w:p>
+      <w:pPr>
+        <w:pStyle w:val="ListParagraph"/>
+      </w:pPr>
+      <w:r>
+        <w:rPr>
+          <w:rStyle w:val="SubtleReference"/>
+        </w:rPr>
+        <w:t xml:space="preserve">Buy </w:t>
+      </w:r>
+      <w:r>
+        <w:t>– Pay 1 Coin per Leader Level and gain Commodities according to the Market Rate.</w:t>
+      </w:r>
+    </w:p>
+    <w:p>
+      <w:pPr>
+        <w:pStyle w:val="ListParagraph"/>
+      </w:pPr>
+      <w:r>
+        <w:t>Ex. At a Market Rate of 4, paying 2 Coins will earn you 8 Commodities. 2 * 4 = 8.</w:t>
+      </w:r>
+    </w:p>
+    <w:p>
+      <w:pPr>
+        <w:pStyle w:val="ListParagraph"/>
+      </w:pPr>
+      <w:r>
+        <w:rPr>
+          <w:rStyle w:val="SubtleReference"/>
+        </w:rPr>
+        <w:t xml:space="preserve">Sell </w:t>
+      </w:r>
+      <w:r>
+        <w:t>– Pay Commodities and gain up to Leader level Coins according to the Market Rate.</w:t>
+      </w:r>
+    </w:p>
+    <w:p>
+      <w:pPr>
+        <w:pStyle w:val="ListParagraph"/>
+      </w:pPr>
+      <w:r>
         <w:lastRenderedPageBreak/>
-        <w:t xml:space="preserve">Commission </w:t>
-      </w:r>
-      <w:r>
-        <w:t>– Immediately gain a new Leader and place it on this action space next to your original Leader. Set the new Leader’s level to half (rounded up) of the original Leader’s level.</w:t>
-      </w:r>
-    </w:p>
-    <w:p>
-      <w:pPr>
-        <w:pStyle w:val="ListParagraph"/>
-        <w:ind w:left="1800"/>
-      </w:pPr>
-      <w:r>
-        <w:t>The maximum number of Leaders a player may have is 10.</w:t>
-      </w:r>
-    </w:p>
-    <w:p>
-      <w:pPr>
-        <w:pStyle w:val="ListParagraph"/>
-      </w:pPr>
-      <w:r>
-        <w:rPr>
-          <w:rStyle w:val="SubtleReference"/>
-        </w:rPr>
-        <w:t xml:space="preserve">Promote </w:t>
-      </w:r>
-      <w:r>
-        <w:t>– Immediately increase your Leader’s Level by 1.</w:t>
-      </w:r>
-    </w:p>
-    <w:p>
-      <w:pPr>
-        <w:pStyle w:val="ListParagraph"/>
-      </w:pPr>
-      <w:r>
-        <w:t xml:space="preserve">The maximum </w:t>
-      </w:r>
-      <w:r>
-        <w:t xml:space="preserve">Leader level </w:t>
-      </w:r>
-      <w:r>
-        <w:t xml:space="preserve">is </w:t>
-      </w:r>
-      <w:r>
-        <w:t>6.</w:t>
-      </w:r>
-    </w:p>
-    <w:p>
-      <w:pPr>
-        <w:pStyle w:val="ListParagraph"/>
-      </w:pPr>
-      <w:r>
-        <w:rPr>
-          <w:rStyle w:val="SubtleReference"/>
-        </w:rPr>
-        <w:t xml:space="preserve">Sue </w:t>
-      </w:r>
-      <w:r>
-        <w:t xml:space="preserve">– Initiate a Trial against another player. The </w:t>
-      </w:r>
-      <w:r>
-        <w:t xml:space="preserve">other </w:t>
-      </w:r>
-      <w:r>
-        <w:t xml:space="preserve">player must immediately place an unused </w:t>
-      </w:r>
-      <w:r>
-        <w:t>L</w:t>
-      </w:r>
-      <w:r>
-        <w:t>eader on this action. The two players then perform a Trial</w:t>
-      </w:r>
-      <w:r>
-        <w:t>, following the instructions in 7.2</w:t>
-      </w:r>
-      <w:r>
-        <w:t>.</w:t>
-      </w:r>
-    </w:p>
-    <w:p>
-      <w:pPr>
-        <w:pStyle w:val="ListParagraph"/>
-      </w:pPr>
-      <w:r>
-        <w:t>The other player cannot deny performing this action.</w:t>
-      </w:r>
-    </w:p>
-    <w:p>
-      <w:pPr>
-        <w:pStyle w:val="ListParagraph"/>
-      </w:pPr>
-      <w:r>
-        <w:rPr>
-          <w:rStyle w:val="SubtleReference"/>
-        </w:rPr>
-        <w:t>Negotiate</w:t>
-      </w:r>
-      <w:r>
-        <w:rPr>
-          <w:rStyle w:val="SubtleReference"/>
-        </w:rPr>
-        <w:t xml:space="preserve"> </w:t>
-      </w:r>
-      <w:r>
-        <w:t xml:space="preserve">– </w:t>
-      </w:r>
-      <w:r>
-        <w:t xml:space="preserve">Form an alliance with another player. The other player </w:t>
-      </w:r>
-      <w:r>
-        <w:t>immediateply places an unused Leader on this action.</w:t>
-      </w:r>
-      <w:r>
-        <w:t xml:space="preserve"> The two players</w:t>
-      </w:r>
-      <w:r>
-        <w:t xml:space="preserve"> then exchange 1 Alliance Token per Leader level they used.</w:t>
-      </w:r>
-    </w:p>
-    <w:p>
-      <w:pPr>
-        <w:pStyle w:val="ListParagraph"/>
-      </w:pPr>
-      <w:r>
-        <w:t>The other player may dany performing this action. In this case, the first player may choose another player to ally with or take the action back entirely.</w:t>
-      </w:r>
-    </w:p>
-    <w:p>
-      <w:pPr>
-        <w:pStyle w:val="ListParagraph"/>
-      </w:pPr>
-      <w:r>
-        <w:t xml:space="preserve">The two players using this action may only give 1 Alliance Token per Leader level they used. This may result in an uneven exchange </w:t>
-      </w:r>
-      <w:r>
-        <w:t xml:space="preserve">of Alliance Tokens </w:t>
-      </w:r>
-      <w:r>
-        <w:t>if the players used Leaders of unequal levels</w:t>
-      </w:r>
-      <w:r>
-        <w:t>.</w:t>
-      </w:r>
-    </w:p>
-    <w:p>
-      <w:pPr>
-        <w:pStyle w:val="Quote"/>
-      </w:pPr>
-      <w:r>
-        <w:t>Margin Note — Persian Fact: Only one satrap could “petition” the King at a time, but provincial matters were handled independently.</w:t>
-      </w:r>
-    </w:p>
-    <w:p>
-      <w:pPr>
-        <w:pStyle w:val="Heading3"/>
-      </w:pPr>
-      <w:r>
-        <w:t>5.2.2. Undermarket Actions</w:t>
-      </w:r>
-    </w:p>
-    <w:p>
-      <w:r>
-        <w:t>These represent illicit dealings outside the King’s oversight</w:t>
-      </w:r>
-      <w:r>
-        <w:t xml:space="preserve"> and come with a penalty for use</w:t>
-      </w:r>
-      <w:r>
-        <w:t>. Each may be used once per player per round.</w:t>
-      </w:r>
-    </w:p>
-    <w:p>
-      <w:pPr>
-        <w:pStyle w:val="ListParagraph"/>
-      </w:pPr>
-      <w:r>
-        <w:rPr>
-          <w:rStyle w:val="SubtleReference"/>
-        </w:rPr>
-        <w:t xml:space="preserve">Buy </w:t>
-      </w:r>
-      <w:r>
-        <w:t>– Pay 1 Coin per Leader Level and gain Commodities</w:t>
-      </w:r>
-      <w:r>
-        <w:t xml:space="preserve"> according to the Market Rate</w:t>
-      </w:r>
-      <w:r>
-        <w:t xml:space="preserve"> minus 1</w:t>
-      </w:r>
-      <w:r>
-        <w:t>.</w:t>
-      </w:r>
-    </w:p>
-    <w:p>
-      <w:pPr>
-        <w:pStyle w:val="ListParagraph"/>
-      </w:pPr>
-      <w:r>
-        <w:t>Ex. At a Market Rate of 4, paying 2 Coins will earn you 6 Commodities. 2 * (4</w:t>
-      </w:r>
-      <w:r>
-        <w:t xml:space="preserve"> </w:t>
-      </w:r>
-      <w:r>
-        <w:t>-</w:t>
-      </w:r>
-      <w:r>
-        <w:t xml:space="preserve"> </w:t>
-      </w:r>
-      <w:r>
-        <w:t>1) = 6</w:t>
-      </w:r>
-      <w:r>
-        <w:t>.</w:t>
-      </w:r>
-    </w:p>
-    <w:p>
-      <w:pPr>
-        <w:pStyle w:val="ListParagraph"/>
-      </w:pPr>
-      <w:r>
-        <w:rPr>
-          <w:rStyle w:val="SubtleReference"/>
-        </w:rPr>
-        <w:t xml:space="preserve">Sell </w:t>
-      </w:r>
-      <w:r>
-        <w:t xml:space="preserve">– Pay Commodities and gain up to Leader </w:t>
-      </w:r>
-      <w:r>
-        <w:t>l</w:t>
-      </w:r>
-      <w:r>
-        <w:t>evel Coins according to the Market Rate plus 1.</w:t>
-      </w:r>
-    </w:p>
-    <w:p>
-      <w:pPr>
-        <w:pStyle w:val="ListParagraph"/>
-      </w:pPr>
-      <w:r>
-        <w:t xml:space="preserve">Ex. At a Market Rate of 4, paying 10 Commodities will earn you 2 Coins. 10 / (4 + 1) </w:t>
-      </w:r>
-      <w:r>
-        <w:t>= 2.</w:t>
-      </w:r>
-    </w:p>
-    <w:p>
-      <w:pPr>
-        <w:pStyle w:val="ListParagraph"/>
-      </w:pPr>
-      <w:r>
-        <w:rPr>
-          <w:rStyle w:val="SubtleReference"/>
-        </w:rPr>
-        <w:lastRenderedPageBreak/>
+        <w:t>Ex. At a Market Rate of 4, paying 8 Commodities will earn you 2 Coins. 8 / 4 = 2.</w:t>
+      </w:r>
+    </w:p>
+    <w:p>
+      <w:pPr>
+        <w:pStyle w:val="ListParagraph"/>
+      </w:pPr>
+      <w:r>
+        <w:rPr>
+          <w:rStyle w:val="SubtleReference"/>
+        </w:rPr>
         <w:t xml:space="preserve">Monetize </w:t>
       </w:r>
       <w:r>
-        <w:t xml:space="preserve">– Discard Cards and gain up to Leader </w:t>
-      </w:r>
-      <w:r>
-        <w:t>l</w:t>
-      </w:r>
-      <w:r>
-        <w:t>evel Coins according to 7 minus the Market Rate minus 1.</w:t>
-      </w:r>
-    </w:p>
-    <w:p>
-      <w:pPr>
-        <w:pStyle w:val="ListParagraph"/>
-      </w:pPr>
-      <w:r>
-        <w:t xml:space="preserve">Ex. At a Market Rate of 4, discarding 8 Cards will earn you 2 Coins. 8 / (7 - </w:t>
-      </w:r>
-      <w:r>
-        <w:t>(</w:t>
-      </w:r>
-      <w:r>
-        <w:t xml:space="preserve">4 </w:t>
-      </w:r>
-      <w:r>
-        <w:t>-</w:t>
-      </w:r>
-      <w:r>
-        <w:t xml:space="preserve"> 1)</w:t>
-      </w:r>
-      <w:r>
-        <w:t>)</w:t>
-      </w:r>
-      <w:r>
-        <w:t xml:space="preserve"> = 2.</w:t>
-      </w:r>
-    </w:p>
-    <w:p>
-      <w:pPr>
-        <w:pStyle w:val="ListParagraph"/>
-      </w:pPr>
-      <w:r>
-        <w:rPr>
-          <w:rStyle w:val="SubtleReference"/>
-        </w:rPr>
-        <w:t xml:space="preserve">Donate </w:t>
-      </w:r>
-      <w:r>
-        <w:t>– Pay 1 Coin per Leader level</w:t>
-      </w:r>
-      <w:r>
-        <w:t xml:space="preserve"> to the Royal Bank and gain half (rounded up) the number of donated Coins in Honor. Immediately decrease the level of the </w:t>
-      </w:r>
-      <w:r>
-        <w:t>Leader used by 1</w:t>
-      </w:r>
-      <w:r>
-        <w:t>.</w:t>
-      </w:r>
-    </w:p>
-    <w:p>
-      <w:pPr>
-        <w:pStyle w:val="Quote"/>
-      </w:pPr>
-      <w:r>
-        <w:t>Imperial Reminder: The King frowns upon Undermarket dealings. Fortunately, frowns are not Laws.</w:t>
-      </w:r>
-    </w:p>
-    <w:p>
-      <w:pPr>
-        <w:pStyle w:val="Heading3"/>
-      </w:pPr>
-      <w:r>
-        <w:t>5.2.3. Court Actions</w:t>
-      </w:r>
-    </w:p>
-    <w:p>
-      <w:r>
-        <w:t xml:space="preserve">These actions represent </w:t>
-      </w:r>
-      <w:r>
-        <w:t xml:space="preserve">direct interactions with </w:t>
-      </w:r>
-      <w:r>
-        <w:t>the King and his Court</w:t>
-      </w:r>
-      <w:r>
-        <w:t>. Each may be used once per round by a single player.</w:t>
-      </w:r>
-    </w:p>
-    <w:p>
-      <w:pPr>
-        <w:pStyle w:val="ListParagraph"/>
-      </w:pPr>
-      <w:r>
-        <w:rPr>
-          <w:rStyle w:val="SubtleReference"/>
-        </w:rPr>
-        <w:t xml:space="preserve">Petition </w:t>
-      </w:r>
-      <w:r>
-        <w:t>– Play 1 Law per Leader level from your hand to the back of the Law Queue.</w:t>
-      </w:r>
-      <w:r>
-        <w:t xml:space="preserve"> Put one of your Card Markers on each Law played.</w:t>
-      </w:r>
-    </w:p>
-    <w:p>
-      <w:pPr>
-        <w:pStyle w:val="ListParagraph"/>
-      </w:pPr>
-      <w:r>
-        <w:rPr>
-          <w:rStyle w:val="SubtleReference"/>
-        </w:rPr>
-        <w:t xml:space="preserve">Postpone </w:t>
-      </w:r>
-      <w:r>
-        <w:t>– Move the Deliberated Law 1 space per Leader level backward in the Law Queue. Immediately make the f</w:t>
-      </w:r>
-      <w:r>
-        <w:t>ir</w:t>
-      </w:r>
-      <w:r>
-        <w:t>st Law in the Queue the new Deliberated Law.</w:t>
-      </w:r>
-    </w:p>
-    <w:p>
-      <w:pPr>
-        <w:pStyle w:val="ListParagraph"/>
-      </w:pPr>
-      <w:r>
-        <w:rPr>
-          <w:rStyle w:val="SubtleReference"/>
-        </w:rPr>
-        <w:t xml:space="preserve">Prioritize </w:t>
-      </w:r>
-      <w:r>
-        <w:t>– Move any Law in the Queue, except the Deliberated Law, forward 1 space per Leader Level.</w:t>
-      </w:r>
-    </w:p>
-    <w:p>
-      <w:pPr>
-        <w:pStyle w:val="ListParagraph"/>
-      </w:pPr>
-      <w:r>
-        <w:t>The moved Law may never replace the Deliberated Law.</w:t>
-      </w:r>
-    </w:p>
-    <w:p>
-      <w:pPr>
-        <w:pStyle w:val="ListParagraph"/>
-      </w:pPr>
-      <w:r>
-        <w:rPr>
-          <w:rStyle w:val="SubtleReference"/>
-        </w:rPr>
-        <w:t xml:space="preserve">Flatter </w:t>
-      </w:r>
-      <w:r>
-        <w:t>– Gain the King’s Favor and half the Leader’s level in Coins from the Royal Bank.</w:t>
-      </w:r>
-    </w:p>
-    <w:p>
-      <w:pPr>
-        <w:pStyle w:val="ListParagraph"/>
-      </w:pPr>
-      <w:r>
-        <w:rPr>
-          <w:rStyle w:val="SubtleReference"/>
-        </w:rPr>
-        <w:t xml:space="preserve">Buy </w:t>
-      </w:r>
-      <w:r>
-        <w:t>– Pay 1 Coin per Leader Level and gain Commodities according to the Market Rate.</w:t>
-      </w:r>
-    </w:p>
-    <w:p>
-      <w:pPr>
-        <w:pStyle w:val="ListParagraph"/>
-      </w:pPr>
-      <w:r>
-        <w:t>Ex. At a Market Rate of 4, paying 2 Coins will earn you 8 Commodities. 2 * 4 = 8.</w:t>
-      </w:r>
-    </w:p>
-    <w:p>
-      <w:pPr>
-        <w:pStyle w:val="ListParagraph"/>
-      </w:pPr>
-      <w:r>
-        <w:rPr>
-          <w:rStyle w:val="SubtleReference"/>
-        </w:rPr>
-        <w:t xml:space="preserve">Sell </w:t>
-      </w:r>
-      <w:r>
-        <w:t>– Pay Commodities and gain up to Leader level Coins according to the Market Rate.</w:t>
-      </w:r>
-    </w:p>
-    <w:p>
-      <w:pPr>
-        <w:pStyle w:val="ListParagraph"/>
-      </w:pPr>
-      <w:r>
-        <w:t>Ex. At a Market Rate of 4, paying 8 Commodities will earn you 2 Coins. 8 / 4 = 2.</w:t>
-      </w:r>
-    </w:p>
-    <w:p>
-      <w:pPr>
-        <w:pStyle w:val="ListParagraph"/>
-      </w:pPr>
-      <w:r>
-        <w:rPr>
-          <w:rStyle w:val="SubtleReference"/>
-        </w:rPr>
-        <w:t xml:space="preserve">Monetize </w:t>
-      </w:r>
-      <w:r>
         <w:t>– Discard Cards and gain up to Leader level Coins according to 7 minus the Market Rate.</w:t>
       </w:r>
     </w:p>
@@ -2304,7 +2376,6 @@
         <w:rPr>
           <w:rStyle w:val="SubtleReference"/>
         </w:rPr>
-        <w:lastRenderedPageBreak/>
         <w:t xml:space="preserve">Donate </w:t>
       </w:r>
       <w:r>
@@ -2465,6 +2536,7 @@
         <w:pStyle w:val="ListParagraph"/>
       </w:pPr>
       <w:r>
+        <w:lastRenderedPageBreak/>
         <w:t xml:space="preserve">Roll one die per player, halve each </w:t>
       </w:r>
       <w:r>
@@ -2503,11 +2575,7 @@
         <w:t>Count the number of Troops deployed by each army. The side with the greater number of Troops wins the battle. Discard the defeated army</w:t>
       </w:r>
       <w:r>
-        <w:t xml:space="preserve"> and an equal number </w:t>
-      </w:r>
-      <w:r>
-        <w:lastRenderedPageBreak/>
-        <w:t xml:space="preserve">of Troops from the victorious army. Count </w:t>
+        <w:t xml:space="preserve"> and an equal number of Troops from the victorious army. Count </w:t>
       </w:r>
       <w:r>
         <w:t>a battle with equal army sizes as a Persian victory and discard both sides completely.</w:t>
@@ -2679,6 +2747,7 @@
         <w:pStyle w:val="ListParagraph"/>
       </w:pPr>
       <w:r>
+        <w:lastRenderedPageBreak/>
         <w:t>All Scheme pouches are gathered from the players and shuffled thouroughly.</w:t>
       </w:r>
     </w:p>
@@ -2709,7 +2778,6 @@
         <w:rPr>
           <w:rStyle w:val="SubtleReference"/>
         </w:rPr>
-        <w:lastRenderedPageBreak/>
         <w:t>Guard Roll</w:t>
       </w:r>
       <w:r>
@@ -2934,6 +3002,7 @@
         <w:pStyle w:val="ListParagraph"/>
       </w:pPr>
       <w:r>
+        <w:lastRenderedPageBreak/>
         <w:t>Adjust the Market Rate by rolling a non-player die then performing the corresponding action</w:t>
       </w:r>
       <w:r>
@@ -2973,7 +3042,6 @@
         </w:numPr>
       </w:pPr>
       <w:r>
-        <w:lastRenderedPageBreak/>
         <w:t>If the result is lower than the Ma</w:t>
       </w:r>
       <w:r>
@@ -2999,10 +3067,7 @@
         </w:rPr>
       </w:pPr>
       <w:r>
-        <w:t xml:space="preserve">The scribes now determine whether the empire’s long war has reached its conclusion. If the Greek Reserves are completely empty, the campaign is over and final honors are tallied. </w:t>
-      </w:r>
-      <w:r>
-        <w:t>Otherwise, the next round may begin.</w:t>
+        <w:t>The scribes now determine whether the empire’s long war has reached its conclusion. If the Greek Reserves are completely empty, the campaign is over and final honors are tallied. Otherwise, the next round may begin.</w:t>
       </w:r>
       <w:r>
         <w:rPr>
@@ -3146,7 +3211,11 @@
         <w:t>.</w:t>
       </w:r>
       <w:r>
-        <w:t xml:space="preserve"> After performing the trade, the Market Rate decreases, reflecting the </w:t>
+        <w:t xml:space="preserve"> After </w:t>
+      </w:r>
+      <w:r>
+        <w:lastRenderedPageBreak/>
+        <w:t xml:space="preserve">performing the trade, the Market Rate decreases, reflecting the </w:t>
       </w:r>
       <w:r>
         <w:t>decreased s</w:t>
@@ -3183,33 +3252,130 @@
     </w:p>
     <w:p>
       <w:r>
-        <w:t xml:space="preserve">When players sell Commodities, the Market Rate determines the number of Commodities they must discard to gain a single Coin. This rate may be affected first by the type of action (Court/Undermarket) and then by the player’s Investments. After performing </w:t>
-      </w:r>
+        <w:t>When players sell Commodities, the Market Rate determines the number of Commodities they must discard to gain a single Coin. This rate may be affected first by the type of action (Court/Undermarket) and then by the player’s Investments. After performing the trade, the Market Rate increases, reflecting the increased supply of Commodities in the market and a corresponding decrease in their value.</w:t>
+      </w:r>
+    </w:p>
+    <w:p>
+      <w:pPr>
+        <w:pStyle w:val="Heading4"/>
+      </w:pPr>
+      <w:r>
+        <w:t>7.1.2.3</w:t>
+      </w:r>
+      <w:r>
+        <w:t>.</w:t>
+      </w:r>
+      <w:r>
+        <w:t xml:space="preserve"> Economic Reallocation during the Reports Phase</w:t>
+      </w:r>
+    </w:p>
+    <w:p>
+      <w:r>
+        <w:t xml:space="preserve">At the end of every round, the Market Rate changes randomly to reflect the impact of the players on the general economics of the Empire and vice versa. </w:t>
+      </w:r>
+      <w:r>
+        <w:t>See 6.8 for details on performing this change.</w:t>
+      </w:r>
+    </w:p>
+    <w:p>
+      <w:pPr>
+        <w:pStyle w:val="Heading3"/>
+      </w:pPr>
+      <w:r>
+        <w:t>7.1.3. Other Effects of the Market Rate</w:t>
+      </w:r>
+    </w:p>
+    <w:p>
+      <w:r>
+        <w:t>The Market Rate also plays a role in the following situations:</w:t>
+      </w:r>
+    </w:p>
+    <w:p>
+      <w:pPr>
+        <w:pStyle w:val="Heading4"/>
+      </w:pPr>
+      <w:r>
+        <w:t>7.1.3.1.</w:t>
+      </w:r>
+      <w:r>
+        <w:t xml:space="preserve"> Monetize Action</w:t>
+      </w:r>
+    </w:p>
+    <w:p>
+      <w:r>
+        <w:t xml:space="preserve">When players sell Cards (ideas) from their hand, the Market Rate determines the number of Cards they must discard to gain a single Coin. This rate may be affected first by the type of action (Court/Undermarket) and then by the player’s Investments. </w:t>
+      </w:r>
+      <w:r>
+        <w:t>This trade does not influence the Market Rate since the sale of ideas does not necessitate a change in the availability of physical assets.</w:t>
+      </w:r>
+    </w:p>
+    <w:p>
+      <w:pPr>
+        <w:pStyle w:val="Heading4"/>
+      </w:pPr>
+      <w:r>
+        <w:t>7.1.3.2. Emergency Trades</w:t>
+      </w:r>
+    </w:p>
+    <w:p>
+      <w:r>
+        <w:rPr>
+          <w:rStyle w:val="SubtleReference"/>
+        </w:rPr>
+        <w:t>Emergency Trades</w:t>
+      </w:r>
+      <w:r>
+        <w:t xml:space="preserve"> represent the generosity of the King to ensure his subjects have the ability to respond appropriately to </w:t>
+      </w:r>
+      <w:r>
+        <w:t>unforeseen</w:t>
+      </w:r>
+      <w:r>
+        <w:t xml:space="preserve"> issue</w:t>
+      </w:r>
+      <w:r>
+        <w:t xml:space="preserve">s. </w:t>
+      </w:r>
+      <w:r>
+        <w:t xml:space="preserve">When a player is required to pay Coins for a Tax or </w:t>
+      </w:r>
+      <w:r>
+        <w:t>Trial,</w:t>
+      </w:r>
+      <w:r>
+        <w:t xml:space="preserve"> but the player does not have enough Coins to pay the full cost, the player may </w:t>
+      </w:r>
+      <w:r>
+        <w:t>immediately discard Commodities or Cards to gain Coins and pay their remaining fee. When making an Emergency</w:t>
+      </w:r>
+      <w:r>
+        <w:t xml:space="preserve"> Trade, the player may not apply any effects provided by Investments to alter the Market Rate.</w:t>
+      </w:r>
+      <w:r>
+        <w:t xml:space="preserve"> The player then follows the normal procedure for Selling or </w:t>
+      </w:r>
+      <w:r>
+        <w:t>Monetizing</w:t>
+      </w:r>
+      <w:r>
+        <w:t xml:space="preserve">, depending on which resource they choose to discard. </w:t>
+      </w:r>
+      <w:r>
+        <w:t>The player takes any Coins gained from the Free Bank and immediately uses them to pay the fee.</w:t>
+      </w:r>
+    </w:p>
+    <w:p>
+      <w:r>
+        <w:t xml:space="preserve">If a player cannot trade enough Commodities and Cards to pay their fee, all previous Emergency Trades they performed are reversed, and </w:t>
+      </w:r>
+      <w:r>
+        <w:t>they immediately lose 1 Honor for the shame of having no money.</w:t>
+      </w:r>
+    </w:p>
+    <w:p>
       <w:r>
         <w:lastRenderedPageBreak/>
-        <w:t>the trade, the Market Rate increases, reflecting the increased supply of Commodities in the market and a corresponding decrease in their value.</w:t>
-      </w:r>
-    </w:p>
-    <w:p>
-      <w:pPr>
-        <w:pStyle w:val="Heading4"/>
-      </w:pPr>
-      <w:r>
-        <w:t>7.1.2.3</w:t>
-      </w:r>
-      <w:r>
-        <w:t>.</w:t>
-      </w:r>
-      <w:r>
-        <w:t xml:space="preserve"> Economic Reallocation during the Reports Phase</w:t>
-      </w:r>
-    </w:p>
-    <w:p>
-      <w:r>
-        <w:t xml:space="preserve">At the end of every round, the Market Rate changes randomly to reflect the impact of the players on the general economics of the Empire and vice versa. </w:t>
-      </w:r>
-      <w:r>
-        <w:t>See 6.8 for details on performing this change.</w:t>
+        <w:t>Emergency Trades do not influence the Market Rate since they are unplanned and commonly involve fewer resources.</w:t>
       </w:r>
     </w:p>
     <w:p>
@@ -3217,106 +3383,6 @@
         <w:pStyle w:val="Heading3"/>
       </w:pPr>
       <w:r>
-        <w:t>7.1.3. Other Effects of the Market Rate</w:t>
-      </w:r>
-    </w:p>
-    <w:p>
-      <w:r>
-        <w:t>The Market Rate also plays a role in the following situations:</w:t>
-      </w:r>
-    </w:p>
-    <w:p>
-      <w:pPr>
-        <w:pStyle w:val="Heading4"/>
-      </w:pPr>
-      <w:r>
-        <w:t>7.1.3.1.</w:t>
-      </w:r>
-      <w:r>
-        <w:t xml:space="preserve"> Monetize Action</w:t>
-      </w:r>
-    </w:p>
-    <w:p>
-      <w:r>
-        <w:t xml:space="preserve">When players sell Cards (ideas) from their hand, the Market Rate determines the number of Cards they must discard to gain a single Coin. This rate may be affected first by the type of action (Court/Undermarket) and then by the player’s Investments. </w:t>
-      </w:r>
-      <w:r>
-        <w:t>This trade does not influence the Market Rate since the sale of ideas does not necessitate a change in the availability of physical assets.</w:t>
-      </w:r>
-    </w:p>
-    <w:p>
-      <w:pPr>
-        <w:pStyle w:val="Heading4"/>
-      </w:pPr>
-      <w:r>
-        <w:t>7.1.3.2. Emergency Trades</w:t>
-      </w:r>
-    </w:p>
-    <w:p>
-      <w:r>
-        <w:rPr>
-          <w:rStyle w:val="SubtleReference"/>
-        </w:rPr>
-        <w:t>Emergency Trades</w:t>
-      </w:r>
-      <w:r>
-        <w:t xml:space="preserve"> represent the generosity of the King to ensure his subjects have the ability to respond appropriately to </w:t>
-      </w:r>
-      <w:r>
-        <w:t>unforeseen</w:t>
-      </w:r>
-      <w:r>
-        <w:t xml:space="preserve"> issue</w:t>
-      </w:r>
-      <w:r>
-        <w:t xml:space="preserve">s. </w:t>
-      </w:r>
-      <w:r>
-        <w:t xml:space="preserve">When a player is required to pay Coins for a Tax or </w:t>
-      </w:r>
-      <w:r>
-        <w:t>Trial,</w:t>
-      </w:r>
-      <w:r>
-        <w:t xml:space="preserve"> but the player does not have enough Coins to pay the full cost, the player may </w:t>
-      </w:r>
-      <w:r>
-        <w:t>immediately discard Commodities or Cards to gain Coins and pay their remaining fee. When making an Emergency</w:t>
-      </w:r>
-      <w:r>
-        <w:t xml:space="preserve"> Trade, the player may not apply any effects provided by Investments to alter the Market Rate.</w:t>
-      </w:r>
-      <w:r>
-        <w:t xml:space="preserve"> The player then follows the normal procedure for Selling or </w:t>
-      </w:r>
-      <w:r>
-        <w:t>Monetizing</w:t>
-      </w:r>
-      <w:r>
-        <w:t xml:space="preserve">, depending on which resource they choose to discard. </w:t>
-      </w:r>
-      <w:r>
-        <w:t>The player takes any Coins gained from the Free Bank and immediately uses them to pay the fee.</w:t>
-      </w:r>
-    </w:p>
-    <w:p>
-      <w:r>
-        <w:t xml:space="preserve">If a player cannot trade enough Commodities and Cards to pay their fee, all previous Emergency Trades they performed are reversed, and </w:t>
-      </w:r>
-      <w:r>
-        <w:t>they immediately lose 1 Honor for the shame of having no money.</w:t>
-      </w:r>
-    </w:p>
-    <w:p>
-      <w:r>
-        <w:t>Emergency Trades do not influence the Market Rate since they are unplanned and commonly involve fewer resources.</w:t>
-      </w:r>
-    </w:p>
-    <w:p>
-      <w:pPr>
-        <w:pStyle w:val="Heading3"/>
-      </w:pPr>
-      <w:r>
         <w:t>7.1.3. Resource Limitations</w:t>
       </w:r>
     </w:p>
@@ -3336,7 +3402,6 @@
         <w:pStyle w:val="Heading2"/>
       </w:pPr>
       <w:r>
-        <w:lastRenderedPageBreak/>
         <w:t xml:space="preserve">7.2. </w:t>
       </w:r>
       <w:r>
@@ -3531,6 +3596,7 @@
         </w:numPr>
       </w:pPr>
       <w:r>
+        <w:lastRenderedPageBreak/>
         <w:t>“My advisors are loyal</w:t>
       </w:r>
       <w:r>
@@ -3565,7 +3631,6 @@
         </w:rPr>
       </w:pPr>
       <w:r>
-        <w:lastRenderedPageBreak/>
         <w:t>7.2</w:t>
       </w:r>
       <w:r>
@@ -3753,6 +3818,7 @@
         <w:t xml:space="preserve">winner </w:t>
       </w:r>
       <w:r>
+        <w:lastRenderedPageBreak/>
         <w:t xml:space="preserve">earns 1 Honor, a mark of prestige that echoes through the </w:t>
       </w:r>
       <w:r>
@@ -3799,7 +3865,6 @@
         <w:pStyle w:val="Quote"/>
       </w:pPr>
       <w:r>
-        <w:lastRenderedPageBreak/>
         <w:t>Historical Note: Many satraps discovered that the surest way to win a Trial was to accuse their rival of something so absurd that the King found it believable.</w:t>
       </w:r>
     </w:p>
@@ -4117,7 +4182,6 @@
         </w:numPr>
       </w:pPr>
       <w:r>
-        <w:lastRenderedPageBreak/>
         <w:t xml:space="preserve">A </w:t>
       </w:r>
       <w:r>
@@ -4470,6 +4534,7 @@
         </w:numPr>
       </w:pPr>
       <w:r>
+        <w:lastRenderedPageBreak/>
         <w:t xml:space="preserve">Every time </w:t>
       </w:r>
       <w:r>
@@ -4516,7 +4581,6 @@
         </w:rPr>
       </w:pPr>
       <w:r>
-        <w:lastRenderedPageBreak/>
         <w:t>7</w:t>
       </w:r>
       <w:r>
@@ -4755,6 +4819,7 @@
         </w:numPr>
       </w:pPr>
       <w:r>
+        <w:lastRenderedPageBreak/>
         <w:t xml:space="preserve">Alliances are bilateral and formed only through </w:t>
       </w:r>
       <w:r>
@@ -4774,7 +4839,6 @@
         <w:pStyle w:val="Heading1"/>
       </w:pPr>
       <w:r>
-        <w:lastRenderedPageBreak/>
         <w:t xml:space="preserve">8. </w:t>
       </w:r>
       <w:r>

</xml_diff>

<commit_message>
Added game variants to the rulebook
</commit_message>
<xml_diff>
--- a/Rulebook.docx
+++ b/Rulebook.docx
@@ -5011,11 +5011,325 @@
       </w:r>
     </w:p>
     <w:p>
-      <w:r>
-        <w:t>FAQs, strategy tips, and variants</w:t>
-      </w:r>
-    </w:p>
-    <w:p/>
+      <w:pPr>
+        <w:pStyle w:val="Heading2"/>
+      </w:pPr>
+      <w:r>
+        <w:t>9.1. Tips for your first game</w:t>
+      </w:r>
+    </w:p>
+    <w:p>
+      <w:pPr>
+        <w:pStyle w:val="Heading2"/>
+      </w:pPr>
+      <w:r>
+        <w:t>9.2. Variants</w:t>
+      </w:r>
+    </w:p>
+    <w:p>
+      <w:pPr>
+        <w:pStyle w:val="Heading3"/>
+      </w:pPr>
+      <w:r>
+        <w:t>9.2.</w:t>
+      </w:r>
+      <w:r>
+        <w:t>1. Shorter/Longer Games</w:t>
+      </w:r>
+    </w:p>
+    <w:p>
+      <w:r>
+        <w:t>The length of the game can easily be manipulated</w:t>
+      </w:r>
+      <w:r>
+        <w:t xml:space="preserve"> by changing the number of Greek Troops </w:t>
+      </w:r>
+      <w:r>
+        <w:t xml:space="preserve">per player </w:t>
+      </w:r>
+      <w:r>
+        <w:t xml:space="preserve">to </w:t>
+      </w:r>
+      <w:r>
+        <w:t>add to the Reserves at the beginning of the game. Standard games start with 12 Greeks per player</w:t>
+      </w:r>
+      <w:r>
+        <w:t>, causing the game to last roughly 6 rounds.</w:t>
+      </w:r>
+      <w:r>
+        <w:t xml:space="preserve"> If you want to play a shorter game, </w:t>
+      </w:r>
+      <w:r>
+        <w:t>lower the starting number of</w:t>
+      </w:r>
+      <w:r>
+        <w:t xml:space="preserve"> Greeks</w:t>
+      </w:r>
+      <w:r>
+        <w:t xml:space="preserve">. Use 10 Greeks per player for 5 rounds, 8 Greeks for 4 rounds, 6 Greeks for 3 rounds, </w:t>
+      </w:r>
+      <w:r>
+        <w:t>etc.</w:t>
+      </w:r>
+      <w:r>
+        <w:t xml:space="preserve"> </w:t>
+      </w:r>
+      <w:r>
+        <w:t xml:space="preserve">If you want to play a </w:t>
+      </w:r>
+      <w:r>
+        <w:t>longer</w:t>
+      </w:r>
+      <w:r>
+        <w:t xml:space="preserve"> game, </w:t>
+      </w:r>
+      <w:r>
+        <w:t>raise</w:t>
+      </w:r>
+      <w:r>
+        <w:t xml:space="preserve"> the starting number of Greeks. Use 1</w:t>
+      </w:r>
+      <w:r>
+        <w:t>4</w:t>
+      </w:r>
+      <w:r>
+        <w:t xml:space="preserve"> Greeks per player for </w:t>
+      </w:r>
+      <w:r>
+        <w:t>7</w:t>
+      </w:r>
+      <w:r>
+        <w:t xml:space="preserve"> rounds, </w:t>
+      </w:r>
+      <w:r>
+        <w:t>16</w:t>
+      </w:r>
+      <w:r>
+        <w:t xml:space="preserve"> Greeks for </w:t>
+      </w:r>
+      <w:r>
+        <w:t>8</w:t>
+      </w:r>
+      <w:r>
+        <w:t xml:space="preserve"> </w:t>
+      </w:r>
+      <w:r>
+        <w:lastRenderedPageBreak/>
+        <w:t xml:space="preserve">rounds, </w:t>
+      </w:r>
+      <w:r>
+        <w:t>18</w:t>
+      </w:r>
+      <w:r>
+        <w:t xml:space="preserve"> Greeks for </w:t>
+      </w:r>
+      <w:r>
+        <w:t>9</w:t>
+      </w:r>
+      <w:r>
+        <w:t xml:space="preserve"> rounds, </w:t>
+      </w:r>
+      <w:r>
+        <w:t>etc.</w:t>
+      </w:r>
+      <w:r>
+        <w:t xml:space="preserve"> Note that the longer the game, the more Edicts your game will have; the shorter the game, the fewer the Edicts.</w:t>
+      </w:r>
+    </w:p>
+    <w:p>
+      <w:pPr>
+        <w:pStyle w:val="Heading3"/>
+      </w:pPr>
+      <w:r>
+        <w:t>9.2.</w:t>
+      </w:r>
+      <w:r>
+        <w:t>2</w:t>
+      </w:r>
+      <w:r>
+        <w:t>. Alexander the Great</w:t>
+      </w:r>
+    </w:p>
+    <w:p>
+      <w:r>
+        <w:t xml:space="preserve">For player groups </w:t>
+      </w:r>
+      <w:r>
+        <w:t xml:space="preserve">looking for </w:t>
+      </w:r>
+      <w:r>
+        <w:t xml:space="preserve">a more cooperative challenge or </w:t>
+      </w:r>
+      <w:r>
+        <w:t xml:space="preserve">more pressure </w:t>
+      </w:r>
+      <w:r>
+        <w:t>from the battlefront, add a step to the Reports Phase where the Greek Reserves receive reinforcements.</w:t>
+      </w:r>
+      <w:r>
+        <w:t xml:space="preserve"> After checking if the Greeks have been defeated, roll </w:t>
+      </w:r>
+      <w:r>
+        <w:t xml:space="preserve">a single die and add the </w:t>
+      </w:r>
+      <w:r>
+        <w:t>corresponding number of Greeks to the Reserves.</w:t>
+      </w:r>
+      <w:r>
+        <w:t xml:space="preserve"> If the Greeks are completely defeated, do not reinforce them and proceed to the end of the game.</w:t>
+      </w:r>
+    </w:p>
+    <w:p>
+      <w:r>
+        <w:t xml:space="preserve">This will cause the game to have a </w:t>
+      </w:r>
+      <w:r>
+        <w:t xml:space="preserve">longer, </w:t>
+      </w:r>
+      <w:r>
+        <w:t>more variable playtime</w:t>
+      </w:r>
+      <w:r>
+        <w:t>, so consider reducing the starting number of Greeks to compensate</w:t>
+      </w:r>
+      <w:r>
+        <w:t>, especially if your group has a time constraint</w:t>
+      </w:r>
+      <w:r>
+        <w:t>.</w:t>
+      </w:r>
+      <w:r>
+        <w:t xml:space="preserve"> Note that players will have to work together much more closely to keep the game from </w:t>
+      </w:r>
+      <w:r>
+        <w:t>dragging on or ballooning out of control.</w:t>
+      </w:r>
+      <w:r>
+        <w:t xml:space="preserve"> Expect eliminations.</w:t>
+      </w:r>
+    </w:p>
+    <w:p>
+      <w:pPr>
+        <w:pStyle w:val="Heading3"/>
+      </w:pPr>
+      <w:r>
+        <w:t xml:space="preserve">9.2.3. </w:t>
+      </w:r>
+      <w:r>
+        <w:t xml:space="preserve">War of </w:t>
+      </w:r>
+      <w:r>
+        <w:t>Two Nations</w:t>
+      </w:r>
+    </w:p>
+    <w:p>
+      <w:r>
+        <w:t xml:space="preserve">For players looking for a more </w:t>
+      </w:r>
+      <w:r>
+        <w:t xml:space="preserve">political, large-scale event, </w:t>
+      </w:r>
+      <w:r>
+        <w:t xml:space="preserve">run two </w:t>
+      </w:r>
+      <w:r>
+        <w:t xml:space="preserve">copies of this </w:t>
+      </w:r>
+      <w:r>
+        <w:t>game simultaneously</w:t>
+      </w:r>
+      <w:r>
+        <w:t xml:space="preserve">, with one group playing as the Persian Empire, and the other group playing as the Greek Empire. </w:t>
+      </w:r>
+      <w:r>
+        <w:t>T</w:t>
+      </w:r>
+      <w:r>
+        <w:t xml:space="preserve">he two </w:t>
+      </w:r>
+      <w:r>
+        <w:t>empires</w:t>
+      </w:r>
+      <w:r>
+        <w:t xml:space="preserve"> will be committing troops </w:t>
+      </w:r>
+      <w:r>
+        <w:t xml:space="preserve">to directly fight each other. Play until one </w:t>
+      </w:r>
+      <w:r>
+        <w:t xml:space="preserve">empire </w:t>
+      </w:r>
+      <w:r>
+        <w:t xml:space="preserve">surrenders or is completely eliminated. </w:t>
+      </w:r>
+      <w:r>
+        <w:t>Keep score as usual to determine who played the best game.</w:t>
+      </w:r>
+    </w:p>
+    <w:p>
+      <w:r>
+        <w:t>To set up for this variant, put all Greek Troops back in the box</w:t>
+      </w:r>
+      <w:r>
+        <w:t xml:space="preserve"> for both</w:t>
+      </w:r>
+      <w:r>
+        <w:t xml:space="preserve"> empires</w:t>
+      </w:r>
+      <w:r>
+        <w:t xml:space="preserve">. Instead of rolling dice in Step 6.2 to determine the </w:t>
+      </w:r>
+      <w:r>
+        <w:t xml:space="preserve">size of the opposing army, armies from both </w:t>
+      </w:r>
+      <w:r>
+        <w:t xml:space="preserve">empires </w:t>
+      </w:r>
+      <w:r>
+        <w:t>fight against each other</w:t>
+      </w:r>
+      <w:r>
+        <w:t xml:space="preserve">. As in the normal version, the larger army claims victory and remaining </w:t>
+      </w:r>
+      <w:r>
+        <w:t xml:space="preserve">Troops perform raids against the enemy players. In case of a tie, both </w:t>
+      </w:r>
+      <w:r>
+        <w:t xml:space="preserve">empires </w:t>
+      </w:r>
+      <w:r>
+        <w:t>should consider the battle a victory.</w:t>
+      </w:r>
+      <w:r>
+        <w:t xml:space="preserve"> </w:t>
+      </w:r>
+      <w:r>
+        <w:t>Players between empires may perform liquid trades at any time, but alliances (and non-liquid trades) may only be performed within an empire.</w:t>
+      </w:r>
+    </w:p>
+    <w:p>
+      <w:r>
+        <w:t>This variant will last a very long time and will require a large amount of cooperation within</w:t>
+      </w:r>
+      <w:r>
+        <w:t xml:space="preserve"> an empire</w:t>
+      </w:r>
+      <w:r>
+        <w:t xml:space="preserve">. </w:t>
+      </w:r>
+      <w:r>
+        <w:t xml:space="preserve">Individual victories are important but only if your empire survives the war. </w:t>
+      </w:r>
+      <w:r>
+        <w:t>This will be a high-interaction, aggressive</w:t>
+      </w:r>
+      <w:r>
+        <w:t xml:space="preserve"> variant</w:t>
+      </w:r>
+      <w:r>
+        <w:t>.</w:t>
+      </w:r>
+    </w:p>
     <w:sectPr>
       <w:pgSz w:w="12240" w:h="15840"/>
       <w:pgMar w:top="1440" w:right="1440" w:bottom="1440" w:left="1440" w:header="720" w:footer="720" w:gutter="0"/>
@@ -7230,7 +7544,6 @@
     <w:next w:val="Normal"/>
     <w:link w:val="Heading2Char"/>
     <w:uiPriority w:val="9"/>
-    <w:semiHidden/>
     <w:unhideWhenUsed/>
     <w:qFormat/>
     <w:rsid w:val="6E2314E4"/>
@@ -7254,7 +7567,6 @@
     <w:next w:val="Normal"/>
     <w:link w:val="Heading3Char"/>
     <w:uiPriority w:val="9"/>
-    <w:semiHidden/>
     <w:unhideWhenUsed/>
     <w:qFormat/>
     <w:rsid w:val="6E2314E4"/>
@@ -7448,7 +7760,6 @@
     <w:basedOn w:val="DefaultParagraphFont"/>
     <w:link w:val="Heading2"/>
     <w:uiPriority w:val="9"/>
-    <w:semiHidden/>
     <w:rsid w:val="6E2314E4"/>
     <w:rPr>
       <w:rFonts w:asciiTheme="majorHAnsi" w:eastAsiaTheme="majorEastAsia" w:hAnsiTheme="majorHAnsi" w:cstheme="majorBidi"/>
@@ -7462,7 +7773,6 @@
     <w:basedOn w:val="DefaultParagraphFont"/>
     <w:link w:val="Heading3"/>
     <w:uiPriority w:val="9"/>
-    <w:semiHidden/>
     <w:rsid w:val="00182AD0"/>
     <w:rPr>
       <w:rFonts w:eastAsiaTheme="majorEastAsia" w:cstheme="majorBidi"/>

</xml_diff>